<commit_message>
Deploying to gh-pages from @ Morrison-Lab/mds@b95574de50a8324f5591586236b0b0c9765f5183 🚀
</commit_message>
<xml_diff>
--- a/measures.docx
+++ b/measures.docx
@@ -15,7 +15,7 @@
         <w:pStyle w:val="Date"/>
       </w:pPr>
       <w:r>
-        <w:t xml:space="preserve">Last modified: 2026-10-05 04:02:15 (PDT)</w:t>
+        <w:t xml:space="preserve">Last modified: 2026-10-05 13:41:05 (PDT)</w:t>
       </w:r>
     </w:p>
     <w:p>
@@ -111,7 +111,7 @@
         <w:t xml:space="preserve">).</w:t>
       </w:r>
     </w:p>
-    <w:bookmarkStart w:id="20" w:name="sigma-algebras"/>
+    <w:bookmarkStart w:id="21" w:name="sigma-algebras"/>
     <w:p>
       <w:pPr>
         <w:pStyle w:val="Heading2"/>
@@ -1115,7 +1115,338 @@
       </w:r>
     </w:p>
     <w:bookmarkEnd w:id="16"/>
-    <w:bookmarkStart w:id="18" w:name="thm-sigma-algebra-closure"/>
+    <w:bookmarkStart w:id="17" w:name="exm-not-sigma-algebra"/>
+    <w:p>
+      <w:pPr>
+        <w:pStyle w:val="BodyText"/>
+      </w:pPr>
+      <w:r>
+        <w:rPr>
+          <w:b/>
+          <w:bCs/>
+        </w:rPr>
+        <w:t xml:space="preserve">Example 2 (A collection that is not a</w:t>
+      </w:r>
+      <w:r>
+        <w:rPr>
+          <w:b/>
+          <w:bCs/>
+        </w:rPr>
+        <w:t xml:space="preserve"> </w:t>
+      </w:r>
+      <m:oMath>
+        <m:r>
+          <m:t>σ</m:t>
+        </m:r>
+      </m:oMath>
+      <w:r>
+        <w:rPr>
+          <w:b/>
+          <w:bCs/>
+        </w:rPr>
+        <w:t xml:space="preserve">-algebra)</w:t>
+      </w:r>
+      <w:r>
+        <w:t xml:space="preserve"> </w:t>
+      </w:r>
+      <w:r>
+        <w:t xml:space="preserve">The collection</w:t>
+      </w:r>
+      <w:r>
+        <w:t xml:space="preserve"> </w:t>
+      </w:r>
+      <m:oMath>
+        <m:r>
+          <m:t>​</m:t>
+        </m:r>
+        <m:d>
+          <m:dPr>
+            <m:begChr m:val="{"/>
+            <m:sepChr m:val=""/>
+            <m:endChr m:val="}"/>
+            <m:grow/>
+          </m:dPr>
+          <m:e>
+            <m:r>
+              <m:rPr>
+                <m:sty m:val="p"/>
+              </m:rPr>
+              <m:t>∅</m:t>
+            </m:r>
+            <m:r>
+              <m:rPr>
+                <m:sty m:val="p"/>
+              </m:rPr>
+              <m:t>,</m:t>
+            </m:r>
+            <m:r>
+              <m:t>​</m:t>
+            </m:r>
+            <m:d>
+              <m:dPr>
+                <m:begChr m:val="{"/>
+                <m:sepChr m:val=""/>
+                <m:endChr m:val="}"/>
+                <m:grow/>
+              </m:dPr>
+              <m:e>
+                <m:r>
+                  <m:t>1</m:t>
+                </m:r>
+              </m:e>
+            </m:d>
+            <m:r>
+              <m:t>​</m:t>
+            </m:r>
+            <m:r>
+              <m:rPr>
+                <m:sty m:val="p"/>
+              </m:rPr>
+              <m:t>,</m:t>
+            </m:r>
+            <m:r>
+              <m:t>D</m:t>
+            </m:r>
+          </m:e>
+        </m:d>
+        <m:r>
+          <m:t>​</m:t>
+        </m:r>
+      </m:oMath>
+      <w:r>
+        <w:t xml:space="preserve"> </w:t>
+      </w:r>
+      <w:r>
+        <w:t xml:space="preserve">is not a</w:t>
+      </w:r>
+      <w:r>
+        <w:t xml:space="preserve"> </w:t>
+      </w:r>
+      <m:oMath>
+        <m:r>
+          <m:t>σ</m:t>
+        </m:r>
+      </m:oMath>
+      <w:r>
+        <w:t xml:space="preserve">-algebra on</w:t>
+      </w:r>
+      <w:r>
+        <w:t xml:space="preserve"> </w:t>
+      </w:r>
+      <m:oMath>
+        <m:r>
+          <m:t>D</m:t>
+        </m:r>
+        <m:r>
+          <m:rPr>
+            <m:sty m:val="p"/>
+          </m:rPr>
+          <m:t>=</m:t>
+        </m:r>
+        <m:r>
+          <m:t>​</m:t>
+        </m:r>
+        <m:d>
+          <m:dPr>
+            <m:begChr m:val="{"/>
+            <m:sepChr m:val=""/>
+            <m:endChr m:val="}"/>
+            <m:grow/>
+          </m:dPr>
+          <m:e>
+            <m:r>
+              <m:t>1</m:t>
+            </m:r>
+            <m:r>
+              <m:rPr>
+                <m:sty m:val="p"/>
+              </m:rPr>
+              <m:t>,</m:t>
+            </m:r>
+            <m:r>
+              <m:t>2</m:t>
+            </m:r>
+            <m:r>
+              <m:rPr>
+                <m:sty m:val="p"/>
+              </m:rPr>
+              <m:t>,</m:t>
+            </m:r>
+            <m:r>
+              <m:t>3</m:t>
+            </m:r>
+            <m:r>
+              <m:rPr>
+                <m:sty m:val="p"/>
+              </m:rPr>
+              <m:t>,</m:t>
+            </m:r>
+            <m:r>
+              <m:t>4</m:t>
+            </m:r>
+            <m:r>
+              <m:rPr>
+                <m:sty m:val="p"/>
+              </m:rPr>
+              <m:t>,</m:t>
+            </m:r>
+            <m:r>
+              <m:t>5</m:t>
+            </m:r>
+            <m:r>
+              <m:rPr>
+                <m:sty m:val="p"/>
+              </m:rPr>
+              <m:t>,</m:t>
+            </m:r>
+            <m:r>
+              <m:t>6</m:t>
+            </m:r>
+          </m:e>
+        </m:d>
+        <m:r>
+          <m:t>​</m:t>
+        </m:r>
+      </m:oMath>
+      <w:r>
+        <w:t xml:space="preserve">:</w:t>
+      </w:r>
+      <w:r>
+        <w:t xml:space="preserve"> </w:t>
+      </w:r>
+      <w:r>
+        <w:t xml:space="preserve">it contains</w:t>
+      </w:r>
+      <w:r>
+        <w:t xml:space="preserve"> </w:t>
+      </w:r>
+      <m:oMath>
+        <m:r>
+          <m:t>​</m:t>
+        </m:r>
+        <m:d>
+          <m:dPr>
+            <m:begChr m:val="{"/>
+            <m:sepChr m:val=""/>
+            <m:endChr m:val="}"/>
+            <m:grow/>
+          </m:dPr>
+          <m:e>
+            <m:r>
+              <m:t>1</m:t>
+            </m:r>
+          </m:e>
+        </m:d>
+        <m:r>
+          <m:t>​</m:t>
+        </m:r>
+      </m:oMath>
+      <w:r>
+        <w:t xml:space="preserve"> </w:t>
+      </w:r>
+      <w:r>
+        <w:t xml:space="preserve">but not its complement</w:t>
+      </w:r>
+      <w:r>
+        <w:t xml:space="preserve"> </w:t>
+      </w:r>
+      <m:oMath>
+        <m:r>
+          <m:t>D</m:t>
+        </m:r>
+        <m:r>
+          <m:rPr>
+            <m:sty m:val="p"/>
+          </m:rPr>
+          <m:t>\</m:t>
+        </m:r>
+        <m:r>
+          <m:t>​</m:t>
+        </m:r>
+        <m:d>
+          <m:dPr>
+            <m:begChr m:val="{"/>
+            <m:sepChr m:val=""/>
+            <m:endChr m:val="}"/>
+            <m:grow/>
+          </m:dPr>
+          <m:e>
+            <m:r>
+              <m:t>1</m:t>
+            </m:r>
+          </m:e>
+        </m:d>
+        <m:r>
+          <m:t>​</m:t>
+        </m:r>
+        <m:r>
+          <m:rPr>
+            <m:sty m:val="p"/>
+          </m:rPr>
+          <m:t>=</m:t>
+        </m:r>
+        <m:r>
+          <m:t>​</m:t>
+        </m:r>
+        <m:d>
+          <m:dPr>
+            <m:begChr m:val="{"/>
+            <m:sepChr m:val=""/>
+            <m:endChr m:val="}"/>
+            <m:grow/>
+          </m:dPr>
+          <m:e>
+            <m:r>
+              <m:t>2</m:t>
+            </m:r>
+            <m:r>
+              <m:rPr>
+                <m:sty m:val="p"/>
+              </m:rPr>
+              <m:t>,</m:t>
+            </m:r>
+            <m:r>
+              <m:t>3</m:t>
+            </m:r>
+            <m:r>
+              <m:rPr>
+                <m:sty m:val="p"/>
+              </m:rPr>
+              <m:t>,</m:t>
+            </m:r>
+            <m:r>
+              <m:t>4</m:t>
+            </m:r>
+            <m:r>
+              <m:rPr>
+                <m:sty m:val="p"/>
+              </m:rPr>
+              <m:t>,</m:t>
+            </m:r>
+            <m:r>
+              <m:t>5</m:t>
+            </m:r>
+            <m:r>
+              <m:rPr>
+                <m:sty m:val="p"/>
+              </m:rPr>
+              <m:t>,</m:t>
+            </m:r>
+            <m:r>
+              <m:t>6</m:t>
+            </m:r>
+          </m:e>
+        </m:d>
+        <m:r>
+          <m:t>​</m:t>
+        </m:r>
+      </m:oMath>
+      <w:r>
+        <w:t xml:space="preserve">.</w:t>
+      </w:r>
+    </w:p>
+    <w:bookmarkEnd w:id="17"/>
+    <w:bookmarkStart w:id="19" w:name="thm-sigma-algebra-closure"/>
     <w:p>
       <w:pPr>
         <w:pStyle w:val="BodyText"/>
@@ -1242,7 +1573,7 @@
       <w:r>
         <w:t xml:space="preserve"> </w:t>
       </w:r>
-      <w:hyperlink r:id="rId17">
+      <w:hyperlink r:id="rId18">
         <w:r>
           <w:rPr>
             <w:rStyle w:val="Hyperlink"/>
@@ -1533,7 +1864,7 @@
         <w:t xml:space="preserve">.</w:t>
       </w:r>
     </w:p>
-    <w:bookmarkEnd w:id="18"/>
+    <w:bookmarkEnd w:id="19"/>
     <w:p>
       <w:pPr>
         <w:pStyle w:val="FirstParagraph"/>
@@ -2572,7 +2903,7 @@
         <w:t xml:space="preserve">by the complement rule again.</w:t>
       </w:r>
     </w:p>
-    <w:bookmarkStart w:id="19" w:name="thm-power-set-sigma-algebra"/>
+    <w:bookmarkStart w:id="20" w:name="thm-power-set-sigma-algebra"/>
     <w:p>
       <w:pPr>
         <w:pStyle w:val="BodyText"/>
@@ -2674,7 +3005,7 @@
         <w:t xml:space="preserve">.</w:t>
       </w:r>
     </w:p>
-    <w:bookmarkEnd w:id="19"/>
+    <w:bookmarkEnd w:id="20"/>
     <w:p>
       <w:pPr>
         <w:pStyle w:val="BodyText"/>
@@ -3012,8 +3343,8 @@
         <w:t xml:space="preserve">.</w:t>
       </w:r>
     </w:p>
-    <w:bookmarkEnd w:id="20"/>
-    <w:bookmarkStart w:id="24" w:name="pairwise-disjoint-sets"/>
+    <w:bookmarkEnd w:id="21"/>
+    <w:bookmarkStart w:id="25" w:name="pairwise-disjoint-sets"/>
     <w:p>
       <w:pPr>
         <w:pStyle w:val="Heading2"/>
@@ -3022,7 +3353,7 @@
         <w:t xml:space="preserve">2 Pairwise disjoint sets</w:t>
       </w:r>
     </w:p>
-    <w:bookmarkStart w:id="21" w:name="def-pairwise-disjoint"/>
+    <w:bookmarkStart w:id="22" w:name="def-pairwise-disjoint"/>
     <w:p>
       <w:pPr>
         <w:pStyle w:val="FirstParagraph"/>
@@ -3221,8 +3552,8 @@
         </m:oMath>
       </m:oMathPara>
     </w:p>
-    <w:bookmarkEnd w:id="21"/>
-    <w:bookmarkStart w:id="22" w:name="rem-mutually-exclusive"/>
+    <w:bookmarkEnd w:id="22"/>
+    <w:bookmarkStart w:id="23" w:name="rem-mutually-exclusive"/>
     <w:p>
       <w:pPr>
         <w:pStyle w:val="FirstParagraph"/>
@@ -3392,8 +3723,8 @@
         <w:t xml:space="preserve">no roll is both even and odd.</w:t>
       </w:r>
     </w:p>
-    <w:bookmarkEnd w:id="22"/>
-    <w:bookmarkStart w:id="23" w:name="exm-pairwise-disjoint"/>
+    <w:bookmarkEnd w:id="23"/>
+    <w:bookmarkStart w:id="24" w:name="exm-pairwise-disjoint"/>
     <w:p>
       <w:pPr>
         <w:pStyle w:val="BodyText"/>
@@ -3403,7 +3734,7 @@
           <w:b/>
           <w:bCs/>
         </w:rPr>
-        <w:t xml:space="preserve">Example 2 (Low and high die rolls)</w:t>
+        <w:t xml:space="preserve">Example 3 (Low and high die rolls)</w:t>
       </w:r>
       <w:r>
         <w:t xml:space="preserve"> </w:t>
@@ -3710,9 +4041,9 @@
         <w:t xml:space="preserve">is in both.</w:t>
       </w:r>
     </w:p>
-    <w:bookmarkEnd w:id="23"/>
     <w:bookmarkEnd w:id="24"/>
-    <w:bookmarkStart w:id="42" w:name="additivity"/>
+    <w:bookmarkEnd w:id="25"/>
+    <w:bookmarkStart w:id="44" w:name="additivity"/>
     <w:p>
       <w:pPr>
         <w:pStyle w:val="Heading2"/>
@@ -3721,7 +4052,7 @@
         <w:t xml:space="preserve">3 Additivity</w:t>
       </w:r>
     </w:p>
-    <w:bookmarkStart w:id="27" w:name="def-finite-additivity"/>
+    <w:bookmarkStart w:id="28" w:name="def-finite-additivity"/>
     <w:p>
       <w:pPr>
         <w:pStyle w:val="FirstParagraph"/>
@@ -3799,7 +4130,7 @@
       <w:r>
         <w:t xml:space="preserve"> </w:t>
       </w:r>
-      <w:hyperlink r:id="rId25">
+      <w:hyperlink r:id="rId26">
         <w:r>
           <w:rPr>
             <w:rStyle w:val="Hyperlink"/>
@@ -3873,7 +4204,7 @@
       <w:r>
         <w:t xml:space="preserve"> </w:t>
       </w:r>
-      <w:hyperlink r:id="rId26">
+      <w:hyperlink r:id="rId27">
         <w:r>
           <w:rPr>
             <w:rStyle w:val="Hyperlink"/>
@@ -4129,8 +4460,8 @@
         </m:oMath>
       </m:oMathPara>
     </w:p>
-    <w:bookmarkEnd w:id="27"/>
-    <w:bookmarkStart w:id="28" w:name="exm-finite-additivity"/>
+    <w:bookmarkEnd w:id="28"/>
+    <w:bookmarkStart w:id="29" w:name="exm-finite-additivity"/>
     <w:p>
       <w:pPr>
         <w:pStyle w:val="FirstParagraph"/>
@@ -4140,7 +4471,7 @@
           <w:b/>
           <w:bCs/>
         </w:rPr>
-        <w:t xml:space="preserve">Example 3 (Counting elements is finitely additive)</w:t>
+        <w:t xml:space="preserve">Example 4 (Counting elements is finitely additive)</w:t>
       </w:r>
       <w:r>
         <w:t xml:space="preserve"> </w:t>
@@ -4475,7 +4806,7 @@
           <w:rPr>
             <w:rStyle w:val="Hyperlink"/>
           </w:rPr>
-          <w:t xml:space="preserve">Example 2</w:t>
+          <w:t xml:space="preserve">Example 3</w:t>
         </w:r>
       </w:hyperlink>
       <w:r>
@@ -4871,8 +5202,554 @@
         <w:t xml:space="preserve">is finitely additive.</w:t>
       </w:r>
     </w:p>
-    <w:bookmarkEnd w:id="28"/>
-    <w:bookmarkStart w:id="29" w:name="def-countable-additivity"/>
+    <w:bookmarkEnd w:id="29"/>
+    <w:bookmarkStart w:id="30" w:name="exm-not-finitely-additive"/>
+    <w:p>
+      <w:pPr>
+        <w:pStyle w:val="BodyText"/>
+      </w:pPr>
+      <w:r>
+        <w:rPr>
+          <w:b/>
+          <w:bCs/>
+        </w:rPr>
+        <w:t xml:space="preserve">Example 5 (Squaring the count is not finitely additive)</w:t>
+      </w:r>
+      <w:r>
+        <w:t xml:space="preserve"> </w:t>
+      </w:r>
+      <w:r>
+        <w:t xml:space="preserve">On the same</w:t>
+      </w:r>
+      <w:r>
+        <w:t xml:space="preserve"> </w:t>
+      </w:r>
+      <m:oMath>
+        <m:r>
+          <m:t>σ</m:t>
+        </m:r>
+      </m:oMath>
+      <w:r>
+        <w:t xml:space="preserve">-algebra, let</w:t>
+      </w:r>
+      <w:r>
+        <w:t xml:space="preserve"> </w:t>
+      </w:r>
+      <m:oMath>
+        <m:r>
+          <m:t>ν</m:t>
+        </m:r>
+        <m:r>
+          <m:rPr>
+            <m:sty m:val="p"/>
+          </m:rPr>
+          <m:t>(</m:t>
+        </m:r>
+        <m:r>
+          <m:t>A</m:t>
+        </m:r>
+        <m:r>
+          <m:rPr>
+            <m:sty m:val="p"/>
+          </m:rPr>
+          <m:t>)</m:t>
+        </m:r>
+        <m:limUpp>
+          <m:e>
+            <m:r>
+              <m:rPr>
+                <m:sty m:val="p"/>
+              </m:rPr>
+              <m:t>=</m:t>
+            </m:r>
+          </m:e>
+          <m:lim>
+            <m:r>
+              <m:rPr>
+                <m:nor/>
+                <m:sty m:val="p"/>
+              </m:rPr>
+              <m:t>def</m:t>
+            </m:r>
+          </m:lim>
+        </m:limUpp>
+        <m:r>
+          <m:t>​</m:t>
+        </m:r>
+        <m:d>
+          <m:dPr>
+            <m:begChr m:val="|"/>
+            <m:sepChr m:val=""/>
+            <m:endChr m:val="|"/>
+            <m:grow/>
+          </m:dPr>
+          <m:e>
+            <m:r>
+              <m:t>A</m:t>
+            </m:r>
+          </m:e>
+        </m:d>
+        <m:sSup>
+          <m:e>
+            <m:r>
+              <m:t>​</m:t>
+            </m:r>
+          </m:e>
+          <m:sup>
+            <m:r>
+              <m:t>2</m:t>
+            </m:r>
+          </m:sup>
+        </m:sSup>
+      </m:oMath>
+      <w:r>
+        <w:t xml:space="preserve">.</w:t>
+      </w:r>
+      <w:r>
+        <w:t xml:space="preserve"> </w:t>
+      </w:r>
+      <w:r>
+        <w:t xml:space="preserve">The sets</w:t>
+      </w:r>
+      <w:r>
+        <w:t xml:space="preserve"> </w:t>
+      </w:r>
+      <m:oMath>
+        <m:r>
+          <m:t>​</m:t>
+        </m:r>
+        <m:d>
+          <m:dPr>
+            <m:begChr m:val="{"/>
+            <m:sepChr m:val=""/>
+            <m:endChr m:val="}"/>
+            <m:grow/>
+          </m:dPr>
+          <m:e>
+            <m:r>
+              <m:t>1</m:t>
+            </m:r>
+          </m:e>
+        </m:d>
+        <m:r>
+          <m:t>​</m:t>
+        </m:r>
+      </m:oMath>
+      <w:r>
+        <w:t xml:space="preserve"> </w:t>
+      </w:r>
+      <w:r>
+        <w:t xml:space="preserve">and</w:t>
+      </w:r>
+      <w:r>
+        <w:t xml:space="preserve"> </w:t>
+      </w:r>
+      <m:oMath>
+        <m:r>
+          <m:t>​</m:t>
+        </m:r>
+        <m:d>
+          <m:dPr>
+            <m:begChr m:val="{"/>
+            <m:sepChr m:val=""/>
+            <m:endChr m:val="}"/>
+            <m:grow/>
+          </m:dPr>
+          <m:e>
+            <m:r>
+              <m:t>2</m:t>
+            </m:r>
+          </m:e>
+        </m:d>
+        <m:r>
+          <m:t>​</m:t>
+        </m:r>
+      </m:oMath>
+      <w:r>
+        <w:t xml:space="preserve"> </w:t>
+      </w:r>
+      <w:r>
+        <w:t xml:space="preserve">are pairwise disjoint, but</w:t>
+      </w:r>
+    </w:p>
+    <w:p>
+      <w:pPr>
+        <w:pStyle w:val="BodyText"/>
+      </w:pPr>
+      <m:oMathPara>
+        <m:oMathParaPr>
+          <m:jc m:val="center"/>
+        </m:oMathParaPr>
+        <m:oMath>
+          <m:eqArr>
+            <m:e>
+              <m:r>
+                <m:t>ν</m:t>
+              </m:r>
+              <m:r>
+                <m:rPr>
+                  <m:sty m:val="p"/>
+                </m:rPr>
+                <m:t>(</m:t>
+              </m:r>
+              <m:r>
+                <m:t>​</m:t>
+              </m:r>
+              <m:d>
+                <m:dPr>
+                  <m:begChr m:val="{"/>
+                  <m:sepChr m:val=""/>
+                  <m:endChr m:val="}"/>
+                  <m:grow/>
+                </m:dPr>
+                <m:e>
+                  <m:r>
+                    <m:t>1</m:t>
+                  </m:r>
+                </m:e>
+              </m:d>
+              <m:r>
+                <m:t>​</m:t>
+              </m:r>
+              <m:r>
+                <m:rPr>
+                  <m:sty m:val="p"/>
+                </m:rPr>
+                <m:t>∪</m:t>
+              </m:r>
+              <m:r>
+                <m:t>​</m:t>
+              </m:r>
+              <m:d>
+                <m:dPr>
+                  <m:begChr m:val="{"/>
+                  <m:sepChr m:val=""/>
+                  <m:endChr m:val="}"/>
+                  <m:grow/>
+                </m:dPr>
+                <m:e>
+                  <m:r>
+                    <m:t>2</m:t>
+                  </m:r>
+                </m:e>
+              </m:d>
+              <m:r>
+                <m:t>​</m:t>
+              </m:r>
+              <m:r>
+                <m:rPr>
+                  <m:sty m:val="p"/>
+                </m:rPr>
+                <m:t>)</m:t>
+              </m:r>
+              <m:r>
+                <m:t>&amp;</m:t>
+              </m:r>
+              <m:r>
+                <m:rPr>
+                  <m:sty m:val="p"/>
+                </m:rPr>
+                <m:t>=</m:t>
+              </m:r>
+              <m:r>
+                <m:t>ν</m:t>
+              </m:r>
+              <m:r>
+                <m:rPr>
+                  <m:sty m:val="p"/>
+                </m:rPr>
+                <m:t>(</m:t>
+              </m:r>
+              <m:r>
+                <m:t>​</m:t>
+              </m:r>
+              <m:d>
+                <m:dPr>
+                  <m:begChr m:val="{"/>
+                  <m:sepChr m:val=""/>
+                  <m:endChr m:val="}"/>
+                  <m:grow/>
+                </m:dPr>
+                <m:e>
+                  <m:r>
+                    <m:t>1</m:t>
+                  </m:r>
+                  <m:r>
+                    <m:rPr>
+                      <m:sty m:val="p"/>
+                    </m:rPr>
+                    <m:t>,</m:t>
+                  </m:r>
+                  <m:r>
+                    <m:t>2</m:t>
+                  </m:r>
+                </m:e>
+              </m:d>
+              <m:r>
+                <m:t>​</m:t>
+              </m:r>
+              <m:r>
+                <m:rPr>
+                  <m:sty m:val="p"/>
+                </m:rPr>
+                <m:t>)</m:t>
+              </m:r>
+              <m:r>
+                <m:t>&amp;</m:t>
+              </m:r>
+              <m:r>
+                <m:t>&amp;</m:t>
+              </m:r>
+              <m:r>
+                <m:rPr>
+                  <m:nor/>
+                  <m:sty m:val="p"/>
+                </m:rPr>
+                <m:t>(take the union)</m:t>
+              </m:r>
+            </m:e>
+            <m:e>
+              <m:r>
+                <m:t>&amp;</m:t>
+              </m:r>
+              <m:r>
+                <m:rPr>
+                  <m:sty m:val="p"/>
+                </m:rPr>
+                <m:t>=</m:t>
+              </m:r>
+              <m:sSup>
+                <m:e>
+                  <m:r>
+                    <m:t>2</m:t>
+                  </m:r>
+                </m:e>
+                <m:sup>
+                  <m:r>
+                    <m:t>2</m:t>
+                  </m:r>
+                </m:sup>
+              </m:sSup>
+              <m:r>
+                <m:rPr>
+                  <m:sty m:val="p"/>
+                </m:rPr>
+                <m:t>=</m:t>
+              </m:r>
+              <m:r>
+                <m:t>4</m:t>
+              </m:r>
+              <m:r>
+                <m:rPr>
+                  <m:sty m:val="p"/>
+                </m:rPr>
+                <m:t>,</m:t>
+              </m:r>
+              <m:r>
+                <m:t>&amp;</m:t>
+              </m:r>
+              <m:r>
+                <m:t>&amp;</m:t>
+              </m:r>
+              <m:r>
+                <m:rPr>
+                  <m:nor/>
+                  <m:sty m:val="p"/>
+                </m:rPr>
+                <m:t>(count, then square)</m:t>
+              </m:r>
+            </m:e>
+            <m:e>
+              <m:r>
+                <m:t>ν</m:t>
+              </m:r>
+              <m:r>
+                <m:rPr>
+                  <m:sty m:val="p"/>
+                </m:rPr>
+                <m:t>(</m:t>
+              </m:r>
+              <m:r>
+                <m:t>​</m:t>
+              </m:r>
+              <m:d>
+                <m:dPr>
+                  <m:begChr m:val="{"/>
+                  <m:sepChr m:val=""/>
+                  <m:endChr m:val="}"/>
+                  <m:grow/>
+                </m:dPr>
+                <m:e>
+                  <m:r>
+                    <m:t>1</m:t>
+                  </m:r>
+                </m:e>
+              </m:d>
+              <m:r>
+                <m:t>​</m:t>
+              </m:r>
+              <m:r>
+                <m:rPr>
+                  <m:sty m:val="p"/>
+                </m:rPr>
+                <m:t>)</m:t>
+              </m:r>
+              <m:r>
+                <m:rPr>
+                  <m:sty m:val="p"/>
+                </m:rPr>
+                <m:t>+</m:t>
+              </m:r>
+              <m:r>
+                <m:t>ν</m:t>
+              </m:r>
+              <m:r>
+                <m:rPr>
+                  <m:sty m:val="p"/>
+                </m:rPr>
+                <m:t>(</m:t>
+              </m:r>
+              <m:r>
+                <m:t>​</m:t>
+              </m:r>
+              <m:d>
+                <m:dPr>
+                  <m:begChr m:val="{"/>
+                  <m:sepChr m:val=""/>
+                  <m:endChr m:val="}"/>
+                  <m:grow/>
+                </m:dPr>
+                <m:e>
+                  <m:r>
+                    <m:t>2</m:t>
+                  </m:r>
+                </m:e>
+              </m:d>
+              <m:r>
+                <m:t>​</m:t>
+              </m:r>
+              <m:r>
+                <m:rPr>
+                  <m:sty m:val="p"/>
+                </m:rPr>
+                <m:t>)</m:t>
+              </m:r>
+              <m:r>
+                <m:t>&amp;</m:t>
+              </m:r>
+              <m:r>
+                <m:rPr>
+                  <m:sty m:val="p"/>
+                </m:rPr>
+                <m:t>=</m:t>
+              </m:r>
+              <m:sSup>
+                <m:e>
+                  <m:r>
+                    <m:t>1</m:t>
+                  </m:r>
+                </m:e>
+                <m:sup>
+                  <m:r>
+                    <m:t>2</m:t>
+                  </m:r>
+                </m:sup>
+              </m:sSup>
+              <m:r>
+                <m:rPr>
+                  <m:sty m:val="p"/>
+                </m:rPr>
+                <m:t>+</m:t>
+              </m:r>
+              <m:sSup>
+                <m:e>
+                  <m:r>
+                    <m:t>1</m:t>
+                  </m:r>
+                </m:e>
+                <m:sup>
+                  <m:r>
+                    <m:t>2</m:t>
+                  </m:r>
+                </m:sup>
+              </m:sSup>
+              <m:r>
+                <m:rPr>
+                  <m:sty m:val="p"/>
+                </m:rPr>
+                <m:t>=</m:t>
+              </m:r>
+              <m:r>
+                <m:t>2</m:t>
+              </m:r>
+              <m:r>
+                <m:rPr>
+                  <m:sty m:val="p"/>
+                </m:rPr>
+                <m:t>,</m:t>
+              </m:r>
+              <m:r>
+                <m:t>&amp;</m:t>
+              </m:r>
+              <m:r>
+                <m:t>&amp;</m:t>
+              </m:r>
+              <m:r>
+                <m:rPr>
+                  <m:nor/>
+                  <m:sty m:val="p"/>
+                </m:rPr>
+                <m:t>(count each set, then square)</m:t>
+              </m:r>
+            </m:e>
+          </m:eqArr>
+        </m:oMath>
+      </m:oMathPara>
+    </w:p>
+    <w:p>
+      <w:pPr>
+        <w:pStyle w:val="FirstParagraph"/>
+      </w:pPr>
+      <w:r>
+        <w:t xml:space="preserve">and</w:t>
+      </w:r>
+      <w:r>
+        <w:t xml:space="preserve"> </w:t>
+      </w:r>
+      <m:oMath>
+        <m:r>
+          <m:t>4</m:t>
+        </m:r>
+        <m:r>
+          <m:rPr>
+            <m:sty m:val="p"/>
+          </m:rPr>
+          <m:t>≠</m:t>
+        </m:r>
+        <m:r>
+          <m:t>2</m:t>
+        </m:r>
+      </m:oMath>
+      <w:r>
+        <w:t xml:space="preserve">, so</w:t>
+      </w:r>
+      <w:r>
+        <w:t xml:space="preserve"> </w:t>
+      </w:r>
+      <m:oMath>
+        <m:r>
+          <m:t>ν</m:t>
+        </m:r>
+      </m:oMath>
+      <w:r>
+        <w:t xml:space="preserve"> </w:t>
+      </w:r>
+      <w:r>
+        <w:t xml:space="preserve">is not finitely additive.</w:t>
+      </w:r>
+    </w:p>
+    <w:bookmarkEnd w:id="30"/>
+    <w:bookmarkStart w:id="31" w:name="def-countable-additivity"/>
     <w:p>
       <w:pPr>
         <w:pStyle w:val="BodyText"/>
@@ -5280,8 +6157,8 @@
         </m:oMath>
       </m:oMathPara>
     </w:p>
-    <w:bookmarkEnd w:id="29"/>
-    <w:bookmarkStart w:id="30" w:name="exm-countable-additivity"/>
+    <w:bookmarkEnd w:id="31"/>
+    <w:bookmarkStart w:id="32" w:name="exm-countable-additivity"/>
     <w:p>
       <w:pPr>
         <w:pStyle w:val="FirstParagraph"/>
@@ -5291,7 +6168,7 @@
           <w:b/>
           <w:bCs/>
         </w:rPr>
-        <w:t xml:space="preserve">Example 4 (Counting elements is countably additive)</w:t>
+        <w:t xml:space="preserve">Example 6 (Counting elements is countably additive)</w:t>
       </w:r>
       <w:r>
         <w:t xml:space="preserve"> </w:t>
@@ -5374,7 +6251,7 @@
           <w:rPr>
             <w:rStyle w:val="Hyperlink"/>
           </w:rPr>
-          <w:t xml:space="preserve">Example 3</w:t>
+          <w:t xml:space="preserve">Example 4</w:t>
         </w:r>
       </w:hyperlink>
       <w:r>
@@ -5560,7 +6437,7 @@
           <w:rPr>
             <w:rStyle w:val="Hyperlink"/>
           </w:rPr>
-          <w:t xml:space="preserve">Example 3</w:t>
+          <w:t xml:space="preserve">Example 4</w:t>
         </w:r>
       </w:hyperlink>
       <w:r>
@@ -5607,8 +6484,8 @@
         <w:t xml:space="preserve">is countably additive.</w:t>
       </w:r>
     </w:p>
-    <w:bookmarkEnd w:id="30"/>
-    <w:bookmarkStart w:id="31" w:name="lem-nonneg-series"/>
+    <w:bookmarkEnd w:id="32"/>
+    <w:bookmarkStart w:id="33" w:name="lem-nonneg-series"/>
     <w:p>
       <w:pPr>
         <w:pStyle w:val="BodyText"/>
@@ -6085,7 +6962,7 @@
         <w:t xml:space="preserve">.</w:t>
       </w:r>
     </w:p>
-    <w:bookmarkEnd w:id="31"/>
+    <w:bookmarkEnd w:id="33"/>
     <w:p>
       <w:pPr>
         <w:pStyle w:val="BodyText"/>
@@ -6466,7 +7343,7 @@
       <w:r>
         <w:t xml:space="preserve"> </w:t>
       </w:r>
-      <w:hyperlink r:id="rId32">
+      <w:hyperlink r:id="rId34">
         <w:r>
           <w:rPr>
             <w:rStyle w:val="Hyperlink"/>
@@ -6602,7 +7479,7 @@
         <w:t xml:space="preserve">.</w:t>
       </w:r>
     </w:p>
-    <w:bookmarkStart w:id="33" w:name="rem-countable-additivity-sum-exists"/>
+    <w:bookmarkStart w:id="35" w:name="rem-countable-additivity-sum-exists"/>
     <w:p>
       <w:pPr>
         <w:pStyle w:val="BodyText"/>
@@ -7075,8 +7952,8 @@
         <w:t xml:space="preserve">.</w:t>
       </w:r>
     </w:p>
-    <w:bookmarkEnd w:id="33"/>
-    <w:bookmarkStart w:id="34" w:name="lem-countable-additivity-empty"/>
+    <w:bookmarkEnd w:id="35"/>
+    <w:bookmarkStart w:id="36" w:name="lem-countable-additivity-empty"/>
     <w:p>
       <w:pPr>
         <w:pStyle w:val="BodyText"/>
@@ -7251,7 +8128,7 @@
         <w:t xml:space="preserve">.</w:t>
       </w:r>
     </w:p>
-    <w:bookmarkEnd w:id="34"/>
+    <w:bookmarkEnd w:id="36"/>
     <w:p>
       <w:pPr>
         <w:pStyle w:val="BodyText"/>
@@ -7804,7 +8681,7 @@
         <w:t xml:space="preserve">.</w:t>
       </w:r>
     </w:p>
-    <w:bookmarkStart w:id="35" w:name="exm-empty-set-zero"/>
+    <w:bookmarkStart w:id="37" w:name="exm-empty-set-zero"/>
     <w:p>
       <w:pPr>
         <w:pStyle w:val="BodyText"/>
@@ -7814,7 +8691,7 @@
           <w:b/>
           <w:bCs/>
         </w:rPr>
-        <w:t xml:space="preserve">Example 5 (A countably additive function with</w:t>
+        <w:t xml:space="preserve">Example 7 (A countably additive function with</w:t>
       </w:r>
       <w:r>
         <w:rPr>
@@ -7943,7 +8820,7 @@
           <w:rPr>
             <w:rStyle w:val="Hyperlink"/>
           </w:rPr>
-          <w:t xml:space="preserve">Example 4</w:t>
+          <w:t xml:space="preserve">Example 6</w:t>
         </w:r>
       </w:hyperlink>
       <w:r>
@@ -8084,8 +8961,8 @@
         </m:oMath>
       </m:oMathPara>
     </w:p>
-    <w:bookmarkEnd w:id="35"/>
-    <w:bookmarkStart w:id="36" w:name="exm-empty-set-infinity"/>
+    <w:bookmarkEnd w:id="37"/>
+    <w:bookmarkStart w:id="38" w:name="exm-empty-set-infinity"/>
     <w:p>
       <w:pPr>
         <w:pStyle w:val="FirstParagraph"/>
@@ -8095,7 +8972,7 @@
           <w:b/>
           <w:bCs/>
         </w:rPr>
-        <w:t xml:space="preserve">Example 6 (A countably additive function with</w:t>
+        <w:t xml:space="preserve">Example 8 (A countably additive function with</w:t>
       </w:r>
       <w:r>
         <w:rPr>
@@ -8847,8 +9724,8 @@
         <w:t xml:space="preserve">.</w:t>
       </w:r>
     </w:p>
-    <w:bookmarkEnd w:id="36"/>
-    <w:bookmarkStart w:id="37" w:name="rem-empty-set-requirement"/>
+    <w:bookmarkEnd w:id="38"/>
+    <w:bookmarkStart w:id="39" w:name="rem-empty-set-requirement"/>
     <w:p>
       <w:pPr>
         <w:pStyle w:val="BodyText"/>
@@ -8906,7 +9783,7 @@
           <w:rPr>
             <w:rStyle w:val="Hyperlink"/>
           </w:rPr>
-          <w:t xml:space="preserve">Example 5</w:t>
+          <w:t xml:space="preserve">Example 7</w:t>
         </w:r>
       </w:hyperlink>
       <w:r>
@@ -8923,7 +9800,7 @@
           <w:rPr>
             <w:rStyle w:val="Hyperlink"/>
           </w:rPr>
-          <w:t xml:space="preserve">Example 6</w:t>
+          <w:t xml:space="preserve">Example 8</w:t>
         </w:r>
       </w:hyperlink>
       <w:r>
@@ -9009,8 +9886,8 @@
         <w:t xml:space="preserve">is an extra requirement, not a consequence of countable additivity.</w:t>
       </w:r>
     </w:p>
-    <w:bookmarkEnd w:id="37"/>
-    <w:bookmarkStart w:id="38" w:name="thm-countable-implies-finite"/>
+    <w:bookmarkEnd w:id="39"/>
+    <w:bookmarkStart w:id="40" w:name="thm-countable-implies-finite"/>
     <w:p>
       <w:pPr>
         <w:pStyle w:val="BodyText"/>
@@ -9175,7 +10052,7 @@
         <w:t xml:space="preserve">.</w:t>
       </w:r>
     </w:p>
-    <w:bookmarkEnd w:id="38"/>
+    <w:bookmarkEnd w:id="40"/>
     <w:p>
       <w:pPr>
         <w:pStyle w:val="BodyText"/>
@@ -10040,7 +10917,7 @@
         </m:oMath>
       </m:oMathPara>
     </w:p>
-    <w:bookmarkStart w:id="39" w:name="exm-finite-not-countable"/>
+    <w:bookmarkStart w:id="41" w:name="exm-finite-not-countable"/>
     <w:p>
       <w:pPr>
         <w:pStyle w:val="FirstParagraph"/>
@@ -10050,7 +10927,7 @@
           <w:b/>
           <w:bCs/>
         </w:rPr>
-        <w:t xml:space="preserve">Example 7 (Finitely additive but not countably additive)</w:t>
+        <w:t xml:space="preserve">Example 9 (Finitely additive but not countably additive)</w:t>
       </w:r>
       <w:r>
         <w:t xml:space="preserve"> </w:t>
@@ -11681,8 +12558,8 @@
         </m:oMath>
       </m:oMathPara>
     </w:p>
-    <w:bookmarkEnd w:id="39"/>
-    <w:bookmarkStart w:id="41" w:name="rem-finite-not-countable-converse"/>
+    <w:bookmarkEnd w:id="41"/>
+    <w:bookmarkStart w:id="43" w:name="rem-finite-not-countable-converse"/>
     <w:p>
       <w:pPr>
         <w:pStyle w:val="FirstParagraph"/>
@@ -11702,7 +12579,7 @@
           <w:rPr>
             <w:rStyle w:val="Hyperlink"/>
           </w:rPr>
-          <w:t xml:space="preserve">Example 7</w:t>
+          <w:t xml:space="preserve">Example 9</w:t>
         </w:r>
       </w:hyperlink>
       <w:r>
@@ -11787,7 +12664,7 @@
       <w:r>
         <w:t xml:space="preserve"> </w:t>
       </w:r>
-      <w:hyperlink r:id="rId40">
+      <w:hyperlink r:id="rId42">
         <w:r>
           <w:rPr>
             <w:rStyle w:val="Hyperlink"/>
@@ -11855,7 +12732,7 @@
           <w:rPr>
             <w:rStyle w:val="Hyperlink"/>
           </w:rPr>
-          <w:t xml:space="preserve">Example 7</w:t>
+          <w:t xml:space="preserve">Example 9</w:t>
         </w:r>
       </w:hyperlink>
       <w:r>
@@ -11926,9 +12803,9 @@
         <w:t xml:space="preserve">is finite.</w:t>
       </w:r>
     </w:p>
-    <w:bookmarkEnd w:id="41"/>
-    <w:bookmarkEnd w:id="42"/>
-    <w:bookmarkStart w:id="51" w:name="measures"/>
+    <w:bookmarkEnd w:id="43"/>
+    <w:bookmarkEnd w:id="44"/>
+    <w:bookmarkStart w:id="53" w:name="measures"/>
     <w:p>
       <w:pPr>
         <w:pStyle w:val="Heading2"/>
@@ -11937,7 +12814,7 @@
         <w:t xml:space="preserve">4 Measures</w:t>
       </w:r>
     </w:p>
-    <w:bookmarkStart w:id="43" w:name="def-measure"/>
+    <w:bookmarkStart w:id="45" w:name="def-measure"/>
     <w:p>
       <w:pPr>
         <w:pStyle w:val="FirstParagraph"/>
@@ -12158,8 +13035,8 @@
         <w:t xml:space="preserve">.</w:t>
       </w:r>
     </w:p>
-    <w:bookmarkEnd w:id="43"/>
-    <w:bookmarkStart w:id="44" w:name="exm-measure"/>
+    <w:bookmarkEnd w:id="45"/>
+    <w:bookmarkStart w:id="46" w:name="exm-measure"/>
     <w:p>
       <w:pPr>
         <w:pStyle w:val="FirstParagraph"/>
@@ -12169,7 +13046,7 @@
           <w:b/>
           <w:bCs/>
         </w:rPr>
-        <w:t xml:space="preserve">Example 8 (Counting elements is a measure)</w:t>
+        <w:t xml:space="preserve">Example 10 (Counting elements is a measure)</w:t>
       </w:r>
       <w:r>
         <w:t xml:space="preserve"> </w:t>
@@ -12252,7 +13129,7 @@
           <w:rPr>
             <w:rStyle w:val="Hyperlink"/>
           </w:rPr>
-          <w:t xml:space="preserve">Example 3</w:t>
+          <w:t xml:space="preserve">Example 4</w:t>
         </w:r>
       </w:hyperlink>
       <w:r>
@@ -12352,7 +13229,7 @@
           <w:rPr>
             <w:rStyle w:val="Hyperlink"/>
           </w:rPr>
-          <w:t xml:space="preserve">Example 4</w:t>
+          <w:t xml:space="preserve">Example 6</w:t>
         </w:r>
       </w:hyperlink>
       <w:r>
@@ -12409,8 +13286,8 @@
         <w:t xml:space="preserve">so it is a measure.</w:t>
       </w:r>
     </w:p>
-    <w:bookmarkEnd w:id="44"/>
-    <w:bookmarkStart w:id="45" w:name="cor-measure-finitely-additive"/>
+    <w:bookmarkEnd w:id="46"/>
+    <w:bookmarkStart w:id="47" w:name="cor-measure-finitely-additive"/>
     <w:p>
       <w:pPr>
         <w:pStyle w:val="BodyText"/>
@@ -12460,7 +13337,7 @@
         <w:t xml:space="preserve">.</w:t>
       </w:r>
     </w:p>
-    <w:bookmarkEnd w:id="45"/>
+    <w:bookmarkEnd w:id="47"/>
     <w:p>
       <w:pPr>
         <w:pStyle w:val="BodyText"/>
@@ -12568,7 +13445,7 @@
         <w:t xml:space="preserve">applies to it.</w:t>
       </w:r>
     </w:p>
-    <w:bookmarkStart w:id="46" w:name="def-counting-measure"/>
+    <w:bookmarkStart w:id="48" w:name="def-counting-measure"/>
     <w:p>
       <w:pPr>
         <w:pStyle w:val="BodyText"/>
@@ -12837,8 +13714,8 @@
         </m:oMath>
       </m:oMathPara>
     </w:p>
-    <w:bookmarkEnd w:id="46"/>
-    <w:bookmarkStart w:id="47" w:name="exm-counting-measure"/>
+    <w:bookmarkEnd w:id="48"/>
+    <w:bookmarkStart w:id="49" w:name="exm-counting-measure"/>
     <w:p>
       <w:pPr>
         <w:pStyle w:val="FirstParagraph"/>
@@ -12848,7 +13725,7 @@
           <w:b/>
           <w:bCs/>
         </w:rPr>
-        <w:t xml:space="preserve">Example 9 (Counting measure on the non-negative integers)</w:t>
+        <w:t xml:space="preserve">Example 11 (Counting measure on the non-negative integers)</w:t>
       </w:r>
       <w:r>
         <w:t xml:space="preserve"> </w:t>
@@ -13307,8 +14184,8 @@
         <w:t xml:space="preserve">.</w:t>
       </w:r>
     </w:p>
-    <w:bookmarkEnd w:id="47"/>
-    <w:bookmarkStart w:id="50" w:name="rem-measure-size"/>
+    <w:bookmarkEnd w:id="49"/>
+    <w:bookmarkStart w:id="52" w:name="rem-measure-size"/>
     <w:p>
       <w:pPr>
         <w:pStyle w:val="BodyText"/>
@@ -13384,7 +14261,7 @@
       <w:r>
         <w:t xml:space="preserve"> </w:t>
       </w:r>
-      <w:hyperlink r:id="rId48">
+      <w:hyperlink r:id="rId50">
         <w:r>
           <w:rPr>
             <w:rStyle w:val="Hyperlink"/>
@@ -13672,7 +14549,7 @@
       <w:r>
         <w:t xml:space="preserve"> </w:t>
       </w:r>
-      <w:hyperlink r:id="rId49">
+      <w:hyperlink r:id="rId51">
         <w:r>
           <w:rPr>
             <w:rStyle w:val="Hyperlink"/>
@@ -13684,9 +14561,9 @@
         <w:t xml:space="preserve">.</w:t>
       </w:r>
     </w:p>
-    <w:bookmarkEnd w:id="50"/>
-    <w:bookmarkEnd w:id="51"/>
-    <w:bookmarkStart w:id="52" w:name="sec-further-reading"/>
+    <w:bookmarkEnd w:id="52"/>
+    <w:bookmarkEnd w:id="53"/>
+    <w:bookmarkStart w:id="54" w:name="sec-further-reading"/>
     <w:p>
       <w:pPr>
         <w:pStyle w:val="Heading2"/>
@@ -13789,8 +14666,8 @@
         <w:t xml:space="preserve">that opens with a chapter on introductory measure theory.</w:t>
       </w:r>
     </w:p>
-    <w:bookmarkEnd w:id="52"/>
-    <w:bookmarkStart w:id="59" w:name="references"/>
+    <w:bookmarkEnd w:id="54"/>
+    <w:bookmarkStart w:id="61" w:name="references"/>
     <w:p>
       <w:pPr>
         <w:pStyle w:val="Heading2"/>
@@ -13799,8 +14676,8 @@
         <w:t xml:space="preserve">References</w:t>
       </w:r>
     </w:p>
-    <w:bookmarkStart w:id="58" w:name="refs"/>
-    <w:bookmarkStart w:id="53" w:name="ref-billingsley1995probability"/>
+    <w:bookmarkStart w:id="60" w:name="refs"/>
+    <w:bookmarkStart w:id="55" w:name="ref-billingsley1995probability"/>
     <w:p>
       <w:pPr>
         <w:pStyle w:val="Bibliography"/>
@@ -13822,8 +14699,8 @@
         <w:t xml:space="preserve">. 3rd ed. Wiley Series in Probability and Mathematical Statistics. Wiley.</w:t>
       </w:r>
     </w:p>
-    <w:bookmarkEnd w:id="53"/>
-    <w:bookmarkStart w:id="55" w:name="ref-folland1999real"/>
+    <w:bookmarkEnd w:id="55"/>
+    <w:bookmarkStart w:id="57" w:name="ref-folland1999real"/>
     <w:p>
       <w:pPr>
         <w:pStyle w:val="Bibliography"/>
@@ -13847,7 +14724,7 @@
       <w:r>
         <w:t xml:space="preserve"> </w:t>
       </w:r>
-      <w:hyperlink r:id="rId54">
+      <w:hyperlink r:id="rId56">
         <w:r>
           <w:rPr>
             <w:rStyle w:val="Hyperlink"/>
@@ -13859,8 +14736,8 @@
         <w:t xml:space="preserve">.</w:t>
       </w:r>
     </w:p>
-    <w:bookmarkEnd w:id="55"/>
-    <w:bookmarkStart w:id="57" w:name="ref-gut2013"/>
+    <w:bookmarkEnd w:id="57"/>
+    <w:bookmarkStart w:id="59" w:name="ref-gut2013"/>
     <w:p>
       <w:pPr>
         <w:pStyle w:val="Bibliography"/>
@@ -13884,7 +14761,7 @@
       <w:r>
         <w:t xml:space="preserve"> </w:t>
       </w:r>
-      <w:hyperlink r:id="rId56">
+      <w:hyperlink r:id="rId58">
         <w:r>
           <w:rPr>
             <w:rStyle w:val="Hyperlink"/>
@@ -13896,9 +14773,9 @@
         <w:t xml:space="preserve">.</w:t>
       </w:r>
     </w:p>
-    <w:bookmarkEnd w:id="57"/>
-    <w:bookmarkEnd w:id="58"/>
     <w:bookmarkEnd w:id="59"/>
+    <w:bookmarkEnd w:id="60"/>
+    <w:bookmarkEnd w:id="61"/>
     <w:sectPr>
       <w:footnotePr>
         <w:numRestart w:val="eachSect"/>

</xml_diff>

<commit_message>
Deploying to gh-pages from @ Morrison-Lab/mds@16fdad769e7f49a280785611537d2506a22ad126 🚀
</commit_message>
<xml_diff>
--- a/measures.docx
+++ b/measures.docx
@@ -15,7 +15,7 @@
         <w:pStyle w:val="Date"/>
       </w:pPr>
       <w:r>
-        <w:t xml:space="preserve">Last modified: 2026-10-05 19:53:51 (PDT)</w:t>
+        <w:t xml:space="preserve">Last modified: 2026-10-05 21:01:53 (PDT)</w:t>
       </w:r>
     </w:p>
     <w:p>
@@ -111,7 +111,7 @@
         <w:t xml:space="preserve">).</w:t>
       </w:r>
     </w:p>
-    <w:bookmarkStart w:id="21" w:name="sigma-algebras"/>
+    <w:bookmarkStart w:id="24" w:name="sigma-algebras"/>
     <w:p>
       <w:pPr>
         <w:pStyle w:val="Heading2"/>
@@ -131,7 +131,7 @@
         <w:t xml:space="preserve">-algebras</w:t>
       </w:r>
     </w:p>
-    <w:bookmarkStart w:id="12" w:name="def-sigma-algebra"/>
+    <w:bookmarkStart w:id="14" w:name="def-sigma-algebra"/>
     <w:p>
       <w:pPr>
         <w:pStyle w:val="FirstParagraph"/>
@@ -340,8 +340,19 @@
         <w:t xml:space="preserve"> </w:t>
       </w:r>
       <w:r>
-        <w:t xml:space="preserve">contains its complement</w:t>
-      </w:r>
+        <w:t xml:space="preserve">contains its</w:t>
+      </w:r>
+      <w:r>
+        <w:t xml:space="preserve"> </w:t>
+      </w:r>
+      <w:hyperlink r:id="rId12">
+        <w:r>
+          <w:rPr>
+            <w:rStyle w:val="Hyperlink"/>
+          </w:rPr>
+          <w:t xml:space="preserve">complement</w:t>
+        </w:r>
+      </w:hyperlink>
       <w:r>
         <w:t xml:space="preserve"> </w:t>
       </w:r>
@@ -372,8 +383,19 @@
         </w:numPr>
       </w:pPr>
       <w:r>
-        <w:t xml:space="preserve">For each sequence</w:t>
-      </w:r>
+        <w:t xml:space="preserve">For each</w:t>
+      </w:r>
+      <w:r>
+        <w:t xml:space="preserve"> </w:t>
+      </w:r>
+      <w:hyperlink r:id="rId13">
+        <w:r>
+          <w:rPr>
+            <w:rStyle w:val="Hyperlink"/>
+          </w:rPr>
+          <w:t xml:space="preserve">sequence</w:t>
+        </w:r>
+      </w:hyperlink>
       <w:r>
         <w:t xml:space="preserve"> </w:t>
       </w:r>
@@ -513,8 +535,8 @@
         <w:t xml:space="preserve">.</w:t>
       </w:r>
     </w:p>
-    <w:bookmarkEnd w:id="12"/>
-    <w:bookmarkStart w:id="14" w:name="rem-sigma-field"/>
+    <w:bookmarkEnd w:id="14"/>
+    <w:bookmarkStart w:id="16" w:name="rem-sigma-field"/>
     <w:p>
       <w:pPr>
         <w:pStyle w:val="FirstParagraph"/>
@@ -575,7 +597,7 @@
       <w:r>
         <w:t xml:space="preserve"> </w:t>
       </w:r>
-      <w:hyperlink r:id="rId13">
+      <w:hyperlink r:id="rId15">
         <w:r>
           <w:rPr>
             <w:rStyle w:val="Hyperlink"/>
@@ -645,8 +667,8 @@
         <w:t xml:space="preserve">The two names mean the same thing.</w:t>
       </w:r>
     </w:p>
-    <w:bookmarkEnd w:id="14"/>
-    <w:bookmarkStart w:id="16" w:name="exm-sigma-algebra"/>
+    <w:bookmarkEnd w:id="16"/>
+    <w:bookmarkStart w:id="18" w:name="exm-sigma-algebra"/>
     <w:p>
       <w:pPr>
         <w:pStyle w:val="BodyText"/>
@@ -760,7 +782,7 @@
       <w:r>
         <w:t xml:space="preserve">(</w:t>
       </w:r>
-      <w:hyperlink r:id="rId15">
+      <w:hyperlink r:id="rId17">
         <w:r>
           <w:rPr>
             <w:rStyle w:val="Hyperlink"/>
@@ -1114,8 +1136,8 @@
         <w:t xml:space="preserve">.</w:t>
       </w:r>
     </w:p>
-    <w:bookmarkEnd w:id="16"/>
-    <w:bookmarkStart w:id="17" w:name="exm-not-sigma-algebra"/>
+    <w:bookmarkEnd w:id="18"/>
+    <w:bookmarkStart w:id="19" w:name="exm-not-sigma-algebra"/>
     <w:p>
       <w:pPr>
         <w:pStyle w:val="BodyText"/>
@@ -1445,8 +1467,8 @@
         <w:t xml:space="preserve">.</w:t>
       </w:r>
     </w:p>
-    <w:bookmarkEnd w:id="17"/>
-    <w:bookmarkStart w:id="19" w:name="thm-sigma-algebra-closure"/>
+    <w:bookmarkEnd w:id="19"/>
+    <w:bookmarkStart w:id="22" w:name="thm-sigma-algebra-closure"/>
     <w:p>
       <w:pPr>
         <w:pStyle w:val="BodyText"/>
@@ -1573,7 +1595,7 @@
       <w:r>
         <w:t xml:space="preserve"> </w:t>
       </w:r>
-      <w:hyperlink r:id="rId18">
+      <w:hyperlink r:id="rId20">
         <w:r>
           <w:rPr>
             <w:rStyle w:val="Hyperlink"/>
@@ -1658,7 +1680,24 @@
         <w:t xml:space="preserve"> </w:t>
       </w:r>
       <w:r>
-        <w:t xml:space="preserve">of any finitely many sets</w:t>
+        <w:t xml:space="preserve">of any</w:t>
+      </w:r>
+      <w:r>
+        <w:t xml:space="preserve"> </w:t>
+      </w:r>
+      <w:hyperlink r:id="rId21">
+        <w:r>
+          <w:rPr>
+            <w:rStyle w:val="Hyperlink"/>
+          </w:rPr>
+          <w:t xml:space="preserve">finitely many</w:t>
+        </w:r>
+      </w:hyperlink>
+      <w:r>
+        <w:t xml:space="preserve"> </w:t>
+      </w:r>
+      <w:r>
+        <w:t xml:space="preserve">sets</w:t>
       </w:r>
       <w:r>
         <w:t xml:space="preserve"> </w:t>
@@ -1864,7 +1903,7 @@
         <w:t xml:space="preserve">.</w:t>
       </w:r>
     </w:p>
-    <w:bookmarkEnd w:id="19"/>
+    <w:bookmarkEnd w:id="22"/>
     <w:p>
       <w:pPr>
         <w:pStyle w:val="FirstParagraph"/>
@@ -2903,7 +2942,7 @@
         <w:t xml:space="preserve">by the complement rule again.</w:t>
       </w:r>
     </w:p>
-    <w:bookmarkStart w:id="20" w:name="thm-power-set-sigma-algebra"/>
+    <w:bookmarkStart w:id="23" w:name="thm-power-set-sigma-algebra"/>
     <w:p>
       <w:pPr>
         <w:pStyle w:val="BodyText"/>
@@ -3005,7 +3044,7 @@
         <w:t xml:space="preserve">.</w:t>
       </w:r>
     </w:p>
-    <w:bookmarkEnd w:id="20"/>
+    <w:bookmarkEnd w:id="23"/>
     <w:p>
       <w:pPr>
         <w:pStyle w:val="BodyText"/>
@@ -3343,8 +3382,8 @@
         <w:t xml:space="preserve">.</w:t>
       </w:r>
     </w:p>
-    <w:bookmarkEnd w:id="21"/>
-    <w:bookmarkStart w:id="25" w:name="pairwise-disjoint-sets"/>
+    <w:bookmarkEnd w:id="24"/>
+    <w:bookmarkStart w:id="29" w:name="pairwise-disjoint-sets"/>
     <w:p>
       <w:pPr>
         <w:pStyle w:val="Heading2"/>
@@ -3353,7 +3392,7 @@
         <w:t xml:space="preserve">2 Pairwise disjoint sets</w:t>
       </w:r>
     </w:p>
-    <w:bookmarkStart w:id="22" w:name="def-pairwise-disjoint"/>
+    <w:bookmarkStart w:id="25" w:name="def-pairwise-disjoint"/>
     <w:p>
       <w:pPr>
         <w:pStyle w:val="FirstParagraph"/>
@@ -3552,8 +3591,8 @@
         </m:oMath>
       </m:oMathPara>
     </w:p>
-    <w:bookmarkEnd w:id="22"/>
-    <w:bookmarkStart w:id="23" w:name="rem-mutually-exclusive"/>
+    <w:bookmarkEnd w:id="25"/>
+    <w:bookmarkStart w:id="27" w:name="rem-mutually-exclusive"/>
     <w:p>
       <w:pPr>
         <w:pStyle w:val="FirstParagraph"/>
@@ -3600,7 +3639,21 @@
         <w:t xml:space="preserve"> </w:t>
       </w:r>
       <w:r>
-        <w:t xml:space="preserve">“the roll is even”</w:t>
+        <w:t xml:space="preserve">“the roll is</w:t>
+      </w:r>
+      <w:r>
+        <w:t xml:space="preserve"> </w:t>
+      </w:r>
+      <w:hyperlink r:id="rId26">
+        <w:r>
+          <w:rPr>
+            <w:rStyle w:val="Hyperlink"/>
+          </w:rPr>
+          <w:t xml:space="preserve">even</w:t>
+        </w:r>
+      </w:hyperlink>
+      <w:r>
+        <w:t xml:space="preserve">”</w:t>
       </w:r>
       <w:r>
         <w:t xml:space="preserve">,</w:t>
@@ -3723,8 +3776,8 @@
         <w:t xml:space="preserve">no roll is both even and odd.</w:t>
       </w:r>
     </w:p>
-    <w:bookmarkEnd w:id="23"/>
-    <w:bookmarkStart w:id="24" w:name="exm-pairwise-disjoint"/>
+    <w:bookmarkEnd w:id="27"/>
+    <w:bookmarkStart w:id="28" w:name="exm-pairwise-disjoint"/>
     <w:p>
       <w:pPr>
         <w:pStyle w:val="BodyText"/>
@@ -3826,7 +3879,7 @@
       <w:r>
         <w:t xml:space="preserve">(</w:t>
       </w:r>
-      <w:hyperlink r:id="rId15">
+      <w:hyperlink r:id="rId17">
         <w:r>
           <w:rPr>
             <w:rStyle w:val="Hyperlink"/>
@@ -4041,9 +4094,9 @@
         <w:t xml:space="preserve">is in both.</w:t>
       </w:r>
     </w:p>
-    <w:bookmarkEnd w:id="24"/>
-    <w:bookmarkEnd w:id="25"/>
-    <w:bookmarkStart w:id="44" w:name="additivity"/>
+    <w:bookmarkEnd w:id="28"/>
+    <w:bookmarkEnd w:id="29"/>
+    <w:bookmarkStart w:id="53" w:name="additivity"/>
     <w:p>
       <w:pPr>
         <w:pStyle w:val="Heading2"/>
@@ -4052,7 +4105,7 @@
         <w:t xml:space="preserve">3 Additivity</w:t>
       </w:r>
     </w:p>
-    <w:bookmarkStart w:id="28" w:name="def-finite-additivity"/>
+    <w:bookmarkStart w:id="32" w:name="def-finite-additivity"/>
     <w:p>
       <w:pPr>
         <w:pStyle w:val="FirstParagraph"/>
@@ -4130,7 +4183,7 @@
       <w:r>
         <w:t xml:space="preserve"> </w:t>
       </w:r>
-      <w:hyperlink r:id="rId26">
+      <w:hyperlink r:id="rId30">
         <w:r>
           <w:rPr>
             <w:rStyle w:val="Hyperlink"/>
@@ -4204,7 +4257,7 @@
       <w:r>
         <w:t xml:space="preserve"> </w:t>
       </w:r>
-      <w:hyperlink r:id="rId27">
+      <w:hyperlink r:id="rId31">
         <w:r>
           <w:rPr>
             <w:rStyle w:val="Hyperlink"/>
@@ -4460,8 +4513,8 @@
         </m:oMath>
       </m:oMathPara>
     </w:p>
-    <w:bookmarkEnd w:id="28"/>
-    <w:bookmarkStart w:id="29" w:name="exm-finite-additivity"/>
+    <w:bookmarkEnd w:id="32"/>
+    <w:bookmarkStart w:id="33" w:name="exm-finite-additivity"/>
     <w:p>
       <w:pPr>
         <w:pStyle w:val="FirstParagraph"/>
@@ -4563,7 +4616,7 @@
       <w:r>
         <w:t xml:space="preserve">(</w:t>
       </w:r>
-      <w:hyperlink r:id="rId15">
+      <w:hyperlink r:id="rId17">
         <w:r>
           <w:rPr>
             <w:rStyle w:val="Hyperlink"/>
@@ -4653,7 +4706,21 @@
         </m:r>
       </m:oMath>
       <w:r>
-        <w:t xml:space="preserve">,</w:t>
+        <w:t xml:space="preserve"> </w:t>
+      </w:r>
+      <w:r>
+        <w:t xml:space="preserve">(</w:t>
+      </w:r>
+      <w:hyperlink r:id="rId21">
+        <w:r>
+          <w:rPr>
+            <w:rStyle w:val="Hyperlink"/>
+          </w:rPr>
+          <w:t xml:space="preserve">cardinality</w:t>
+        </w:r>
+      </w:hyperlink>
+      <w:r>
+        <w:t xml:space="preserve">),</w:t>
       </w:r>
       <w:r>
         <w:t xml:space="preserve"> </w:t>
@@ -5202,8 +5269,8 @@
         <w:t xml:space="preserve">is finitely additive.</w:t>
       </w:r>
     </w:p>
-    <w:bookmarkEnd w:id="29"/>
-    <w:bookmarkStart w:id="30" w:name="exm-not-finitely-additive"/>
+    <w:bookmarkEnd w:id="33"/>
+    <w:bookmarkStart w:id="34" w:name="exm-not-finitely-additive"/>
     <w:p>
       <w:pPr>
         <w:pStyle w:val="BodyText"/>
@@ -5748,8 +5815,8 @@
         <w:t xml:space="preserve">is not finitely additive.</w:t>
       </w:r>
     </w:p>
-    <w:bookmarkEnd w:id="30"/>
-    <w:bookmarkStart w:id="31" w:name="def-countable-additivity"/>
+    <w:bookmarkEnd w:id="34"/>
+    <w:bookmarkStart w:id="35" w:name="def-countable-additivity"/>
     <w:p>
       <w:pPr>
         <w:pStyle w:val="BodyText"/>
@@ -6157,8 +6224,8 @@
         </m:oMath>
       </m:oMathPara>
     </w:p>
-    <w:bookmarkEnd w:id="31"/>
-    <w:bookmarkStart w:id="32" w:name="exm-countable-additivity"/>
+    <w:bookmarkEnd w:id="35"/>
+    <w:bookmarkStart w:id="36" w:name="exm-countable-additivity"/>
     <w:p>
       <w:pPr>
         <w:pStyle w:val="FirstParagraph"/>
@@ -6484,8 +6551,8 @@
         <w:t xml:space="preserve">is countably additive.</w:t>
       </w:r>
     </w:p>
-    <w:bookmarkEnd w:id="32"/>
-    <w:bookmarkStart w:id="33" w:name="lem-nonneg-series"/>
+    <w:bookmarkEnd w:id="36"/>
+    <w:bookmarkStart w:id="38" w:name="lem-nonneg-series"/>
     <w:p>
       <w:pPr>
         <w:pStyle w:val="BodyText"/>
@@ -6830,7 +6897,21 @@
         <w:t xml:space="preserve"> </w:t>
       </w:r>
       <w:r>
-        <w:t xml:space="preserve">so their limit,</w:t>
+        <w:t xml:space="preserve">so their</w:t>
+      </w:r>
+      <w:r>
+        <w:t xml:space="preserve"> </w:t>
+      </w:r>
+      <w:hyperlink r:id="rId37">
+        <w:r>
+          <w:rPr>
+            <w:rStyle w:val="Hyperlink"/>
+          </w:rPr>
+          <w:t xml:space="preserve">limit</w:t>
+        </w:r>
+      </w:hyperlink>
+      <w:r>
+        <w:t xml:space="preserve">,</w:t>
       </w:r>
       <w:r>
         <w:t xml:space="preserve"> </w:t>
@@ -6962,7 +7043,7 @@
         <w:t xml:space="preserve">.</w:t>
       </w:r>
     </w:p>
-    <w:bookmarkEnd w:id="33"/>
+    <w:bookmarkEnd w:id="38"/>
     <w:p>
       <w:pPr>
         <w:pStyle w:val="BodyText"/>
@@ -7320,19 +7401,64 @@
         <w:t xml:space="preserve"> </w:t>
       </w:r>
       <w:r>
-        <w:t xml:space="preserve">Otherwise, the partial sums form a non-decreasing sequence of real numbers.</w:t>
-      </w:r>
-      <w:r>
-        <w:t xml:space="preserve"> </w:t>
-      </w:r>
-      <w:r>
-        <w:t xml:space="preserve">If that sequence is bounded above,</w:t>
-      </w:r>
-      <w:r>
-        <w:t xml:space="preserve"> </w:t>
-      </w:r>
-      <w:r>
-        <w:t xml:space="preserve">it converges to a finite number</w:t>
+        <w:t xml:space="preserve">Otherwise, the partial sums form a non-decreasing sequence of</w:t>
+      </w:r>
+      <w:r>
+        <w:t xml:space="preserve"> </w:t>
+      </w:r>
+      <w:hyperlink r:id="rId39">
+        <w:r>
+          <w:rPr>
+            <w:rStyle w:val="Hyperlink"/>
+          </w:rPr>
+          <w:t xml:space="preserve">real numbers</w:t>
+        </w:r>
+      </w:hyperlink>
+      <w:r>
+        <w:t xml:space="preserve">.</w:t>
+      </w:r>
+      <w:r>
+        <w:t xml:space="preserve"> </w:t>
+      </w:r>
+      <w:r>
+        <w:t xml:space="preserve">If that sequence is</w:t>
+      </w:r>
+      <w:r>
+        <w:t xml:space="preserve"> </w:t>
+      </w:r>
+      <w:hyperlink r:id="rId40">
+        <w:r>
+          <w:rPr>
+            <w:rStyle w:val="Hyperlink"/>
+          </w:rPr>
+          <w:t xml:space="preserve">bounded above</w:t>
+        </w:r>
+      </w:hyperlink>
+      <w:r>
+        <w:t xml:space="preserve">,</w:t>
+      </w:r>
+      <w:r>
+        <w:t xml:space="preserve"> </w:t>
+      </w:r>
+      <w:r>
+        <w:t xml:space="preserve">it</w:t>
+      </w:r>
+      <w:r>
+        <w:t xml:space="preserve"> </w:t>
+      </w:r>
+      <w:hyperlink r:id="rId37">
+        <w:r>
+          <w:rPr>
+            <w:rStyle w:val="Hyperlink"/>
+          </w:rPr>
+          <w:t xml:space="preserve">converges</w:t>
+        </w:r>
+      </w:hyperlink>
+      <w:r>
+        <w:t xml:space="preserve"> </w:t>
+      </w:r>
+      <w:r>
+        <w:t xml:space="preserve">to a finite number</w:t>
       </w:r>
       <w:r>
         <w:t xml:space="preserve"> </w:t>
@@ -7343,7 +7469,7 @@
       <w:r>
         <w:t xml:space="preserve"> </w:t>
       </w:r>
-      <w:hyperlink r:id="rId34">
+      <w:hyperlink r:id="rId41">
         <w:r>
           <w:rPr>
             <w:rStyle w:val="Hyperlink"/>
@@ -7479,7 +7605,7 @@
         <w:t xml:space="preserve">.</w:t>
       </w:r>
     </w:p>
-    <w:bookmarkStart w:id="35" w:name="rem-countable-additivity-sum-exists"/>
+    <w:bookmarkStart w:id="42" w:name="rem-countable-additivity-sum-exists"/>
     <w:p>
       <w:pPr>
         <w:pStyle w:val="BodyText"/>
@@ -7952,8 +8078,8 @@
         <w:t xml:space="preserve">.</w:t>
       </w:r>
     </w:p>
-    <w:bookmarkEnd w:id="35"/>
-    <w:bookmarkStart w:id="36" w:name="lem-countable-additivity-empty"/>
+    <w:bookmarkEnd w:id="42"/>
+    <w:bookmarkStart w:id="43" w:name="lem-countable-additivity-empty"/>
     <w:p>
       <w:pPr>
         <w:pStyle w:val="BodyText"/>
@@ -8128,7 +8254,7 @@
         <w:t xml:space="preserve">.</w:t>
       </w:r>
     </w:p>
-    <w:bookmarkEnd w:id="36"/>
+    <w:bookmarkEnd w:id="43"/>
     <w:p>
       <w:pPr>
         <w:pStyle w:val="BodyText"/>
@@ -8626,7 +8752,21 @@
         <w:t xml:space="preserve"> </w:t>
       </w:r>
       <w:r>
-        <w:t xml:space="preserve">a contradiction.</w:t>
+        <w:t xml:space="preserve">a</w:t>
+      </w:r>
+      <w:r>
+        <w:t xml:space="preserve"> </w:t>
+      </w:r>
+      <w:hyperlink r:id="rId44">
+        <w:r>
+          <w:rPr>
+            <w:rStyle w:val="Hyperlink"/>
+          </w:rPr>
+          <w:t xml:space="preserve">contradiction</w:t>
+        </w:r>
+      </w:hyperlink>
+      <w:r>
+        <w:t xml:space="preserve">.</w:t>
       </w:r>
       <w:r>
         <w:t xml:space="preserve"> </w:t>
@@ -8681,7 +8821,7 @@
         <w:t xml:space="preserve">.</w:t>
       </w:r>
     </w:p>
-    <w:bookmarkStart w:id="37" w:name="exm-empty-set-zero"/>
+    <w:bookmarkStart w:id="45" w:name="exm-empty-set-zero"/>
     <w:p>
       <w:pPr>
         <w:pStyle w:val="BodyText"/>
@@ -8961,8 +9101,8 @@
         </m:oMath>
       </m:oMathPara>
     </w:p>
-    <w:bookmarkEnd w:id="37"/>
-    <w:bookmarkStart w:id="38" w:name="exm-empty-set-infinity"/>
+    <w:bookmarkEnd w:id="45"/>
+    <w:bookmarkStart w:id="46" w:name="exm-empty-set-infinity"/>
     <w:p>
       <w:pPr>
         <w:pStyle w:val="FirstParagraph"/>
@@ -9113,7 +9253,7 @@
       <w:r>
         <w:t xml:space="preserve">(</w:t>
       </w:r>
-      <w:hyperlink r:id="rId15">
+      <w:hyperlink r:id="rId17">
         <w:r>
           <w:rPr>
             <w:rStyle w:val="Hyperlink"/>
@@ -9724,8 +9864,8 @@
         <w:t xml:space="preserve">.</w:t>
       </w:r>
     </w:p>
-    <w:bookmarkEnd w:id="38"/>
-    <w:bookmarkStart w:id="39" w:name="rem-empty-set-requirement"/>
+    <w:bookmarkEnd w:id="46"/>
+    <w:bookmarkStart w:id="47" w:name="rem-empty-set-requirement"/>
     <w:p>
       <w:pPr>
         <w:pStyle w:val="BodyText"/>
@@ -9886,8 +10026,8 @@
         <w:t xml:space="preserve">is an extra requirement, not a consequence of countable additivity.</w:t>
       </w:r>
     </w:p>
-    <w:bookmarkEnd w:id="39"/>
-    <w:bookmarkStart w:id="40" w:name="thm-countable-implies-finite"/>
+    <w:bookmarkEnd w:id="47"/>
+    <w:bookmarkStart w:id="48" w:name="thm-countable-implies-finite"/>
     <w:p>
       <w:pPr>
         <w:pStyle w:val="BodyText"/>
@@ -10052,7 +10192,7 @@
         <w:t xml:space="preserve">.</w:t>
       </w:r>
     </w:p>
-    <w:bookmarkEnd w:id="40"/>
+    <w:bookmarkEnd w:id="48"/>
     <w:p>
       <w:pPr>
         <w:pStyle w:val="BodyText"/>
@@ -10917,7 +11057,7 @@
         </m:oMath>
       </m:oMathPara>
     </w:p>
-    <w:bookmarkStart w:id="41" w:name="exm-finite-not-countable"/>
+    <w:bookmarkStart w:id="49" w:name="exm-finite-not-countable"/>
     <w:p>
       <w:pPr>
         <w:pStyle w:val="FirstParagraph"/>
@@ -12558,8 +12698,8 @@
         </m:oMath>
       </m:oMathPara>
     </w:p>
-    <w:bookmarkEnd w:id="41"/>
-    <w:bookmarkStart w:id="43" w:name="rem-finite-not-countable-converse"/>
+    <w:bookmarkEnd w:id="49"/>
+    <w:bookmarkStart w:id="52" w:name="rem-finite-not-countable-converse"/>
     <w:p>
       <w:pPr>
         <w:pStyle w:val="FirstParagraph"/>
@@ -12586,7 +12726,24 @@
         <w:t xml:space="preserve"> </w:t>
       </w:r>
       <w:r>
-        <w:t xml:space="preserve">shows that the converse of</w:t>
+        <w:t xml:space="preserve">shows that the</w:t>
+      </w:r>
+      <w:r>
+        <w:t xml:space="preserve"> </w:t>
+      </w:r>
+      <w:hyperlink r:id="rId50">
+        <w:r>
+          <w:rPr>
+            <w:rStyle w:val="Hyperlink"/>
+          </w:rPr>
+          <w:t xml:space="preserve">converse</w:t>
+        </w:r>
+      </w:hyperlink>
+      <w:r>
+        <w:t xml:space="preserve"> </w:t>
+      </w:r>
+      <w:r>
+        <w:t xml:space="preserve">of</w:t>
       </w:r>
       <w:r>
         <w:t xml:space="preserve"> </w:t>
@@ -12664,7 +12821,7 @@
       <w:r>
         <w:t xml:space="preserve"> </w:t>
       </w:r>
-      <w:hyperlink r:id="rId42">
+      <w:hyperlink r:id="rId51">
         <w:r>
           <w:rPr>
             <w:rStyle w:val="Hyperlink"/>
@@ -12803,9 +12960,9 @@
         <w:t xml:space="preserve">is finite.</w:t>
       </w:r>
     </w:p>
-    <w:bookmarkEnd w:id="43"/>
-    <w:bookmarkEnd w:id="44"/>
-    <w:bookmarkStart w:id="53" w:name="measures"/>
+    <w:bookmarkEnd w:id="52"/>
+    <w:bookmarkEnd w:id="53"/>
+    <w:bookmarkStart w:id="64" w:name="measures"/>
     <w:p>
       <w:pPr>
         <w:pStyle w:val="Heading2"/>
@@ -12814,7 +12971,7 @@
         <w:t xml:space="preserve">4 Measures</w:t>
       </w:r>
     </w:p>
-    <w:bookmarkStart w:id="45" w:name="def-measure"/>
+    <w:bookmarkStart w:id="54" w:name="def-measure"/>
     <w:p>
       <w:pPr>
         <w:pStyle w:val="FirstParagraph"/>
@@ -13035,8 +13192,8 @@
         <w:t xml:space="preserve">.</w:t>
       </w:r>
     </w:p>
-    <w:bookmarkEnd w:id="45"/>
-    <w:bookmarkStart w:id="46" w:name="exm-measure"/>
+    <w:bookmarkEnd w:id="54"/>
+    <w:bookmarkStart w:id="55" w:name="exm-measure"/>
     <w:p>
       <w:pPr>
         <w:pStyle w:val="FirstParagraph"/>
@@ -13286,8 +13443,8 @@
         <w:t xml:space="preserve">so it is a measure.</w:t>
       </w:r>
     </w:p>
-    <w:bookmarkEnd w:id="46"/>
-    <w:bookmarkStart w:id="47" w:name="cor-measure-finitely-additive"/>
+    <w:bookmarkEnd w:id="55"/>
+    <w:bookmarkStart w:id="56" w:name="cor-measure-finitely-additive"/>
     <w:p>
       <w:pPr>
         <w:pStyle w:val="BodyText"/>
@@ -13337,7 +13494,7 @@
         <w:t xml:space="preserve">.</w:t>
       </w:r>
     </w:p>
-    <w:bookmarkEnd w:id="47"/>
+    <w:bookmarkEnd w:id="56"/>
     <w:p>
       <w:pPr>
         <w:pStyle w:val="BodyText"/>
@@ -13445,7 +13602,7 @@
         <w:t xml:space="preserve">applies to it.</w:t>
       </w:r>
     </w:p>
-    <w:bookmarkStart w:id="48" w:name="def-counting-measure"/>
+    <w:bookmarkStart w:id="57" w:name="def-counting-measure"/>
     <w:p>
       <w:pPr>
         <w:pStyle w:val="BodyText"/>
@@ -13714,8 +13871,8 @@
         </m:oMath>
       </m:oMathPara>
     </w:p>
-    <w:bookmarkEnd w:id="48"/>
-    <w:bookmarkStart w:id="49" w:name="exm-counting-measure"/>
+    <w:bookmarkEnd w:id="57"/>
+    <w:bookmarkStart w:id="59" w:name="exm-counting-measure"/>
     <w:p>
       <w:pPr>
         <w:pStyle w:val="FirstParagraph"/>
@@ -13745,8 +13902,19 @@
         <w:t xml:space="preserve"> </w:t>
       </w:r>
       <w:r>
-        <w:t xml:space="preserve">on</w:t>
-      </w:r>
+        <w:t xml:space="preserve">on the</w:t>
+      </w:r>
+      <w:r>
+        <w:t xml:space="preserve"> </w:t>
+      </w:r>
+      <w:hyperlink r:id="rId58">
+        <w:r>
+          <w:rPr>
+            <w:rStyle w:val="Hyperlink"/>
+          </w:rPr>
+          <w:t xml:space="preserve">non-negative integers</w:t>
+        </w:r>
+      </w:hyperlink>
       <w:r>
         <w:t xml:space="preserve"> </w:t>
       </w:r>
@@ -14184,8 +14352,8 @@
         <w:t xml:space="preserve">.</w:t>
       </w:r>
     </w:p>
-    <w:bookmarkEnd w:id="49"/>
-    <w:bookmarkStart w:id="52" w:name="rem-measure-size"/>
+    <w:bookmarkEnd w:id="59"/>
+    <w:bookmarkStart w:id="63" w:name="rem-measure-size"/>
     <w:p>
       <w:pPr>
         <w:pStyle w:val="BodyText"/>
@@ -14261,7 +14429,7 @@
       <w:r>
         <w:t xml:space="preserve"> </w:t>
       </w:r>
-      <w:hyperlink r:id="rId50">
+      <w:hyperlink r:id="rId60">
         <w:r>
           <w:rPr>
             <w:rStyle w:val="Hyperlink"/>
@@ -14279,8 +14447,19 @@
         <w:t xml:space="preserve"> </w:t>
       </w:r>
       <w:r>
-        <w:t xml:space="preserve">assigning each interval</w:t>
-      </w:r>
+        <w:t xml:space="preserve">assigning each</w:t>
+      </w:r>
+      <w:r>
+        <w:t xml:space="preserve"> </w:t>
+      </w:r>
+      <w:hyperlink r:id="rId61">
+        <w:r>
+          <w:rPr>
+            <w:rStyle w:val="Hyperlink"/>
+          </w:rPr>
+          <w:t xml:space="preserve">interval</w:t>
+        </w:r>
+      </w:hyperlink>
       <w:r>
         <w:t xml:space="preserve"> </w:t>
       </w:r>
@@ -14549,7 +14728,7 @@
       <w:r>
         <w:t xml:space="preserve"> </w:t>
       </w:r>
-      <w:hyperlink r:id="rId51">
+      <w:hyperlink r:id="rId62">
         <w:r>
           <w:rPr>
             <w:rStyle w:val="Hyperlink"/>
@@ -14561,9 +14740,9 @@
         <w:t xml:space="preserve">.</w:t>
       </w:r>
     </w:p>
-    <w:bookmarkEnd w:id="52"/>
-    <w:bookmarkEnd w:id="53"/>
-    <w:bookmarkStart w:id="54" w:name="sec-further-reading"/>
+    <w:bookmarkEnd w:id="63"/>
+    <w:bookmarkEnd w:id="64"/>
+    <w:bookmarkStart w:id="65" w:name="sec-further-reading"/>
     <w:p>
       <w:pPr>
         <w:pStyle w:val="Heading2"/>
@@ -14666,8 +14845,8 @@
         <w:t xml:space="preserve">that opens with a chapter on introductory measure theory.</w:t>
       </w:r>
     </w:p>
-    <w:bookmarkEnd w:id="54"/>
-    <w:bookmarkStart w:id="61" w:name="references"/>
+    <w:bookmarkEnd w:id="65"/>
+    <w:bookmarkStart w:id="72" w:name="references"/>
     <w:p>
       <w:pPr>
         <w:pStyle w:val="Heading2"/>
@@ -14676,8 +14855,8 @@
         <w:t xml:space="preserve">References</w:t>
       </w:r>
     </w:p>
-    <w:bookmarkStart w:id="60" w:name="refs"/>
-    <w:bookmarkStart w:id="55" w:name="ref-billingsley1995probability"/>
+    <w:bookmarkStart w:id="71" w:name="refs"/>
+    <w:bookmarkStart w:id="66" w:name="ref-billingsley1995probability"/>
     <w:p>
       <w:pPr>
         <w:pStyle w:val="Bibliography"/>
@@ -14699,8 +14878,8 @@
         <w:t xml:space="preserve">. 3rd ed. Wiley Series in Probability and Mathematical Statistics. Wiley.</w:t>
       </w:r>
     </w:p>
-    <w:bookmarkEnd w:id="55"/>
-    <w:bookmarkStart w:id="57" w:name="ref-folland1999real"/>
+    <w:bookmarkEnd w:id="66"/>
+    <w:bookmarkStart w:id="68" w:name="ref-folland1999real"/>
     <w:p>
       <w:pPr>
         <w:pStyle w:val="Bibliography"/>
@@ -14724,7 +14903,7 @@
       <w:r>
         <w:t xml:space="preserve"> </w:t>
       </w:r>
-      <w:hyperlink r:id="rId56">
+      <w:hyperlink r:id="rId67">
         <w:r>
           <w:rPr>
             <w:rStyle w:val="Hyperlink"/>
@@ -14736,8 +14915,8 @@
         <w:t xml:space="preserve">.</w:t>
       </w:r>
     </w:p>
-    <w:bookmarkEnd w:id="57"/>
-    <w:bookmarkStart w:id="59" w:name="ref-gut2013"/>
+    <w:bookmarkEnd w:id="68"/>
+    <w:bookmarkStart w:id="70" w:name="ref-gut2013"/>
     <w:p>
       <w:pPr>
         <w:pStyle w:val="Bibliography"/>
@@ -14761,7 +14940,7 @@
       <w:r>
         <w:t xml:space="preserve"> </w:t>
       </w:r>
-      <w:hyperlink r:id="rId58">
+      <w:hyperlink r:id="rId69">
         <w:r>
           <w:rPr>
             <w:rStyle w:val="Hyperlink"/>
@@ -14773,9 +14952,9 @@
         <w:t xml:space="preserve">.</w:t>
       </w:r>
     </w:p>
-    <w:bookmarkEnd w:id="59"/>
-    <w:bookmarkEnd w:id="60"/>
-    <w:bookmarkEnd w:id="61"/>
+    <w:bookmarkEnd w:id="70"/>
+    <w:bookmarkEnd w:id="71"/>
+    <w:bookmarkEnd w:id="72"/>
     <w:sectPr>
       <w:footnotePr>
         <w:numRestart w:val="eachSect"/>

</xml_diff>

<commit_message>
Deploying to gh-pages from @ Morrison-Lab/mds@6d7592fac0f2f5e56ad019403b99af7eb03149f7 🚀
</commit_message>
<xml_diff>
--- a/measures.docx
+++ b/measures.docx
@@ -15,7 +15,7 @@
         <w:pStyle w:val="Date"/>
       </w:pPr>
       <w:r>
-        <w:t xml:space="preserve">Last modified: 2026-10-05 23:57:28 (PDT)</w:t>
+        <w:t xml:space="preserve">Last modified: 2026-10-06 00:34:40 (PDT)</w:t>
       </w:r>
     </w:p>
     <w:p>
@@ -31139,7 +31139,7 @@
         <w:t xml:space="preserve"> </w:t>
       </w:r>
       <w:r>
-        <w:t xml:space="preserve">(Billingsley 1995, sec. 13)</w:t>
+        <w:t xml:space="preserve">(Billingsley 1995, Theorem 13.3)</w:t>
       </w:r>
       <w:r>
         <w:t xml:space="preserve">.)</w:t>
@@ -34486,7 +34486,7 @@
         <w:t xml:space="preserve"> </w:t>
       </w:r>
       <w:r>
-        <w:t xml:space="preserve">(Billingsley 1995, sec. 18)</w:t>
+        <w:t xml:space="preserve">(Billingsley 1995, Theorem 18.2)</w:t>
       </w:r>
       <w:r>
         <w:t xml:space="preserve">.</w:t>

</xml_diff>

<commit_message>
Deploying to gh-pages from @ Morrison-Lab/mds@bed598f21cfbd655f8018ec1390dc9de5810bdd1 🚀
</commit_message>
<xml_diff>
--- a/measures.docx
+++ b/measures.docx
@@ -15,7 +15,7 @@
         <w:pStyle w:val="Date"/>
       </w:pPr>
       <w:r>
-        <w:t xml:space="preserve">Last modified: 2026-10-06 11:54:10 (PDT)</w:t>
+        <w:t xml:space="preserve">Last modified: 2026-10-06 14:39:34 (PDT)</w:t>
       </w:r>
     </w:p>
     <w:p>
@@ -106,7 +106,7 @@
           <w:rPr>
             <w:rStyle w:val="Hyperlink"/>
           </w:rPr>
-          <w:t xml:space="preserve">Definition 18</w:t>
+          <w:t xml:space="preserve">Definition 19</w:t>
         </w:r>
       </w:hyperlink>
       <w:r>
@@ -18215,7 +18215,7 @@
     </w:p>
     <w:bookmarkEnd w:id="73"/>
     <w:bookmarkEnd w:id="74"/>
-    <w:bookmarkStart w:id="95" w:name="measures"/>
+    <w:bookmarkStart w:id="97" w:name="measures"/>
     <w:p>
       <w:pPr>
         <w:pStyle w:val="Heading2"/>
@@ -19606,7 +19606,7 @@
       </w:r>
     </w:p>
     <w:bookmarkEnd w:id="80"/>
-    <w:bookmarkStart w:id="81" w:name="def-measure-space"/>
+    <w:bookmarkStart w:id="81" w:name="def-measurable-space"/>
     <w:p>
       <w:pPr>
         <w:pStyle w:val="BodyText"/>
@@ -19616,7 +19616,7 @@
           <w:b/>
           <w:bCs/>
         </w:rPr>
-        <w:t xml:space="preserve">Definition 13 (Measurable space and measure space)</w:t>
+        <w:t xml:space="preserve">Definition 13 (Measurable space)</w:t>
       </w:r>
       <w:r>
         <w:t xml:space="preserve"> </w:t>
@@ -19769,123 +19769,19 @@
       <w:r>
         <w:t xml:space="preserve">.</w:t>
       </w:r>
-      <w:r>
-        <w:t xml:space="preserve"> </w:t>
-      </w:r>
-      <w:r>
-        <w:t xml:space="preserve">A</w:t>
-      </w:r>
-      <w:r>
-        <w:t xml:space="preserve"> </w:t>
-      </w:r>
+    </w:p>
+    <w:bookmarkEnd w:id="81"/>
+    <w:bookmarkStart w:id="82" w:name="exm-measurable-space"/>
+    <w:p>
+      <w:pPr>
+        <w:pStyle w:val="BodyText"/>
+      </w:pPr>
       <w:r>
         <w:rPr>
           <w:b/>
           <w:bCs/>
         </w:rPr>
-        <w:t xml:space="preserve">measure space</w:t>
-      </w:r>
-      <w:r>
-        <w:t xml:space="preserve"> </w:t>
-      </w:r>
-      <m:oMath>
-        <m:r>
-          <m:rPr>
-            <m:sty m:val="p"/>
-          </m:rPr>
-          <m:t>(</m:t>
-        </m:r>
-        <m:r>
-          <m:t>S</m:t>
-        </m:r>
-        <m:r>
-          <m:rPr>
-            <m:sty m:val="p"/>
-          </m:rPr>
-          <m:t>,</m:t>
-        </m:r>
-        <m:r>
-          <m:rPr>
-            <m:scr m:val="script"/>
-            <m:sty m:val="p"/>
-          </m:rPr>
-          <m:t>S</m:t>
-        </m:r>
-        <m:r>
-          <m:rPr>
-            <m:sty m:val="p"/>
-          </m:rPr>
-          <m:t>,</m:t>
-        </m:r>
-        <m:r>
-          <m:t>μ</m:t>
-        </m:r>
-        <m:r>
-          <m:rPr>
-            <m:sty m:val="p"/>
-          </m:rPr>
-          <m:t>)</m:t>
-        </m:r>
-      </m:oMath>
-      <w:r>
-        <w:t xml:space="preserve"> </w:t>
-      </w:r>
-      <w:r>
-        <w:t xml:space="preserve">is a measurable space together with a</w:t>
-      </w:r>
-      <w:r>
-        <w:t xml:space="preserve"> </w:t>
-      </w:r>
-      <w:hyperlink w:anchor="def-measure">
-        <w:r>
-          <w:rPr>
-            <w:rStyle w:val="Hyperlink"/>
-          </w:rPr>
-          <w:t xml:space="preserve">measure</w:t>
-        </w:r>
-      </w:hyperlink>
-      <w:r>
-        <w:t xml:space="preserve"> </w:t>
-      </w:r>
-      <m:oMath>
-        <m:r>
-          <m:t>μ</m:t>
-        </m:r>
-      </m:oMath>
-      <w:r>
-        <w:t xml:space="preserve"> </w:t>
-      </w:r>
-      <w:r>
-        <w:t xml:space="preserve">on</w:t>
-      </w:r>
-      <w:r>
-        <w:t xml:space="preserve"> </w:t>
-      </w:r>
-      <m:oMath>
-        <m:r>
-          <m:rPr>
-            <m:scr m:val="script"/>
-            <m:sty m:val="p"/>
-          </m:rPr>
-          <m:t>S</m:t>
-        </m:r>
-      </m:oMath>
-      <w:r>
-        <w:t xml:space="preserve">.</w:t>
-      </w:r>
-    </w:p>
-    <w:bookmarkEnd w:id="81"/>
-    <w:bookmarkStart w:id="82" w:name="exm-measure-space"/>
-    <w:p>
-      <w:pPr>
-        <w:pStyle w:val="BodyText"/>
-      </w:pPr>
-      <w:r>
-        <w:rPr>
-          <w:b/>
-          <w:bCs/>
-        </w:rPr>
-        <w:t xml:space="preserve">Example 18 (Measure spaces of die rolls)</w:t>
+        <w:t xml:space="preserve">Example 18 (Measurable spaces of die rolls)</w:t>
       </w:r>
       <w:r>
         <w:t xml:space="preserve"> </w:t>
@@ -20060,132 +19956,7 @@
         </w:r>
       </w:hyperlink>
       <w:r>
-        <w:t xml:space="preserve">),</w:t>
-      </w:r>
-      <w:r>
-        <w:t xml:space="preserve"> </w:t>
-      </w:r>
-      <w:r>
-        <w:t xml:space="preserve">and adding the counting function</w:t>
-      </w:r>
-      <w:r>
-        <w:t xml:space="preserve"> </w:t>
-      </w:r>
-      <m:oMath>
-        <m:r>
-          <m:t>μ</m:t>
-        </m:r>
-        <m:r>
-          <m:rPr>
-            <m:sty m:val="p"/>
-          </m:rPr>
-          <m:t>(</m:t>
-        </m:r>
-        <m:r>
-          <m:t>A</m:t>
-        </m:r>
-        <m:r>
-          <m:rPr>
-            <m:sty m:val="p"/>
-          </m:rPr>
-          <m:t>)</m:t>
-        </m:r>
-        <m:r>
-          <m:rPr>
-            <m:sty m:val="p"/>
-          </m:rPr>
-          <m:t>=</m:t>
-        </m:r>
-        <m:r>
-          <m:t>​</m:t>
-        </m:r>
-        <m:d>
-          <m:dPr>
-            <m:begChr m:val="|"/>
-            <m:sepChr m:val=""/>
-            <m:endChr m:val="|"/>
-            <m:grow/>
-          </m:dPr>
-          <m:e>
-            <m:r>
-              <m:t>A</m:t>
-            </m:r>
-          </m:e>
-        </m:d>
-        <m:r>
-          <m:t>​</m:t>
-        </m:r>
-      </m:oMath>
-      <w:r>
-        <w:t xml:space="preserve"> </w:t>
-      </w:r>
-      <w:r>
-        <w:t xml:space="preserve">of</w:t>
-      </w:r>
-      <w:r>
-        <w:t xml:space="preserve"> </w:t>
-      </w:r>
-      <w:hyperlink w:anchor="exm-measure">
-        <w:r>
-          <w:rPr>
-            <w:rStyle w:val="Hyperlink"/>
-          </w:rPr>
-          <w:t xml:space="preserve">Example 16</w:t>
-        </w:r>
-      </w:hyperlink>
-      <w:r>
-        <w:t xml:space="preserve"> </w:t>
-      </w:r>
-      <w:r>
-        <w:t xml:space="preserve">makes</w:t>
-      </w:r>
-      <w:r>
-        <w:t xml:space="preserve"> </w:t>
-      </w:r>
-      <m:oMath>
-        <m:r>
-          <m:rPr>
-            <m:sty m:val="p"/>
-          </m:rPr>
-          <m:t>(</m:t>
-        </m:r>
-        <m:r>
-          <m:t>D</m:t>
-        </m:r>
-        <m:r>
-          <m:rPr>
-            <m:sty m:val="p"/>
-          </m:rPr>
-          <m:t>,</m:t>
-        </m:r>
-        <m:r>
-          <m:rPr>
-            <m:scr m:val="script"/>
-            <m:sty m:val="p"/>
-          </m:rPr>
-          <m:t>S</m:t>
-        </m:r>
-        <m:r>
-          <m:rPr>
-            <m:sty m:val="p"/>
-          </m:rPr>
-          <m:t>,</m:t>
-        </m:r>
-        <m:r>
-          <m:t>μ</m:t>
-        </m:r>
-        <m:r>
-          <m:rPr>
-            <m:sty m:val="p"/>
-          </m:rPr>
-          <m:t>)</m:t>
-        </m:r>
-      </m:oMath>
-      <w:r>
-        <w:t xml:space="preserve"> </w:t>
-      </w:r>
-      <w:r>
-        <w:t xml:space="preserve">a measure space.</w:t>
+        <w:t xml:space="preserve">).</w:t>
       </w:r>
     </w:p>
     <w:p>
@@ -20386,7 +20157,7 @@
       </w:r>
     </w:p>
     <w:bookmarkEnd w:id="82"/>
-    <w:bookmarkStart w:id="83" w:name="def-lebesgue-measure"/>
+    <w:bookmarkStart w:id="83" w:name="def-measure-space"/>
     <w:p>
       <w:pPr>
         <w:pStyle w:val="FirstParagraph"/>
@@ -20396,7 +20167,435 @@
           <w:b/>
           <w:bCs/>
         </w:rPr>
-        <w:t xml:space="preserve">Definition 14 (Lebesgue measure)</w:t>
+        <w:t xml:space="preserve">Definition 14 (Measure space)</w:t>
+      </w:r>
+      <w:r>
+        <w:t xml:space="preserve"> </w:t>
+      </w:r>
+      <w:r>
+        <w:t xml:space="preserve">A</w:t>
+      </w:r>
+      <w:r>
+        <w:t xml:space="preserve"> </w:t>
+      </w:r>
+      <w:r>
+        <w:rPr>
+          <w:b/>
+          <w:bCs/>
+        </w:rPr>
+        <w:t xml:space="preserve">measure space</w:t>
+      </w:r>
+      <w:r>
+        <w:t xml:space="preserve"> </w:t>
+      </w:r>
+      <m:oMath>
+        <m:r>
+          <m:rPr>
+            <m:sty m:val="p"/>
+          </m:rPr>
+          <m:t>(</m:t>
+        </m:r>
+        <m:r>
+          <m:t>S</m:t>
+        </m:r>
+        <m:r>
+          <m:rPr>
+            <m:sty m:val="p"/>
+          </m:rPr>
+          <m:t>,</m:t>
+        </m:r>
+        <m:r>
+          <m:rPr>
+            <m:scr m:val="script"/>
+            <m:sty m:val="p"/>
+          </m:rPr>
+          <m:t>S</m:t>
+        </m:r>
+        <m:r>
+          <m:rPr>
+            <m:sty m:val="p"/>
+          </m:rPr>
+          <m:t>,</m:t>
+        </m:r>
+        <m:r>
+          <m:t>μ</m:t>
+        </m:r>
+        <m:r>
+          <m:rPr>
+            <m:sty m:val="p"/>
+          </m:rPr>
+          <m:t>)</m:t>
+        </m:r>
+      </m:oMath>
+      <w:r>
+        <w:t xml:space="preserve"> </w:t>
+      </w:r>
+      <w:r>
+        <w:t xml:space="preserve">is a</w:t>
+      </w:r>
+      <w:r>
+        <w:t xml:space="preserve"> </w:t>
+      </w:r>
+      <w:hyperlink w:anchor="def-measurable-space">
+        <w:r>
+          <w:rPr>
+            <w:rStyle w:val="Hyperlink"/>
+          </w:rPr>
+          <w:t xml:space="preserve">measurable space</w:t>
+        </w:r>
+      </w:hyperlink>
+      <w:r>
+        <w:t xml:space="preserve"> </w:t>
+      </w:r>
+      <w:r>
+        <w:t xml:space="preserve">together with a</w:t>
+      </w:r>
+      <w:r>
+        <w:t xml:space="preserve"> </w:t>
+      </w:r>
+      <w:hyperlink w:anchor="def-measure">
+        <w:r>
+          <w:rPr>
+            <w:rStyle w:val="Hyperlink"/>
+          </w:rPr>
+          <w:t xml:space="preserve">measure</w:t>
+        </w:r>
+      </w:hyperlink>
+      <w:r>
+        <w:t xml:space="preserve"> </w:t>
+      </w:r>
+      <m:oMath>
+        <m:r>
+          <m:t>μ</m:t>
+        </m:r>
+      </m:oMath>
+      <w:r>
+        <w:t xml:space="preserve"> </w:t>
+      </w:r>
+      <w:r>
+        <w:t xml:space="preserve">on</w:t>
+      </w:r>
+      <w:r>
+        <w:t xml:space="preserve"> </w:t>
+      </w:r>
+      <m:oMath>
+        <m:r>
+          <m:rPr>
+            <m:scr m:val="script"/>
+            <m:sty m:val="p"/>
+          </m:rPr>
+          <m:t>S</m:t>
+        </m:r>
+      </m:oMath>
+      <w:r>
+        <w:t xml:space="preserve">.</w:t>
+      </w:r>
+    </w:p>
+    <w:bookmarkEnd w:id="83"/>
+    <w:bookmarkStart w:id="84" w:name="exm-measure-space"/>
+    <w:p>
+      <w:pPr>
+        <w:pStyle w:val="BodyText"/>
+      </w:pPr>
+      <w:r>
+        <w:rPr>
+          <w:b/>
+          <w:bCs/>
+        </w:rPr>
+        <w:t xml:space="preserve">Example 19 (Measure space of die rolls)</w:t>
+      </w:r>
+      <w:r>
+        <w:t xml:space="preserve"> </w:t>
+      </w:r>
+      <w:r>
+        <w:t xml:space="preserve">For the die rolls</w:t>
+      </w:r>
+      <w:r>
+        <w:t xml:space="preserve"> </w:t>
+      </w:r>
+      <m:oMath>
+        <m:r>
+          <m:t>D</m:t>
+        </m:r>
+        <m:r>
+          <m:rPr>
+            <m:sty m:val="p"/>
+          </m:rPr>
+          <m:t>=</m:t>
+        </m:r>
+        <m:r>
+          <m:t>​</m:t>
+        </m:r>
+        <m:d>
+          <m:dPr>
+            <m:begChr m:val="{"/>
+            <m:sepChr m:val=""/>
+            <m:endChr m:val="}"/>
+            <m:grow/>
+          </m:dPr>
+          <m:e>
+            <m:r>
+              <m:t>1</m:t>
+            </m:r>
+            <m:r>
+              <m:rPr>
+                <m:sty m:val="p"/>
+              </m:rPr>
+              <m:t>,</m:t>
+            </m:r>
+            <m:r>
+              <m:t>2</m:t>
+            </m:r>
+            <m:r>
+              <m:rPr>
+                <m:sty m:val="p"/>
+              </m:rPr>
+              <m:t>,</m:t>
+            </m:r>
+            <m:r>
+              <m:t>3</m:t>
+            </m:r>
+            <m:r>
+              <m:rPr>
+                <m:sty m:val="p"/>
+              </m:rPr>
+              <m:t>,</m:t>
+            </m:r>
+            <m:r>
+              <m:t>4</m:t>
+            </m:r>
+            <m:r>
+              <m:rPr>
+                <m:sty m:val="p"/>
+              </m:rPr>
+              <m:t>,</m:t>
+            </m:r>
+            <m:r>
+              <m:t>5</m:t>
+            </m:r>
+            <m:r>
+              <m:rPr>
+                <m:sty m:val="p"/>
+              </m:rPr>
+              <m:t>,</m:t>
+            </m:r>
+            <m:r>
+              <m:t>6</m:t>
+            </m:r>
+          </m:e>
+        </m:d>
+        <m:r>
+          <m:t>​</m:t>
+        </m:r>
+      </m:oMath>
+      <w:r>
+        <w:t xml:space="preserve">,</w:t>
+      </w:r>
+      <w:r>
+        <w:t xml:space="preserve"> </w:t>
+      </w:r>
+      <w:r>
+        <w:t xml:space="preserve">adding the counting function</w:t>
+      </w:r>
+      <w:r>
+        <w:t xml:space="preserve"> </w:t>
+      </w:r>
+      <m:oMath>
+        <m:r>
+          <m:t>μ</m:t>
+        </m:r>
+        <m:r>
+          <m:rPr>
+            <m:sty m:val="p"/>
+          </m:rPr>
+          <m:t>(</m:t>
+        </m:r>
+        <m:r>
+          <m:t>A</m:t>
+        </m:r>
+        <m:r>
+          <m:rPr>
+            <m:sty m:val="p"/>
+          </m:rPr>
+          <m:t>)</m:t>
+        </m:r>
+        <m:r>
+          <m:rPr>
+            <m:sty m:val="p"/>
+          </m:rPr>
+          <m:t>=</m:t>
+        </m:r>
+        <m:r>
+          <m:t>​</m:t>
+        </m:r>
+        <m:d>
+          <m:dPr>
+            <m:begChr m:val="|"/>
+            <m:sepChr m:val=""/>
+            <m:endChr m:val="|"/>
+            <m:grow/>
+          </m:dPr>
+          <m:e>
+            <m:r>
+              <m:t>A</m:t>
+            </m:r>
+          </m:e>
+        </m:d>
+        <m:r>
+          <m:t>​</m:t>
+        </m:r>
+      </m:oMath>
+      <w:r>
+        <w:t xml:space="preserve"> </w:t>
+      </w:r>
+      <w:r>
+        <w:t xml:space="preserve">of</w:t>
+      </w:r>
+      <w:r>
+        <w:t xml:space="preserve"> </w:t>
+      </w:r>
+      <w:hyperlink w:anchor="exm-measure">
+        <w:r>
+          <w:rPr>
+            <w:rStyle w:val="Hyperlink"/>
+          </w:rPr>
+          <w:t xml:space="preserve">Example 16</w:t>
+        </w:r>
+      </w:hyperlink>
+      <w:r>
+        <w:t xml:space="preserve"> </w:t>
+      </w:r>
+      <w:r>
+        <w:t xml:space="preserve">to the</w:t>
+      </w:r>
+      <w:r>
+        <w:t xml:space="preserve"> </w:t>
+      </w:r>
+      <w:hyperlink w:anchor="def-measurable-space">
+        <w:r>
+          <w:rPr>
+            <w:rStyle w:val="Hyperlink"/>
+          </w:rPr>
+          <w:t xml:space="preserve">measurable space</w:t>
+        </w:r>
+      </w:hyperlink>
+      <w:r>
+        <w:t xml:space="preserve"> </w:t>
+      </w:r>
+      <m:oMath>
+        <m:r>
+          <m:rPr>
+            <m:sty m:val="p"/>
+          </m:rPr>
+          <m:t>(</m:t>
+        </m:r>
+        <m:r>
+          <m:t>D</m:t>
+        </m:r>
+        <m:r>
+          <m:rPr>
+            <m:sty m:val="p"/>
+          </m:rPr>
+          <m:t>,</m:t>
+        </m:r>
+        <m:r>
+          <m:rPr>
+            <m:scr m:val="script"/>
+            <m:sty m:val="p"/>
+          </m:rPr>
+          <m:t>S</m:t>
+        </m:r>
+        <m:r>
+          <m:rPr>
+            <m:sty m:val="p"/>
+          </m:rPr>
+          <m:t>)</m:t>
+        </m:r>
+      </m:oMath>
+      <w:r>
+        <w:t xml:space="preserve"> </w:t>
+      </w:r>
+      <w:r>
+        <w:t xml:space="preserve">of</w:t>
+      </w:r>
+      <w:r>
+        <w:t xml:space="preserve"> </w:t>
+      </w:r>
+      <w:hyperlink w:anchor="exm-measurable-space">
+        <w:r>
+          <w:rPr>
+            <w:rStyle w:val="Hyperlink"/>
+          </w:rPr>
+          <w:t xml:space="preserve">Example 18</w:t>
+        </w:r>
+      </w:hyperlink>
+      <w:r>
+        <w:t xml:space="preserve"> </w:t>
+      </w:r>
+      <w:r>
+        <w:t xml:space="preserve">makes</w:t>
+      </w:r>
+      <w:r>
+        <w:t xml:space="preserve"> </w:t>
+      </w:r>
+      <m:oMath>
+        <m:r>
+          <m:rPr>
+            <m:sty m:val="p"/>
+          </m:rPr>
+          <m:t>(</m:t>
+        </m:r>
+        <m:r>
+          <m:t>D</m:t>
+        </m:r>
+        <m:r>
+          <m:rPr>
+            <m:sty m:val="p"/>
+          </m:rPr>
+          <m:t>,</m:t>
+        </m:r>
+        <m:r>
+          <m:rPr>
+            <m:scr m:val="script"/>
+            <m:sty m:val="p"/>
+          </m:rPr>
+          <m:t>S</m:t>
+        </m:r>
+        <m:r>
+          <m:rPr>
+            <m:sty m:val="p"/>
+          </m:rPr>
+          <m:t>,</m:t>
+        </m:r>
+        <m:r>
+          <m:t>μ</m:t>
+        </m:r>
+        <m:r>
+          <m:rPr>
+            <m:sty m:val="p"/>
+          </m:rPr>
+          <m:t>)</m:t>
+        </m:r>
+      </m:oMath>
+      <w:r>
+        <w:t xml:space="preserve"> </w:t>
+      </w:r>
+      <w:r>
+        <w:t xml:space="preserve">a measure space.</w:t>
+      </w:r>
+    </w:p>
+    <w:bookmarkEnd w:id="84"/>
+    <w:bookmarkStart w:id="85" w:name="def-lebesgue-measure"/>
+    <w:p>
+      <w:pPr>
+        <w:pStyle w:val="BodyText"/>
+      </w:pPr>
+      <w:r>
+        <w:rPr>
+          <w:b/>
+          <w:bCs/>
+        </w:rPr>
+        <w:t xml:space="preserve">Definition 15 (Lebesgue measure)</w:t>
       </w:r>
       <w:r>
         <w:t xml:space="preserve"> </w:t>
@@ -20929,8 +21128,8 @@
         <w:t xml:space="preserve">.</w:t>
       </w:r>
     </w:p>
-    <w:bookmarkEnd w:id="83"/>
-    <w:bookmarkStart w:id="85" w:name="rem-lebesgue-measure-exists"/>
+    <w:bookmarkEnd w:id="85"/>
+    <w:bookmarkStart w:id="87" w:name="rem-lebesgue-measure-exists"/>
     <w:p>
       <w:pPr>
         <w:pStyle w:val="BodyText"/>
@@ -20981,7 +21180,7 @@
       <w:r>
         <w:t xml:space="preserve"> </w:t>
       </w:r>
-      <w:hyperlink r:id="rId84">
+      <w:hyperlink r:id="rId86">
         <w:r>
           <w:rPr>
             <w:rStyle w:val="Hyperlink"/>
@@ -21030,8 +21229,8 @@
         <w:t xml:space="preserve">the Lebesgue-measurable sets, with the same values on Borel sets).</w:t>
       </w:r>
     </w:p>
-    <w:bookmarkEnd w:id="85"/>
-    <w:bookmarkStart w:id="86" w:name="exm-lebesgue-measure"/>
+    <w:bookmarkEnd w:id="87"/>
+    <w:bookmarkStart w:id="88" w:name="exm-lebesgue-measure"/>
     <w:p>
       <w:pPr>
         <w:pStyle w:val="BodyText"/>
@@ -21041,7 +21240,7 @@
           <w:b/>
           <w:bCs/>
         </w:rPr>
-        <w:t xml:space="preserve">Example 19 (Lengths of some Borel sets)</w:t>
+        <w:t xml:space="preserve">Example 20 (Lengths of some Borel sets)</w:t>
       </w:r>
       <w:r>
         <w:t xml:space="preserve"> </w:t>
@@ -21764,8 +21963,8 @@
         <w:t xml:space="preserve">.</w:t>
       </w:r>
     </w:p>
-    <w:bookmarkEnd w:id="86"/>
-    <w:bookmarkStart w:id="88" w:name="rem-measure-size"/>
+    <w:bookmarkEnd w:id="88"/>
+    <w:bookmarkStart w:id="90" w:name="rem-measure-size"/>
     <w:p>
       <w:pPr>
         <w:pStyle w:val="FirstParagraph"/>
@@ -21843,7 +22042,7 @@
           <w:rPr>
             <w:rStyle w:val="Hyperlink"/>
           </w:rPr>
-          <w:t xml:space="preserve">Definition 14</w:t>
+          <w:t xml:space="preserve">Definition 15</w:t>
         </w:r>
       </w:hyperlink>
       <w:r>
@@ -22180,7 +22379,7 @@
       <w:r>
         <w:t xml:space="preserve"> </w:t>
       </w:r>
-      <w:hyperlink r:id="rId87">
+      <w:hyperlink r:id="rId89">
         <w:r>
           <w:rPr>
             <w:rStyle w:val="Hyperlink"/>
@@ -22192,8 +22391,8 @@
         <w:t xml:space="preserve">.</w:t>
       </w:r>
     </w:p>
-    <w:bookmarkEnd w:id="88"/>
-    <w:bookmarkStart w:id="89" w:name="def-measure-zero"/>
+    <w:bookmarkEnd w:id="90"/>
+    <w:bookmarkStart w:id="91" w:name="def-measure-zero"/>
     <w:p>
       <w:pPr>
         <w:pStyle w:val="BodyText"/>
@@ -22203,7 +22402,7 @@
           <w:b/>
           <w:bCs/>
         </w:rPr>
-        <w:t xml:space="preserve">Definition 15 (Measure zero)</w:t>
+        <w:t xml:space="preserve">Definition 16 (Measure zero)</w:t>
       </w:r>
       <w:r>
         <w:t xml:space="preserve"> </w:t>
@@ -22391,8 +22590,8 @@
         <w:t xml:space="preserve">.</w:t>
       </w:r>
     </w:p>
-    <w:bookmarkEnd w:id="89"/>
-    <w:bookmarkStart w:id="90" w:name="exm-measure-zero"/>
+    <w:bookmarkEnd w:id="91"/>
+    <w:bookmarkStart w:id="92" w:name="exm-measure-zero"/>
     <w:p>
       <w:pPr>
         <w:pStyle w:val="BodyText"/>
@@ -22402,7 +22601,7 @@
           <w:b/>
           <w:bCs/>
         </w:rPr>
-        <w:t xml:space="preserve">Example 20 (Sets of measure zero)</w:t>
+        <w:t xml:space="preserve">Example 21 (Sets of measure zero)</w:t>
       </w:r>
       <w:r>
         <w:t xml:space="preserve"> </w:t>
@@ -22553,7 +22752,7 @@
           <w:rPr>
             <w:rStyle w:val="Hyperlink"/>
           </w:rPr>
-          <w:t xml:space="preserve">Example 19</w:t>
+          <w:t xml:space="preserve">Example 20</w:t>
         </w:r>
       </w:hyperlink>
       <w:r>
@@ -22566,8 +22765,8 @@
         <w:t xml:space="preserve">although neither set is empty.</w:t>
       </w:r>
     </w:p>
-    <w:bookmarkEnd w:id="90"/>
-    <w:bookmarkStart w:id="91" w:name="def-almost-everywhere"/>
+    <w:bookmarkEnd w:id="92"/>
+    <w:bookmarkStart w:id="93" w:name="def-almost-everywhere"/>
     <w:p>
       <w:pPr>
         <w:pStyle w:val="FirstParagraph"/>
@@ -22577,7 +22776,7 @@
           <w:b/>
           <w:bCs/>
         </w:rPr>
-        <w:t xml:space="preserve">Definition 16 (Almost everywhere)</w:t>
+        <w:t xml:space="preserve">Definition 17 (Almost everywhere)</w:t>
       </w:r>
       <w:r>
         <w:t xml:space="preserve"> </w:t>
@@ -22786,8 +22985,8 @@
         <w:t xml:space="preserve">.</w:t>
       </w:r>
     </w:p>
-    <w:bookmarkEnd w:id="91"/>
-    <w:bookmarkStart w:id="92" w:name="exm-almost-everywhere"/>
+    <w:bookmarkEnd w:id="93"/>
+    <w:bookmarkStart w:id="94" w:name="exm-almost-everywhere"/>
     <w:p>
       <w:pPr>
         <w:pStyle w:val="BodyText"/>
@@ -22797,7 +22996,7 @@
           <w:b/>
           <w:bCs/>
         </w:rPr>
-        <w:t xml:space="preserve">Example 21 (Non-negative except on the integers)</w:t>
+        <w:t xml:space="preserve">Example 22 (Non-negative except on the integers)</w:t>
       </w:r>
       <w:r>
         <w:t xml:space="preserve"> </w:t>
@@ -23079,88 +23278,6 @@
         <w:t xml:space="preserve">(</w:t>
       </w:r>
       <w:hyperlink w:anchor="exm-lebesgue-measure">
-        <w:r>
-          <w:rPr>
-            <w:rStyle w:val="Hyperlink"/>
-          </w:rPr>
-          <w:t xml:space="preserve">Example 19</w:t>
-        </w:r>
-      </w:hyperlink>
-      <w:r>
-        <w:t xml:space="preserve">),</w:t>
-      </w:r>
-      <w:r>
-        <w:t xml:space="preserve"> </w:t>
-      </w:r>
-      <w:r>
-        <w:t xml:space="preserve">so</w:t>
-      </w:r>
-      <w:r>
-        <w:t xml:space="preserve"> </w:t>
-      </w:r>
-      <m:oMath>
-        <m:r>
-          <m:t>g</m:t>
-        </m:r>
-        <m:r>
-          <m:rPr>
-            <m:sty m:val="p"/>
-          </m:rPr>
-          <m:t>≥</m:t>
-        </m:r>
-        <m:r>
-          <m:t>0</m:t>
-        </m:r>
-      </m:oMath>
-      <w:r>
-        <w:t xml:space="preserve"> </w:t>
-      </w:r>
-      <w:r>
-        <w:t xml:space="preserve">holds</w:t>
-      </w:r>
-      <w:r>
-        <w:t xml:space="preserve"> </w:t>
-      </w:r>
-      <m:oMath>
-        <m:r>
-          <m:t>λ</m:t>
-        </m:r>
-      </m:oMath>
-      <w:r>
-        <w:t xml:space="preserve">-almost everywhere,</w:t>
-      </w:r>
-      <w:r>
-        <w:t xml:space="preserve"> </w:t>
-      </w:r>
-      <w:r>
-        <w:t xml:space="preserve">though not everywhere.</w:t>
-      </w:r>
-    </w:p>
-    <w:p>
-      <w:pPr>
-        <w:pStyle w:val="BodyText"/>
-      </w:pPr>
-      <w:r>
-        <w:t xml:space="preserve">For a counting measure, only</w:t>
-      </w:r>
-      <w:r>
-        <w:t xml:space="preserve"> </w:t>
-      </w:r>
-      <m:oMath>
-        <m:r>
-          <m:rPr>
-            <m:sty m:val="p"/>
-          </m:rPr>
-          <m:t>∅</m:t>
-        </m:r>
-      </m:oMath>
-      <w:r>
-        <w:t xml:space="preserve"> </w:t>
-      </w:r>
-      <w:r>
-        <w:t xml:space="preserve">has measure zero (</w:t>
-      </w:r>
-      <w:hyperlink w:anchor="exm-measure-zero">
         <w:r>
           <w:rPr>
             <w:rStyle w:val="Hyperlink"/>
@@ -23175,21 +23292,103 @@
         <w:t xml:space="preserve"> </w:t>
       </w:r>
       <w:r>
-        <w:t xml:space="preserve">so a statement holds almost everywhere only if it holds everywhere.</w:t>
+        <w:t xml:space="preserve">so</w:t>
+      </w:r>
+      <w:r>
+        <w:t xml:space="preserve"> </w:t>
+      </w:r>
+      <m:oMath>
+        <m:r>
+          <m:t>g</m:t>
+        </m:r>
+        <m:r>
+          <m:rPr>
+            <m:sty m:val="p"/>
+          </m:rPr>
+          <m:t>≥</m:t>
+        </m:r>
+        <m:r>
+          <m:t>0</m:t>
+        </m:r>
+      </m:oMath>
+      <w:r>
+        <w:t xml:space="preserve"> </w:t>
+      </w:r>
+      <w:r>
+        <w:t xml:space="preserve">holds</w:t>
+      </w:r>
+      <w:r>
+        <w:t xml:space="preserve"> </w:t>
+      </w:r>
+      <m:oMath>
+        <m:r>
+          <m:t>λ</m:t>
+        </m:r>
+      </m:oMath>
+      <w:r>
+        <w:t xml:space="preserve">-almost everywhere,</w:t>
+      </w:r>
+      <w:r>
+        <w:t xml:space="preserve"> </w:t>
+      </w:r>
+      <w:r>
+        <w:t xml:space="preserve">though not everywhere.</w:t>
       </w:r>
     </w:p>
-    <w:bookmarkEnd w:id="92"/>
-    <w:bookmarkStart w:id="93" w:name="def-sigma-finite"/>
     <w:p>
       <w:pPr>
         <w:pStyle w:val="BodyText"/>
       </w:pPr>
       <w:r>
+        <w:t xml:space="preserve">For a counting measure, only</w:t>
+      </w:r>
+      <w:r>
+        <w:t xml:space="preserve"> </w:t>
+      </w:r>
+      <m:oMath>
+        <m:r>
+          <m:rPr>
+            <m:sty m:val="p"/>
+          </m:rPr>
+          <m:t>∅</m:t>
+        </m:r>
+      </m:oMath>
+      <w:r>
+        <w:t xml:space="preserve"> </w:t>
+      </w:r>
+      <w:r>
+        <w:t xml:space="preserve">has measure zero (</w:t>
+      </w:r>
+      <w:hyperlink w:anchor="exm-measure-zero">
+        <w:r>
+          <w:rPr>
+            <w:rStyle w:val="Hyperlink"/>
+          </w:rPr>
+          <w:t xml:space="preserve">Example 21</w:t>
+        </w:r>
+      </w:hyperlink>
+      <w:r>
+        <w:t xml:space="preserve">),</w:t>
+      </w:r>
+      <w:r>
+        <w:t xml:space="preserve"> </w:t>
+      </w:r>
+      <w:r>
+        <w:t xml:space="preserve">so a statement holds almost everywhere only if it holds everywhere.</w:t>
+      </w:r>
+    </w:p>
+    <w:bookmarkEnd w:id="94"/>
+    <w:bookmarkStart w:id="95" w:name="def-sigma-finite"/>
+    <w:p>
+      <w:pPr>
+        <w:pStyle w:val="BodyText"/>
+      </w:pPr>
+      <w:r>
         <w:rPr>
           <w:b/>
           <w:bCs/>
         </w:rPr>
-        <w:t xml:space="preserve">Definition 17 (Finite and</w:t>
+        <w:t xml:space="preserve">Definition 18 (Finite and</w:t>
       </w:r>
       <w:r>
         <w:rPr>
@@ -23581,8 +23780,8 @@
         <w:t xml:space="preserve">.</w:t>
       </w:r>
     </w:p>
-    <w:bookmarkEnd w:id="93"/>
-    <w:bookmarkStart w:id="94" w:name="exm-sigma-finite"/>
+    <w:bookmarkEnd w:id="95"/>
+    <w:bookmarkStart w:id="96" w:name="exm-sigma-finite"/>
     <w:p>
       <w:pPr>
         <w:pStyle w:val="BodyText"/>
@@ -23592,7 +23791,7 @@
           <w:b/>
           <w:bCs/>
         </w:rPr>
-        <w:t xml:space="preserve">Example 22 (Finite and</w:t>
+        <w:t xml:space="preserve">Example 23 (Finite and</w:t>
       </w:r>
       <w:r>
         <w:rPr>
@@ -24397,9 +24596,9 @@
         <w:t xml:space="preserve">.</w:t>
       </w:r>
     </w:p>
-    <w:bookmarkEnd w:id="94"/>
-    <w:bookmarkEnd w:id="95"/>
-    <w:bookmarkStart w:id="99" w:name="probability-measures"/>
+    <w:bookmarkEnd w:id="96"/>
+    <w:bookmarkEnd w:id="97"/>
+    <w:bookmarkStart w:id="101" w:name="probability-measures"/>
     <w:p>
       <w:pPr>
         <w:pStyle w:val="Heading2"/>
@@ -24408,7 +24607,7 @@
         <w:t xml:space="preserve">6 Probability measures</w:t>
       </w:r>
     </w:p>
-    <w:bookmarkStart w:id="96" w:name="def-probability-measure"/>
+    <w:bookmarkStart w:id="98" w:name="def-probability-measure"/>
     <w:p>
       <w:pPr>
         <w:pStyle w:val="FirstParagraph"/>
@@ -24418,7 +24617,7 @@
           <w:b/>
           <w:bCs/>
         </w:rPr>
-        <w:t xml:space="preserve">Definition 18 (Probability measure)</w:t>
+        <w:t xml:space="preserve">Definition 19 (Probability measure)</w:t>
       </w:r>
       <w:r>
         <w:t xml:space="preserve"> </w:t>
@@ -24445,7 +24644,7 @@
       <w:r>
         <w:t xml:space="preserve"> </w:t>
       </w:r>
-      <w:hyperlink w:anchor="def-measure-space">
+      <w:hyperlink w:anchor="def-measurable-space">
         <w:r>
           <w:rPr>
             <w:rStyle w:val="Hyperlink"/>
@@ -24784,8 +24983,8 @@
         <w:t xml:space="preserve">.</w:t>
       </w:r>
     </w:p>
-    <w:bookmarkEnd w:id="96"/>
-    <w:bookmarkStart w:id="97" w:name="exm-probability-measure"/>
+    <w:bookmarkEnd w:id="98"/>
+    <w:bookmarkStart w:id="99" w:name="exm-probability-measure"/>
     <w:p>
       <w:pPr>
         <w:pStyle w:val="BodyText"/>
@@ -24795,7 +24994,7 @@
           <w:b/>
           <w:bCs/>
         </w:rPr>
-        <w:t xml:space="preserve">Example 23 (A fair die, and the unit interval)</w:t>
+        <w:t xml:space="preserve">Example 24 (A fair die, and the unit interval)</w:t>
       </w:r>
       <w:r>
         <w:t xml:space="preserve"> </w:t>
@@ -25576,7 +25775,7 @@
           <w:rPr>
             <w:rStyle w:val="Hyperlink"/>
           </w:rPr>
-          <w:t xml:space="preserve">Example 19</w:t>
+          <w:t xml:space="preserve">Example 20</w:t>
         </w:r>
       </w:hyperlink>
       <w:r>
@@ -25640,8 +25839,8 @@
         <w:t xml:space="preserve">.</w:t>
       </w:r>
     </w:p>
-    <w:bookmarkEnd w:id="97"/>
-    <w:bookmarkStart w:id="98" w:name="rem-mutually-exclusive"/>
+    <w:bookmarkEnd w:id="99"/>
+    <w:bookmarkStart w:id="100" w:name="rem-mutually-exclusive"/>
     <w:p>
       <w:pPr>
         <w:pStyle w:val="FirstParagraph"/>
@@ -25853,9 +26052,9 @@
         <w:t xml:space="preserve">no roll is both even and odd.</w:t>
       </w:r>
     </w:p>
-    <w:bookmarkEnd w:id="98"/>
-    <w:bookmarkEnd w:id="99"/>
-    <w:bookmarkStart w:id="117" w:name="measurable-functions-and-integrals"/>
+    <w:bookmarkEnd w:id="100"/>
+    <w:bookmarkEnd w:id="101"/>
+    <w:bookmarkStart w:id="119" w:name="measurable-functions-and-integrals"/>
     <w:p>
       <w:pPr>
         <w:pStyle w:val="Heading2"/>
@@ -25864,7 +26063,7 @@
         <w:t xml:space="preserve">7 Measurable functions and integrals</w:t>
       </w:r>
     </w:p>
-    <w:bookmarkStart w:id="100" w:name="def-measurable-function"/>
+    <w:bookmarkStart w:id="102" w:name="def-measurable-function"/>
     <w:p>
       <w:pPr>
         <w:pStyle w:val="FirstParagraph"/>
@@ -25874,7 +26073,7 @@
           <w:b/>
           <w:bCs/>
         </w:rPr>
-        <w:t xml:space="preserve">Definition 19 (Measurable function)</w:t>
+        <w:t xml:space="preserve">Definition 20 (Measurable function)</w:t>
       </w:r>
       <w:r>
         <w:t xml:space="preserve"> </w:t>
@@ -25924,7 +26123,7 @@
       <w:r>
         <w:t xml:space="preserve"> </w:t>
       </w:r>
-      <w:hyperlink w:anchor="def-measure-space">
+      <w:hyperlink w:anchor="def-measurable-space">
         <w:r>
           <w:rPr>
             <w:rStyle w:val="Hyperlink"/>
@@ -26157,8 +26356,8 @@
         </m:oMath>
       </m:oMathPara>
     </w:p>
-    <w:bookmarkEnd w:id="100"/>
-    <w:bookmarkStart w:id="102" w:name="rem-measurable-function-general"/>
+    <w:bookmarkEnd w:id="102"/>
+    <w:bookmarkStart w:id="104" w:name="rem-measurable-function-general"/>
     <w:p>
       <w:pPr>
         <w:pStyle w:val="FirstParagraph"/>
@@ -26479,7 +26678,7 @@
           <w:rPr>
             <w:rStyle w:val="Hyperlink"/>
           </w:rPr>
-          <w:t xml:space="preserve">Definition 19</w:t>
+          <w:t xml:space="preserve">Definition 20</w:t>
         </w:r>
       </w:hyperlink>
       <w:r>
@@ -26491,7 +26690,7 @@
       <w:r>
         <w:t xml:space="preserve"> </w:t>
       </w:r>
-      <w:hyperlink r:id="rId101">
+      <w:hyperlink r:id="rId103">
         <w:r>
           <w:rPr>
             <w:rStyle w:val="Hyperlink"/>
@@ -26660,15 +26859,15 @@
           <w:rPr>
             <w:rStyle w:val="Hyperlink"/>
           </w:rPr>
-          <w:t xml:space="preserve">Definition 19</w:t>
+          <w:t xml:space="preserve">Definition 20</w:t>
         </w:r>
       </w:hyperlink>
       <w:r>
         <w:t xml:space="preserve">.</w:t>
       </w:r>
     </w:p>
-    <w:bookmarkEnd w:id="102"/>
-    <w:bookmarkStart w:id="103" w:name="exm-measurable-function"/>
+    <w:bookmarkEnd w:id="104"/>
+    <w:bookmarkStart w:id="105" w:name="exm-measurable-function"/>
     <w:p>
       <w:pPr>
         <w:pStyle w:val="BodyText"/>
@@ -26678,7 +26877,7 @@
           <w:b/>
           <w:bCs/>
         </w:rPr>
-        <w:t xml:space="preserve">Example 24 (Measurable and not measurable)</w:t>
+        <w:t xml:space="preserve">Example 25 (Measurable and not measurable)</w:t>
       </w:r>
       <w:r>
         <w:t xml:space="preserve"> </w:t>
@@ -27589,8 +27788,8 @@
         <w:t xml:space="preserve">, is measurable.</w:t>
       </w:r>
     </w:p>
-    <w:bookmarkEnd w:id="103"/>
-    <w:bookmarkStart w:id="106" w:name="def-integral-nonneg"/>
+    <w:bookmarkEnd w:id="105"/>
+    <w:bookmarkStart w:id="108" w:name="def-integral-nonneg"/>
     <w:p>
       <w:pPr>
         <w:pStyle w:val="BodyText"/>
@@ -27600,7 +27799,7 @@
           <w:b/>
           <w:bCs/>
         </w:rPr>
-        <w:t xml:space="preserve">Definition 20 (Integral of a non-negative function)</w:t>
+        <w:t xml:space="preserve">Definition 21 (Integral of a non-negative function)</w:t>
       </w:r>
       <w:r>
         <w:t xml:space="preserve"> </w:t>
@@ -28015,7 +28214,7 @@
       <w:r>
         <w:t xml:space="preserve"> </w:t>
       </w:r>
-      <w:hyperlink r:id="rId104">
+      <w:hyperlink r:id="rId106">
         <w:r>
           <w:rPr>
             <w:rStyle w:val="Hyperlink"/>
@@ -28205,7 +28404,7 @@
       <w:r>
         <w:t xml:space="preserve"> </w:t>
       </w:r>
-      <w:hyperlink r:id="rId105">
+      <w:hyperlink r:id="rId107">
         <w:r>
           <w:rPr>
             <w:rStyle w:val="Hyperlink"/>
@@ -28497,8 +28696,8 @@
         <w:t xml:space="preserve">(Billingsley 1995, sec. 15)</w:t>
       </w:r>
     </w:p>
-    <w:bookmarkEnd w:id="106"/>
-    <w:bookmarkStart w:id="109" w:name="rem-integral-nonneg-lower-sums"/>
+    <w:bookmarkEnd w:id="108"/>
+    <w:bookmarkStart w:id="111" w:name="rem-integral-nonneg-lower-sums"/>
     <w:p>
       <w:pPr>
         <w:pStyle w:val="BodyText"/>
@@ -28524,7 +28723,7 @@
           <w:rPr>
             <w:rStyle w:val="Hyperlink"/>
           </w:rPr>
-          <w:t xml:space="preserve">Definition 20</w:t>
+          <w:t xml:space="preserve">Definition 21</w:t>
         </w:r>
       </w:hyperlink>
       <w:r>
@@ -28663,7 +28862,7 @@
       <w:r>
         <w:t xml:space="preserve"> </w:t>
       </w:r>
-      <w:hyperlink r:id="rId107">
+      <w:hyperlink r:id="rId109">
         <w:r>
           <w:rPr>
             <w:rStyle w:val="Hyperlink"/>
@@ -28835,7 +29034,7 @@
       <w:r>
         <w:t xml:space="preserve"> </w:t>
       </w:r>
-      <w:hyperlink r:id="rId108">
+      <w:hyperlink r:id="rId110">
         <w:r>
           <w:rPr>
             <w:rStyle w:val="Hyperlink"/>
@@ -28847,8 +29046,8 @@
         <w:t xml:space="preserve">).</w:t>
       </w:r>
     </w:p>
-    <w:bookmarkEnd w:id="109"/>
-    <w:bookmarkStart w:id="110" w:name="exm-integral-nonneg"/>
+    <w:bookmarkEnd w:id="111"/>
+    <w:bookmarkStart w:id="112" w:name="exm-integral-nonneg"/>
     <w:p>
       <w:pPr>
         <w:pStyle w:val="BodyText"/>
@@ -28858,7 +29057,7 @@
           <w:b/>
           <w:bCs/>
         </w:rPr>
-        <w:t xml:space="preserve">Example 25 (Integrals with respect to counting measure)</w:t>
+        <w:t xml:space="preserve">Example 26 (Integrals with respect to counting measure)</w:t>
       </w:r>
       <w:r>
         <w:t xml:space="preserve"> </w:t>
@@ -28975,7 +29174,7 @@
           <w:rPr>
             <w:rStyle w:val="Hyperlink"/>
           </w:rPr>
-          <w:t xml:space="preserve">Example 24</w:t>
+          <w:t xml:space="preserve">Example 25</w:t>
         </w:r>
       </w:hyperlink>
       <w:r>
@@ -30230,8 +30429,8 @@
         <w:t xml:space="preserve">.</w:t>
       </w:r>
     </w:p>
-    <w:bookmarkEnd w:id="110"/>
-    <w:bookmarkStart w:id="111" w:name="def-integral"/>
+    <w:bookmarkEnd w:id="112"/>
+    <w:bookmarkStart w:id="113" w:name="def-integral"/>
     <w:p>
       <w:pPr>
         <w:pStyle w:val="BodyText"/>
@@ -30241,7 +30440,7 @@
           <w:b/>
           <w:bCs/>
         </w:rPr>
-        <w:t xml:space="preserve">Definition 21 (Integral of a real-valued function)</w:t>
+        <w:t xml:space="preserve">Definition 22 (Integral of a real-valued function)</w:t>
       </w:r>
       <w:r>
         <w:t xml:space="preserve"> </w:t>
@@ -31007,7 +31206,7 @@
           <w:rPr>
             <w:rStyle w:val="Hyperlink"/>
           </w:rPr>
-          <w:t xml:space="preserve">Definition 20</w:t>
+          <w:t xml:space="preserve">Definition 21</w:t>
         </w:r>
       </w:hyperlink>
       <w:r>
@@ -31153,8 +31352,8 @@
         <w:t xml:space="preserve">(Billingsley 1995, sec. 15)</w:t>
       </w:r>
     </w:p>
-    <w:bookmarkEnd w:id="111"/>
-    <w:bookmarkStart w:id="112" w:name="exm-integral"/>
+    <w:bookmarkEnd w:id="113"/>
+    <w:bookmarkStart w:id="114" w:name="exm-integral"/>
     <w:p>
       <w:pPr>
         <w:pStyle w:val="BodyText"/>
@@ -31164,7 +31363,7 @@
           <w:b/>
           <w:bCs/>
         </w:rPr>
-        <w:t xml:space="preserve">Example 26 (An integral with positive and negative parts)</w:t>
+        <w:t xml:space="preserve">Example 27 (An integral with positive and negative parts)</w:t>
       </w:r>
       <w:r>
         <w:t xml:space="preserve"> </w:t>
@@ -31522,7 +31721,7 @@
           <w:rPr>
             <w:rStyle w:val="Hyperlink"/>
           </w:rPr>
-          <w:t xml:space="preserve">Example 25</w:t>
+          <w:t xml:space="preserve">Example 26</w:t>
         </w:r>
       </w:hyperlink>
       <w:r>
@@ -31851,8 +32050,8 @@
         <w:t xml:space="preserve">.</w:t>
       </w:r>
     </w:p>
-    <w:bookmarkEnd w:id="112"/>
-    <w:bookmarkStart w:id="114" w:name="def-absolutely-integrable"/>
+    <w:bookmarkEnd w:id="114"/>
+    <w:bookmarkStart w:id="116" w:name="def-absolutely-integrable"/>
     <w:p>
       <w:pPr>
         <w:pStyle w:val="FirstParagraph"/>
@@ -31862,7 +32061,7 @@
           <w:b/>
           <w:bCs/>
         </w:rPr>
-        <w:t xml:space="preserve">Definition 22 (Absolutely integrable function)</w:t>
+        <w:t xml:space="preserve">Definition 23 (Absolutely integrable function)</w:t>
       </w:r>
       <w:r>
         <w:t xml:space="preserve"> </w:t>
@@ -32043,7 +32242,7 @@
       <w:r>
         <w:t xml:space="preserve"> </w:t>
       </w:r>
-      <w:hyperlink r:id="rId113">
+      <w:hyperlink r:id="rId115">
         <w:r>
           <w:rPr>
             <w:rStyle w:val="Hyperlink"/>
@@ -32151,8 +32350,8 @@
         <w:t xml:space="preserve">.</w:t>
       </w:r>
     </w:p>
-    <w:bookmarkEnd w:id="114"/>
-    <w:bookmarkStart w:id="115" w:name="rem-absolutely-integrable-integral"/>
+    <w:bookmarkEnd w:id="116"/>
+    <w:bookmarkStart w:id="117" w:name="rem-absolutely-integrable-integral"/>
     <w:p>
       <w:pPr>
         <w:pStyle w:val="BodyText"/>
@@ -32419,7 +32618,7 @@
           <w:rPr>
             <w:rStyle w:val="Hyperlink"/>
           </w:rPr>
-          <w:t xml:space="preserve">Definition 20</w:t>
+          <w:t xml:space="preserve">Definition 21</w:t>
         </w:r>
       </w:hyperlink>
       <w:r>
@@ -32561,15 +32760,15 @@
           <w:rPr>
             <w:rStyle w:val="Hyperlink"/>
           </w:rPr>
-          <w:t xml:space="preserve">Definition 21</w:t>
+          <w:t xml:space="preserve">Definition 22</w:t>
         </w:r>
       </w:hyperlink>
       <w:r>
         <w:t xml:space="preserve">) is a real number.</w:t>
       </w:r>
     </w:p>
-    <w:bookmarkEnd w:id="115"/>
-    <w:bookmarkStart w:id="116" w:name="exm-absolutely-integrable"/>
+    <w:bookmarkEnd w:id="117"/>
+    <w:bookmarkStart w:id="118" w:name="exm-absolutely-integrable"/>
     <w:p>
       <w:pPr>
         <w:pStyle w:val="BodyText"/>
@@ -32579,7 +32778,7 @@
           <w:b/>
           <w:bCs/>
         </w:rPr>
-        <w:t xml:space="preserve">Example 27 (Absolutely integrable and not)</w:t>
+        <w:t xml:space="preserve">Example 28 (Absolutely integrable and not)</w:t>
       </w:r>
       <w:r>
         <w:t xml:space="preserve"> </w:t>
@@ -32662,7 +32861,7 @@
           <w:rPr>
             <w:rStyle w:val="Hyperlink"/>
           </w:rPr>
-          <w:t xml:space="preserve">Example 26</w:t>
+          <w:t xml:space="preserve">Example 27</w:t>
         </w:r>
       </w:hyperlink>
       <w:r>
@@ -32810,7 +33009,7 @@
           <w:rPr>
             <w:rStyle w:val="Hyperlink"/>
           </w:rPr>
-          <w:t xml:space="preserve">Example 25</w:t>
+          <w:t xml:space="preserve">Example 26</w:t>
         </w:r>
       </w:hyperlink>
       <w:r>
@@ -33015,16 +33214,16 @@
           <w:rPr>
             <w:rStyle w:val="Hyperlink"/>
           </w:rPr>
-          <w:t xml:space="preserve">Example 25</w:t>
+          <w:t xml:space="preserve">Example 26</w:t>
         </w:r>
       </w:hyperlink>
       <w:r>
         <w:t xml:space="preserve">).</w:t>
       </w:r>
     </w:p>
-    <w:bookmarkEnd w:id="116"/>
-    <w:bookmarkEnd w:id="117"/>
-    <w:bookmarkStart w:id="123" w:name="product-measures"/>
+    <w:bookmarkEnd w:id="118"/>
+    <w:bookmarkEnd w:id="119"/>
+    <w:bookmarkStart w:id="125" w:name="product-measures"/>
     <w:p>
       <w:pPr>
         <w:pStyle w:val="Heading2"/>
@@ -33033,7 +33232,7 @@
         <w:t xml:space="preserve">8 Product measures</w:t>
       </w:r>
     </w:p>
-    <w:bookmarkStart w:id="119" w:name="def-product-sigma-algebra"/>
+    <w:bookmarkStart w:id="121" w:name="def-product-sigma-algebra"/>
     <w:p>
       <w:pPr>
         <w:pStyle w:val="FirstParagraph"/>
@@ -33043,7 +33242,7 @@
           <w:b/>
           <w:bCs/>
         </w:rPr>
-        <w:t xml:space="preserve">Definition 23 (Product</w:t>
+        <w:t xml:space="preserve">Definition 24 (Product</w:t>
       </w:r>
       <w:r>
         <w:rPr>
@@ -33151,7 +33350,7 @@
       <w:r>
         <w:t xml:space="preserve"> </w:t>
       </w:r>
-      <w:hyperlink w:anchor="def-measure-space">
+      <w:hyperlink w:anchor="def-measurable-space">
         <w:r>
           <w:rPr>
             <w:rStyle w:val="Hyperlink"/>
@@ -33187,7 +33386,7 @@
       <w:r>
         <w:t xml:space="preserve"> </w:t>
       </w:r>
-      <w:hyperlink r:id="rId118">
+      <w:hyperlink r:id="rId120">
         <w:r>
           <w:rPr>
             <w:rStyle w:val="Hyperlink"/>
@@ -33381,8 +33580,8 @@
         <w:t xml:space="preserve">the measurable rectangles.</w:t>
       </w:r>
     </w:p>
-    <w:bookmarkEnd w:id="119"/>
-    <w:bookmarkStart w:id="120" w:name="exm-product-sigma-algebra"/>
+    <w:bookmarkEnd w:id="121"/>
+    <w:bookmarkStart w:id="122" w:name="exm-product-sigma-algebra"/>
     <w:p>
       <w:pPr>
         <w:pStyle w:val="BodyText"/>
@@ -33392,7 +33591,7 @@
           <w:b/>
           <w:bCs/>
         </w:rPr>
-        <w:t xml:space="preserve">Example 28 (Product</w:t>
+        <w:t xml:space="preserve">Example 29 (Product</w:t>
       </w:r>
       <w:r>
         <w:rPr>
@@ -33881,8 +34080,8 @@
         <w:t xml:space="preserve">.</w:t>
       </w:r>
     </w:p>
-    <w:bookmarkEnd w:id="120"/>
-    <w:bookmarkStart w:id="121" w:name="def-product-measure"/>
+    <w:bookmarkEnd w:id="122"/>
+    <w:bookmarkStart w:id="123" w:name="def-product-measure"/>
     <w:p>
       <w:pPr>
         <w:pStyle w:val="FirstParagraph"/>
@@ -33892,7 +34091,7 @@
           <w:b/>
           <w:bCs/>
         </w:rPr>
-        <w:t xml:space="preserve">Definition 24 (Product measure)</w:t>
+        <w:t xml:space="preserve">Definition 25 (Product measure)</w:t>
       </w:r>
       <w:r>
         <w:t xml:space="preserve"> </w:t>
@@ -34492,8 +34691,8 @@
         <w:t xml:space="preserve">.</w:t>
       </w:r>
     </w:p>
-    <w:bookmarkEnd w:id="121"/>
-    <w:bookmarkStart w:id="122" w:name="exm-product-measure"/>
+    <w:bookmarkEnd w:id="123"/>
+    <w:bookmarkStart w:id="124" w:name="exm-product-measure"/>
     <w:p>
       <w:pPr>
         <w:pStyle w:val="BodyText"/>
@@ -34503,7 +34702,7 @@
           <w:b/>
           <w:bCs/>
         </w:rPr>
-        <w:t xml:space="preserve">Example 29 (Product measures)</w:t>
+        <w:t xml:space="preserve">Example 30 (Product measures)</w:t>
       </w:r>
       <w:r>
         <w:t xml:space="preserve"> </w:t>
@@ -35101,9 +35300,9 @@
         <w:t xml:space="preserve">the area of the rectangle.</w:t>
       </w:r>
     </w:p>
-    <w:bookmarkEnd w:id="122"/>
-    <w:bookmarkEnd w:id="123"/>
-    <w:bookmarkStart w:id="124" w:name="sec-further-reading"/>
+    <w:bookmarkEnd w:id="124"/>
+    <w:bookmarkEnd w:id="125"/>
+    <w:bookmarkStart w:id="126" w:name="sec-further-reading"/>
     <w:p>
       <w:pPr>
         <w:pStyle w:val="Heading2"/>
@@ -35206,8 +35405,8 @@
         <w:t xml:space="preserve">that opens with a chapter on introductory measure theory.</w:t>
       </w:r>
     </w:p>
-    <w:bookmarkEnd w:id="124"/>
-    <w:bookmarkStart w:id="131" w:name="references"/>
+    <w:bookmarkEnd w:id="126"/>
+    <w:bookmarkStart w:id="133" w:name="references"/>
     <w:p>
       <w:pPr>
         <w:pStyle w:val="Heading2"/>
@@ -35216,8 +35415,8 @@
         <w:t xml:space="preserve">References</w:t>
       </w:r>
     </w:p>
-    <w:bookmarkStart w:id="130" w:name="refs"/>
-    <w:bookmarkStart w:id="125" w:name="ref-billingsley1995probability"/>
+    <w:bookmarkStart w:id="132" w:name="refs"/>
+    <w:bookmarkStart w:id="127" w:name="ref-billingsley1995probability"/>
     <w:p>
       <w:pPr>
         <w:pStyle w:val="Bibliography"/>
@@ -35239,8 +35438,8 @@
         <w:t xml:space="preserve">. 3rd ed. Wiley Series in Probability and Mathematical Statistics. Wiley.</w:t>
       </w:r>
     </w:p>
-    <w:bookmarkEnd w:id="125"/>
-    <w:bookmarkStart w:id="127" w:name="ref-folland1999real"/>
+    <w:bookmarkEnd w:id="127"/>
+    <w:bookmarkStart w:id="129" w:name="ref-folland1999real"/>
     <w:p>
       <w:pPr>
         <w:pStyle w:val="Bibliography"/>
@@ -35264,7 +35463,7 @@
       <w:r>
         <w:t xml:space="preserve"> </w:t>
       </w:r>
-      <w:hyperlink r:id="rId126">
+      <w:hyperlink r:id="rId128">
         <w:r>
           <w:rPr>
             <w:rStyle w:val="Hyperlink"/>
@@ -35276,8 +35475,8 @@
         <w:t xml:space="preserve">.</w:t>
       </w:r>
     </w:p>
-    <w:bookmarkEnd w:id="127"/>
-    <w:bookmarkStart w:id="129" w:name="ref-gut2013"/>
+    <w:bookmarkEnd w:id="129"/>
+    <w:bookmarkStart w:id="131" w:name="ref-gut2013"/>
     <w:p>
       <w:pPr>
         <w:pStyle w:val="Bibliography"/>
@@ -35301,7 +35500,7 @@
       <w:r>
         <w:t xml:space="preserve"> </w:t>
       </w:r>
-      <w:hyperlink r:id="rId128">
+      <w:hyperlink r:id="rId130">
         <w:r>
           <w:rPr>
             <w:rStyle w:val="Hyperlink"/>
@@ -35313,9 +35512,9 @@
         <w:t xml:space="preserve">.</w:t>
       </w:r>
     </w:p>
-    <w:bookmarkEnd w:id="129"/>
-    <w:bookmarkEnd w:id="130"/>
     <w:bookmarkEnd w:id="131"/>
+    <w:bookmarkEnd w:id="132"/>
+    <w:bookmarkEnd w:id="133"/>
     <w:sectPr>
       <w:footnotePr>
         <w:numRestart w:val="eachSect"/>

</xml_diff>

<commit_message>
Deploying to gh-pages from @ Morrison-Lab/mds@f5cbc8504d15e120c65a5823b43d5c24fef1032e 🚀
</commit_message>
<xml_diff>
--- a/measures.docx
+++ b/measures.docx
@@ -15,7 +15,7 @@
         <w:pStyle w:val="Date"/>
       </w:pPr>
       <w:r>
-        <w:t xml:space="preserve">Last modified: 2026-10-07 00:49:43 (PDT)</w:t>
+        <w:t xml:space="preserve">Last modified: 2026-10-07 01:28:46 (PDT)</w:t>
       </w:r>
     </w:p>
     <w:p>
@@ -5046,23 +5046,27 @@
           <m:t>σ</m:t>
         </m:r>
         <m:r>
-          <m:rPr>
-            <m:sty m:val="p"/>
-          </m:rPr>
-          <m:t>(</m:t>
-        </m:r>
-        <m:r>
-          <m:rPr>
-            <m:scr m:val="script"/>
-            <m:sty m:val="p"/>
-          </m:rPr>
-          <m:t>C</m:t>
-        </m:r>
-        <m:r>
-          <m:rPr>
-            <m:sty m:val="p"/>
-          </m:rPr>
-          <m:t>)</m:t>
+          <m:t>​</m:t>
+        </m:r>
+        <m:d>
+          <m:dPr>
+            <m:begChr m:val="("/>
+            <m:sepChr m:val=""/>
+            <m:endChr m:val=")"/>
+            <m:grow/>
+          </m:dPr>
+          <m:e>
+            <m:r>
+              <m:rPr>
+                <m:scr m:val="script"/>
+                <m:sty m:val="p"/>
+              </m:rPr>
+              <m:t>C</m:t>
+            </m:r>
+          </m:e>
+        </m:d>
+        <m:r>
+          <m:t>​</m:t>
         </m:r>
       </m:oMath>
       <w:r>
@@ -5162,23 +5166,27 @@
           <m:t>σ</m:t>
         </m:r>
         <m:r>
-          <m:rPr>
-            <m:sty m:val="p"/>
-          </m:rPr>
-          <m:t>(</m:t>
-        </m:r>
-        <m:r>
-          <m:rPr>
-            <m:scr m:val="script"/>
-            <m:sty m:val="p"/>
-          </m:rPr>
-          <m:t>C</m:t>
-        </m:r>
-        <m:r>
-          <m:rPr>
-            <m:sty m:val="p"/>
-          </m:rPr>
-          <m:t>)</m:t>
+          <m:t>​</m:t>
+        </m:r>
+        <m:d>
+          <m:dPr>
+            <m:begChr m:val="("/>
+            <m:sepChr m:val=""/>
+            <m:endChr m:val=")"/>
+            <m:grow/>
+          </m:dPr>
+          <m:e>
+            <m:r>
+              <m:rPr>
+                <m:scr m:val="script"/>
+                <m:sty m:val="p"/>
+              </m:rPr>
+              <m:t>C</m:t>
+            </m:r>
+          </m:e>
+        </m:d>
+        <m:r>
+          <m:t>​</m:t>
         </m:r>
       </m:oMath>
       <w:r>
@@ -5908,23 +5916,27 @@
           <m:t>σ</m:t>
         </m:r>
         <m:r>
-          <m:rPr>
-            <m:sty m:val="p"/>
-          </m:rPr>
-          <m:t>(</m:t>
-        </m:r>
-        <m:r>
-          <m:rPr>
-            <m:scr m:val="script"/>
-            <m:sty m:val="p"/>
-          </m:rPr>
-          <m:t>C</m:t>
-        </m:r>
-        <m:r>
-          <m:rPr>
-            <m:sty m:val="p"/>
-          </m:rPr>
-          <m:t>)</m:t>
+          <m:t>​</m:t>
+        </m:r>
+        <m:d>
+          <m:dPr>
+            <m:begChr m:val="("/>
+            <m:sepChr m:val=""/>
+            <m:endChr m:val=")"/>
+            <m:grow/>
+          </m:dPr>
+          <m:e>
+            <m:r>
+              <m:rPr>
+                <m:scr m:val="script"/>
+                <m:sty m:val="p"/>
+              </m:rPr>
+              <m:t>C</m:t>
+            </m:r>
+          </m:e>
+        </m:d>
+        <m:r>
+          <m:t>​</m:t>
         </m:r>
       </m:oMath>
       <w:r>

</xml_diff>

<commit_message>
Deploying to gh-pages from @ Morrison-Lab/mds@e1ca6823c006a7a2406d14e1324736ffda49d234 🚀
</commit_message>
<xml_diff>
--- a/measures.docx
+++ b/measures.docx
@@ -15,7 +15,7 @@
         <w:pStyle w:val="Date"/>
       </w:pPr>
       <w:r>
-        <w:t xml:space="preserve">Last modified: 2026-10-08 13:29:17 (PDT)</w:t>
+        <w:t xml:space="preserve">Last modified: 2026-10-08 14:38:49 (PDT)</w:t>
       </w:r>
     </w:p>
     <w:p>
@@ -24765,6 +24765,9 @@
       </w:r>
       <m:oMath>
         <m:r>
+          <m:rPr>
+            <m:sty m:val="p"/>
+          </m:rPr>
           <m:t>P</m:t>
         </m:r>
       </m:oMath>
@@ -24831,25 +24834,32 @@
         </m:oMathParaPr>
         <m:oMath>
           <m:r>
+            <m:rPr>
+              <m:sty m:val="p"/>
+            </m:rPr>
             <m:t>P</m:t>
           </m:r>
           <m:r>
-            <m:rPr>
-              <m:sty m:val="p"/>
-            </m:rPr>
-            <m:t>(</m:t>
+            <m:t>​</m:t>
           </m:r>
+          <m:d>
+            <m:dPr>
+              <m:begChr m:val="("/>
+              <m:sepChr m:val=""/>
+              <m:endChr m:val=")"/>
+              <m:grow/>
+            </m:dPr>
+            <m:e>
+              <m:r>
+                <m:rPr>
+                  <m:sty m:val="p"/>
+                </m:rPr>
+                <m:t>Ω</m:t>
+              </m:r>
+            </m:e>
+          </m:d>
           <m:r>
-            <m:rPr>
-              <m:sty m:val="p"/>
-            </m:rPr>
-            <m:t>Ω</m:t>
-          </m:r>
-          <m:r>
-            <m:rPr>
-              <m:sty m:val="p"/>
-            </m:rPr>
-            <m:t>)</m:t>
+            <m:t>​</m:t>
           </m:r>
           <m:r>
             <m:rPr>
@@ -24906,6 +24916,9 @@
           <m:t>,</m:t>
         </m:r>
         <m:r>
+          <m:rPr>
+            <m:sty m:val="p"/>
+          </m:rPr>
           <m:t>P</m:t>
         </m:r>
         <m:r>
@@ -25196,22 +25209,29 @@
       </w:r>
       <m:oMath>
         <m:r>
+          <m:rPr>
+            <m:sty m:val="p"/>
+          </m:rPr>
           <m:t>P</m:t>
         </m:r>
         <m:r>
-          <m:rPr>
-            <m:sty m:val="p"/>
-          </m:rPr>
-          <m:t>(</m:t>
-        </m:r>
-        <m:r>
-          <m:t>A</m:t>
-        </m:r>
-        <m:r>
-          <m:rPr>
-            <m:sty m:val="p"/>
-          </m:rPr>
-          <m:t>)</m:t>
+          <m:t>​</m:t>
+        </m:r>
+        <m:d>
+          <m:dPr>
+            <m:begChr m:val="("/>
+            <m:sepChr m:val=""/>
+            <m:endChr m:val=")"/>
+            <m:grow/>
+          </m:dPr>
+          <m:e>
+            <m:r>
+              <m:t>A</m:t>
+            </m:r>
+          </m:e>
+        </m:d>
+        <m:r>
+          <m:t>​</m:t>
         </m:r>
         <m:limUpp>
           <m:e>
@@ -25269,6 +25289,9 @@
       </w:r>
       <m:oMath>
         <m:r>
+          <m:rPr>
+            <m:sty m:val="p"/>
+          </m:rPr>
           <m:t>P</m:t>
         </m:r>
       </m:oMath>
@@ -25371,25 +25394,32 @@
       </w:r>
       <m:oMath>
         <m:r>
+          <m:rPr>
+            <m:sty m:val="p"/>
+          </m:rPr>
           <m:t>P</m:t>
         </m:r>
         <m:r>
-          <m:rPr>
-            <m:sty m:val="p"/>
-          </m:rPr>
-          <m:t>(</m:t>
-        </m:r>
-        <m:r>
-          <m:rPr>
-            <m:sty m:val="p"/>
-          </m:rPr>
-          <m:t>∅</m:t>
-        </m:r>
-        <m:r>
-          <m:rPr>
-            <m:sty m:val="p"/>
-          </m:rPr>
-          <m:t>)</m:t>
+          <m:t>​</m:t>
+        </m:r>
+        <m:d>
+          <m:dPr>
+            <m:begChr m:val="("/>
+            <m:sepChr m:val=""/>
+            <m:endChr m:val=")"/>
+            <m:grow/>
+          </m:dPr>
+          <m:e>
+            <m:r>
+              <m:rPr>
+                <m:sty m:val="p"/>
+              </m:rPr>
+              <m:t>∅</m:t>
+            </m:r>
+          </m:e>
+        </m:d>
+        <m:r>
+          <m:t>​</m:t>
         </m:r>
         <m:r>
           <m:rPr>
@@ -25415,6 +25445,9 @@
       </w:r>
       <m:oMath>
         <m:r>
+          <m:rPr>
+            <m:sty m:val="p"/>
+          </m:rPr>
           <m:t>P</m:t>
         </m:r>
       </m:oMath>
@@ -25489,22 +25522,29 @@
       </w:r>
       <m:oMath>
         <m:r>
+          <m:rPr>
+            <m:sty m:val="p"/>
+          </m:rPr>
           <m:t>P</m:t>
         </m:r>
         <m:r>
-          <m:rPr>
-            <m:sty m:val="p"/>
-          </m:rPr>
-          <m:t>(</m:t>
-        </m:r>
-        <m:r>
-          <m:t>D</m:t>
-        </m:r>
-        <m:r>
-          <m:rPr>
-            <m:sty m:val="p"/>
-          </m:rPr>
-          <m:t>)</m:t>
+          <m:t>​</m:t>
+        </m:r>
+        <m:d>
+          <m:dPr>
+            <m:begChr m:val="("/>
+            <m:sepChr m:val=""/>
+            <m:endChr m:val=")"/>
+            <m:grow/>
+          </m:dPr>
+          <m:e>
+            <m:r>
+              <m:t>D</m:t>
+            </m:r>
+          </m:e>
+        </m:d>
+        <m:r>
+          <m:t>​</m:t>
         </m:r>
         <m:r>
           <m:rPr>
@@ -25622,56 +25662,63 @@
       </w:r>
       <m:oMath>
         <m:r>
+          <m:rPr>
+            <m:sty m:val="p"/>
+          </m:rPr>
           <m:t>P</m:t>
-        </m:r>
-        <m:r>
-          <m:rPr>
-            <m:sty m:val="p"/>
-          </m:rPr>
-          <m:t>(</m:t>
         </m:r>
         <m:r>
           <m:t>​</m:t>
         </m:r>
         <m:d>
           <m:dPr>
-            <m:begChr m:val="{"/>
+            <m:begChr m:val="("/>
             <m:sepChr m:val=""/>
-            <m:endChr m:val="}"/>
+            <m:endChr m:val=")"/>
             <m:grow/>
           </m:dPr>
           <m:e>
             <m:r>
-              <m:t>1</m:t>
-            </m:r>
-            <m:r>
-              <m:rPr>
-                <m:sty m:val="p"/>
-              </m:rPr>
-              <m:t>,</m:t>
-            </m:r>
-            <m:r>
-              <m:t>3</m:t>
-            </m:r>
-            <m:r>
-              <m:rPr>
-                <m:sty m:val="p"/>
-              </m:rPr>
-              <m:t>,</m:t>
-            </m:r>
-            <m:r>
-              <m:t>5</m:t>
+              <m:t>​</m:t>
+            </m:r>
+            <m:d>
+              <m:dPr>
+                <m:begChr m:val="{"/>
+                <m:sepChr m:val=""/>
+                <m:endChr m:val="}"/>
+                <m:grow/>
+              </m:dPr>
+              <m:e>
+                <m:r>
+                  <m:t>1</m:t>
+                </m:r>
+                <m:r>
+                  <m:rPr>
+                    <m:sty m:val="p"/>
+                  </m:rPr>
+                  <m:t>,</m:t>
+                </m:r>
+                <m:r>
+                  <m:t>3</m:t>
+                </m:r>
+                <m:r>
+                  <m:rPr>
+                    <m:sty m:val="p"/>
+                  </m:rPr>
+                  <m:t>,</m:t>
+                </m:r>
+                <m:r>
+                  <m:t>5</m:t>
+                </m:r>
+              </m:e>
+            </m:d>
+            <m:r>
+              <m:t>​</m:t>
             </m:r>
           </m:e>
         </m:d>
         <m:r>
           <m:t>​</m:t>
-        </m:r>
-        <m:r>
-          <m:rPr>
-            <m:sty m:val="p"/>
-          </m:rPr>
-          <m:t>)</m:t>
         </m:r>
         <m:r>
           <m:rPr>
@@ -37688,6 +37735,9 @@
       </w:r>
       <m:oMath>
         <m:r>
+          <m:rPr>
+            <m:sty m:val="p"/>
+          </m:rPr>
           <m:t>P</m:t>
         </m:r>
       </m:oMath>
@@ -38033,6 +38083,9 @@
           <m:t>=</m:t>
         </m:r>
         <m:r>
+          <m:rPr>
+            <m:sty m:val="p"/>
+          </m:rPr>
           <m:t>P</m:t>
         </m:r>
       </m:oMath>
@@ -38058,22 +38111,29 @@
       </w:r>
       <m:oMath>
         <m:r>
+          <m:rPr>
+            <m:sty m:val="p"/>
+          </m:rPr>
           <m:t>P</m:t>
         </m:r>
         <m:r>
-          <m:rPr>
-            <m:sty m:val="p"/>
-          </m:rPr>
-          <m:t>(</m:t>
-        </m:r>
-        <m:r>
-          <m:t>S</m:t>
-        </m:r>
-        <m:r>
-          <m:rPr>
-            <m:sty m:val="p"/>
-          </m:rPr>
-          <m:t>)</m:t>
+          <m:t>​</m:t>
+        </m:r>
+        <m:d>
+          <m:dPr>
+            <m:begChr m:val="("/>
+            <m:sepChr m:val=""/>
+            <m:endChr m:val=")"/>
+            <m:grow/>
+          </m:dPr>
+          <m:e>
+            <m:r>
+              <m:t>S</m:t>
+            </m:r>
+          </m:e>
+        </m:d>
+        <m:r>
+          <m:t>​</m:t>
         </m:r>
         <m:r>
           <m:rPr>

</xml_diff>

<commit_message>
Deploying to gh-pages from @ Morrison-Lab/mds@3bb84661de6e17d7672f36aafefd0b3d06365039 🚀
</commit_message>
<xml_diff>
--- a/measures.docx
+++ b/measures.docx
@@ -15,7 +15,7 @@
         <w:pStyle w:val="Date"/>
       </w:pPr>
       <w:r>
-        <w:t xml:space="preserve">Last modified: 2026-10-12 20:31:51 (PDT)</w:t>
+        <w:t xml:space="preserve">Last modified: 2026-10-12 21:21:07 (PDT)</w:t>
       </w:r>
     </w:p>
     <w:p>
@@ -701,6 +701,115 @@
       </w:r>
       <w:r>
         <w:t xml:space="preserve">The two names mean the same thing.</w:t>
+      </w:r>
+      <w:r>
+        <w:t xml:space="preserve"> </w:t>
+      </w:r>
+      <w:r>
+        <w:t xml:space="preserve">Casella and Berger call it a</w:t>
+      </w:r>
+      <w:r>
+        <w:t xml:space="preserve"> </w:t>
+      </w:r>
+      <w:r>
+        <w:rPr>
+          <w:b/>
+          <w:bCs/>
+        </w:rPr>
+        <w:t xml:space="preserve">Borel field</w:t>
+      </w:r>
+      <w:r>
+        <w:t xml:space="preserve"> </w:t>
+      </w:r>
+      <w:r>
+        <w:t xml:space="preserve">(Casella and Berger 2002, Def. 1.2.1)</w:t>
+      </w:r>
+      <w:r>
+        <w:t xml:space="preserve">.</w:t>
+      </w:r>
+      <w:r>
+        <w:t xml:space="preserve"> </w:t>
+      </w:r>
+      <w:r>
+        <w:t xml:space="preserve">That is a different use of</w:t>
+      </w:r>
+      <w:r>
+        <w:t xml:space="preserve"> </w:t>
+      </w:r>
+      <w:r>
+        <w:t xml:space="preserve">“Borel”</w:t>
+      </w:r>
+      <w:r>
+        <w:t xml:space="preserve"> </w:t>
+      </w:r>
+      <w:r>
+        <w:t xml:space="preserve">from the</w:t>
+      </w:r>
+      <w:r>
+        <w:t xml:space="preserve"> </w:t>
+      </w:r>
+      <w:hyperlink w:anchor="def-borel-sigma-algebra">
+        <w:r>
+          <w:rPr>
+            <w:rStyle w:val="Hyperlink"/>
+          </w:rPr>
+          <w:t xml:space="preserve">Borel</w:t>
+        </w:r>
+        <w:r>
+          <w:rPr>
+            <w:rStyle w:val="Hyperlink"/>
+          </w:rPr>
+          <w:t xml:space="preserve"> </w:t>
+        </w:r>
+        <m:oMath>
+          <m:r>
+            <m:t>σ</m:t>
+          </m:r>
+        </m:oMath>
+        <w:r>
+          <w:rPr>
+            <w:rStyle w:val="Hyperlink"/>
+          </w:rPr>
+          <w:t xml:space="preserve">-algebra</w:t>
+        </w:r>
+      </w:hyperlink>
+      <w:r>
+        <w:t xml:space="preserve"> </w:t>
+      </w:r>
+      <w:r>
+        <w:t xml:space="preserve">on</w:t>
+      </w:r>
+      <w:r>
+        <w:t xml:space="preserve"> </w:t>
+      </w:r>
+      <m:oMath>
+        <m:r>
+          <m:rPr>
+            <m:scr m:val="double-struck"/>
+            <m:sty m:val="p"/>
+          </m:rPr>
+          <m:t>R</m:t>
+        </m:r>
+      </m:oMath>
+      <w:r>
+        <w:t xml:space="preserve">,</w:t>
+      </w:r>
+      <w:r>
+        <w:t xml:space="preserve"> </w:t>
+      </w:r>
+      <w:r>
+        <w:t xml:space="preserve">which is one particular</w:t>
+      </w:r>
+      <w:r>
+        <w:t xml:space="preserve"> </w:t>
+      </w:r>
+      <m:oMath>
+        <m:r>
+          <m:t>σ</m:t>
+        </m:r>
+      </m:oMath>
+      <w:r>
+        <w:t xml:space="preserve">-algebra.</w:t>
       </w:r>
     </w:p>
     <w:bookmarkEnd w:id="17"/>
@@ -42162,7 +42271,7 @@
       </w:r>
     </w:p>
     <w:bookmarkEnd w:id="137"/>
-    <w:bookmarkStart w:id="144" w:name="references"/>
+    <w:bookmarkStart w:id="146" w:name="references"/>
     <w:p>
       <w:pPr>
         <w:pStyle w:val="Heading2"/>
@@ -42171,7 +42280,7 @@
         <w:t xml:space="preserve">References</w:t>
       </w:r>
     </w:p>
-    <w:bookmarkStart w:id="143" w:name="refs"/>
+    <w:bookmarkStart w:id="145" w:name="refs"/>
     <w:bookmarkStart w:id="138" w:name="ref-billingsley1995probability"/>
     <w:p>
       <w:pPr>
@@ -42195,7 +42304,44 @@
       </w:r>
     </w:p>
     <w:bookmarkEnd w:id="138"/>
-    <w:bookmarkStart w:id="140" w:name="ref-folland1999real"/>
+    <w:bookmarkStart w:id="140" w:name="ref-CaseBerg01"/>
+    <w:p>
+      <w:pPr>
+        <w:pStyle w:val="Bibliography"/>
+      </w:pPr>
+      <w:r>
+        <w:t xml:space="preserve">Casella, George, and Roger Berger. 2002.</w:t>
+      </w:r>
+      <w:r>
+        <w:t xml:space="preserve"> </w:t>
+      </w:r>
+      <w:r>
+        <w:rPr>
+          <w:i/>
+          <w:iCs/>
+        </w:rPr>
+        <w:t xml:space="preserve">Statistical Inference</w:t>
+      </w:r>
+      <w:r>
+        <w:t xml:space="preserve">. 2nd ed. Cengage Learning.</w:t>
+      </w:r>
+      <w:r>
+        <w:t xml:space="preserve"> </w:t>
+      </w:r>
+      <w:hyperlink r:id="rId139">
+        <w:r>
+          <w:rPr>
+            <w:rStyle w:val="Hyperlink"/>
+          </w:rPr>
+          <w:t xml:space="preserve">https://www.cengage.com/c/statistical-inference-2e-casella-berger/9780534243128/</w:t>
+        </w:r>
+      </w:hyperlink>
+      <w:r>
+        <w:t xml:space="preserve">.</w:t>
+      </w:r>
+    </w:p>
+    <w:bookmarkEnd w:id="140"/>
+    <w:bookmarkStart w:id="142" w:name="ref-folland1999real"/>
     <w:p>
       <w:pPr>
         <w:pStyle w:val="Bibliography"/>
@@ -42219,7 +42365,7 @@
       <w:r>
         <w:t xml:space="preserve"> </w:t>
       </w:r>
-      <w:hyperlink r:id="rId139">
+      <w:hyperlink r:id="rId141">
         <w:r>
           <w:rPr>
             <w:rStyle w:val="Hyperlink"/>
@@ -42231,8 +42377,8 @@
         <w:t xml:space="preserve">.</w:t>
       </w:r>
     </w:p>
-    <w:bookmarkEnd w:id="140"/>
-    <w:bookmarkStart w:id="142" w:name="ref-gut2013"/>
+    <w:bookmarkEnd w:id="142"/>
+    <w:bookmarkStart w:id="144" w:name="ref-gut2013"/>
     <w:p>
       <w:pPr>
         <w:pStyle w:val="Bibliography"/>
@@ -42256,7 +42402,7 @@
       <w:r>
         <w:t xml:space="preserve"> </w:t>
       </w:r>
-      <w:hyperlink r:id="rId141">
+      <w:hyperlink r:id="rId143">
         <w:r>
           <w:rPr>
             <w:rStyle w:val="Hyperlink"/>
@@ -42268,9 +42414,9 @@
         <w:t xml:space="preserve">.</w:t>
       </w:r>
     </w:p>
-    <w:bookmarkEnd w:id="142"/>
-    <w:bookmarkEnd w:id="143"/>
     <w:bookmarkEnd w:id="144"/>
+    <w:bookmarkEnd w:id="145"/>
+    <w:bookmarkEnd w:id="146"/>
     <w:sectPr>
       <w:footnotePr>
         <w:numRestart w:val="eachSect"/>

</xml_diff>

<commit_message>
Deploying to gh-pages from @ Morrison-Lab/mds@a13e7bd01daca14432621f6f07bd41066bc1974d 🚀
</commit_message>
<xml_diff>
--- a/measures.docx
+++ b/measures.docx
@@ -15,7 +15,7 @@
         <w:pStyle w:val="Date"/>
       </w:pPr>
       <w:r>
-        <w:t xml:space="preserve">Last modified: 2026-10-13 01:20:47 (PDT)</w:t>
+        <w:t xml:space="preserve">Last modified: 2026-10-13 10:37:49 (PDT)</w:t>
       </w:r>
     </w:p>
     <w:p>
@@ -18503,7 +18503,7 @@
     </w:p>
     <w:bookmarkEnd w:id="73"/>
     <w:bookmarkEnd w:id="74"/>
-    <w:bookmarkStart w:id="97" w:name="measures"/>
+    <w:bookmarkStart w:id="98" w:name="measures"/>
     <w:p>
       <w:pPr>
         <w:pStyle w:val="Heading2"/>
@@ -22379,7 +22379,7 @@
       </m:oMathPara>
     </w:p>
     <w:bookmarkEnd w:id="88"/>
-    <w:bookmarkStart w:id="90" w:name="rem-measure-size"/>
+    <w:bookmarkStart w:id="91" w:name="rem-measure-size"/>
     <w:p>
       <w:pPr>
         <w:pStyle w:val="FirstParagraph"/>
@@ -22799,15 +22799,35 @@
           <w:rPr>
             <w:rStyle w:val="Hyperlink"/>
           </w:rPr>
-          <w:t xml:space="preserve">Fubini–Tonelli theorem</w:t>
+          <w:t xml:space="preserve">Tonelli</w:t>
         </w:r>
       </w:hyperlink>
       <w:r>
-        <w:t xml:space="preserve">.</w:t>
+        <w:t xml:space="preserve"> </w:t>
+      </w:r>
+      <w:r>
+        <w:t xml:space="preserve">and</w:t>
+      </w:r>
+      <w:r>
+        <w:t xml:space="preserve"> </w:t>
+      </w:r>
+      <w:hyperlink r:id="rId90">
+        <w:r>
+          <w:rPr>
+            <w:rStyle w:val="Hyperlink"/>
+          </w:rPr>
+          <w:t xml:space="preserve">Fubini</w:t>
+        </w:r>
+      </w:hyperlink>
+      <w:r>
+        <w:t xml:space="preserve"> </w:t>
+      </w:r>
+      <w:r>
+        <w:t xml:space="preserve">theorems.</w:t>
       </w:r>
     </w:p>
-    <w:bookmarkEnd w:id="90"/>
-    <w:bookmarkStart w:id="91" w:name="def-measure-zero"/>
+    <w:bookmarkEnd w:id="91"/>
+    <w:bookmarkStart w:id="92" w:name="def-measure-zero"/>
     <w:p>
       <w:pPr>
         <w:pStyle w:val="BodyText"/>
@@ -23005,8 +23025,8 @@
         <w:t xml:space="preserve">.</w:t>
       </w:r>
     </w:p>
-    <w:bookmarkEnd w:id="91"/>
-    <w:bookmarkStart w:id="92" w:name="exm-measure-zero"/>
+    <w:bookmarkEnd w:id="92"/>
+    <w:bookmarkStart w:id="93" w:name="exm-measure-zero"/>
     <w:p>
       <w:pPr>
         <w:pStyle w:val="BodyText"/>
@@ -23180,8 +23200,8 @@
         <w:t xml:space="preserve">although neither set is empty.</w:t>
       </w:r>
     </w:p>
-    <w:bookmarkEnd w:id="92"/>
-    <w:bookmarkStart w:id="93" w:name="def-almost-everywhere"/>
+    <w:bookmarkEnd w:id="93"/>
+    <w:bookmarkStart w:id="94" w:name="def-almost-everywhere"/>
     <w:p>
       <w:pPr>
         <w:pStyle w:val="FirstParagraph"/>
@@ -23431,8 +23451,8 @@
         <w:t xml:space="preserve">.</w:t>
       </w:r>
     </w:p>
-    <w:bookmarkEnd w:id="93"/>
-    <w:bookmarkStart w:id="94" w:name="exm-almost-everywhere"/>
+    <w:bookmarkEnd w:id="94"/>
+    <w:bookmarkStart w:id="95" w:name="exm-almost-everywhere"/>
     <w:p>
       <w:pPr>
         <w:pStyle w:val="BodyText"/>
@@ -23823,8 +23843,8 @@
         <w:t xml:space="preserve">so a statement holds almost everywhere only if it holds everywhere.</w:t>
       </w:r>
     </w:p>
-    <w:bookmarkEnd w:id="94"/>
-    <w:bookmarkStart w:id="95" w:name="def-sigma-finite"/>
+    <w:bookmarkEnd w:id="95"/>
+    <w:bookmarkStart w:id="96" w:name="def-sigma-finite"/>
     <w:p>
       <w:pPr>
         <w:pStyle w:val="BodyText"/>
@@ -24226,8 +24246,8 @@
         <w:t xml:space="preserve">.</w:t>
       </w:r>
     </w:p>
-    <w:bookmarkEnd w:id="95"/>
-    <w:bookmarkStart w:id="96" w:name="exm-sigma-finite"/>
+    <w:bookmarkEnd w:id="96"/>
+    <w:bookmarkStart w:id="97" w:name="exm-sigma-finite"/>
     <w:p>
       <w:pPr>
         <w:pStyle w:val="BodyText"/>
@@ -25070,9 +25090,9 @@
         <w:t xml:space="preserve">.</w:t>
       </w:r>
     </w:p>
-    <w:bookmarkEnd w:id="96"/>
     <w:bookmarkEnd w:id="97"/>
-    <w:bookmarkStart w:id="101" w:name="probability-measures"/>
+    <w:bookmarkEnd w:id="98"/>
+    <w:bookmarkStart w:id="102" w:name="probability-measures"/>
     <w:p>
       <w:pPr>
         <w:pStyle w:val="Heading2"/>
@@ -25081,7 +25101,7 @@
         <w:t xml:space="preserve">6 Probability measures</w:t>
       </w:r>
     </w:p>
-    <w:bookmarkStart w:id="98" w:name="def-probability-measure"/>
+    <w:bookmarkStart w:id="99" w:name="def-probability-measure"/>
     <w:p>
       <w:pPr>
         <w:pStyle w:val="FirstParagraph"/>
@@ -25470,8 +25490,8 @@
         <w:t xml:space="preserve">.</w:t>
       </w:r>
     </w:p>
-    <w:bookmarkEnd w:id="98"/>
-    <w:bookmarkStart w:id="99" w:name="exm-probability-measure"/>
+    <w:bookmarkEnd w:id="99"/>
+    <w:bookmarkStart w:id="100" w:name="exm-probability-measure"/>
     <w:p>
       <w:pPr>
         <w:pStyle w:val="BodyText"/>
@@ -26433,8 +26453,8 @@
         <w:t xml:space="preserve">.</w:t>
       </w:r>
     </w:p>
-    <w:bookmarkEnd w:id="99"/>
-    <w:bookmarkStart w:id="100" w:name="rem-mutually-exclusive"/>
+    <w:bookmarkEnd w:id="100"/>
+    <w:bookmarkStart w:id="101" w:name="rem-mutually-exclusive"/>
     <w:p>
       <w:pPr>
         <w:pStyle w:val="FirstParagraph"/>
@@ -26646,9 +26666,9 @@
         <w:t xml:space="preserve">no roll is both even and odd.</w:t>
       </w:r>
     </w:p>
-    <w:bookmarkEnd w:id="100"/>
     <w:bookmarkEnd w:id="101"/>
-    <w:bookmarkStart w:id="119" w:name="measurable-functions-and-integrals"/>
+    <w:bookmarkEnd w:id="102"/>
+    <w:bookmarkStart w:id="120" w:name="measurable-functions-and-integrals"/>
     <w:p>
       <w:pPr>
         <w:pStyle w:val="Heading2"/>
@@ -26657,7 +26677,7 @@
         <w:t xml:space="preserve">7 Measurable functions and integrals</w:t>
       </w:r>
     </w:p>
-    <w:bookmarkStart w:id="102" w:name="def-measurable-function"/>
+    <w:bookmarkStart w:id="103" w:name="def-measurable-function"/>
     <w:p>
       <w:pPr>
         <w:pStyle w:val="FirstParagraph"/>
@@ -26950,8 +26970,8 @@
         </m:oMath>
       </m:oMathPara>
     </w:p>
-    <w:bookmarkEnd w:id="102"/>
-    <w:bookmarkStart w:id="104" w:name="rem-measurable-function-general"/>
+    <w:bookmarkEnd w:id="103"/>
+    <w:bookmarkStart w:id="105" w:name="rem-measurable-function-general"/>
     <w:p>
       <w:pPr>
         <w:pStyle w:val="FirstParagraph"/>
@@ -27284,7 +27304,7 @@
       <w:r>
         <w:t xml:space="preserve"> </w:t>
       </w:r>
-      <w:hyperlink r:id="rId103">
+      <w:hyperlink r:id="rId104">
         <w:r>
           <w:rPr>
             <w:rStyle w:val="Hyperlink"/>
@@ -27460,8 +27480,8 @@
         <w:t xml:space="preserve">.</w:t>
       </w:r>
     </w:p>
-    <w:bookmarkEnd w:id="104"/>
-    <w:bookmarkStart w:id="105" w:name="exm-measurable-function"/>
+    <w:bookmarkEnd w:id="105"/>
+    <w:bookmarkStart w:id="106" w:name="exm-measurable-function"/>
     <w:p>
       <w:pPr>
         <w:pStyle w:val="BodyText"/>
@@ -28382,8 +28402,8 @@
         <w:t xml:space="preserve">, is measurable.</w:t>
       </w:r>
     </w:p>
-    <w:bookmarkEnd w:id="105"/>
-    <w:bookmarkStart w:id="108" w:name="def-integral-nonneg"/>
+    <w:bookmarkEnd w:id="106"/>
+    <w:bookmarkStart w:id="109" w:name="def-integral-nonneg"/>
     <w:p>
       <w:pPr>
         <w:pStyle w:val="BodyText"/>
@@ -28808,7 +28828,7 @@
       <w:r>
         <w:t xml:space="preserve"> </w:t>
       </w:r>
-      <w:hyperlink r:id="rId106">
+      <w:hyperlink r:id="rId107">
         <w:r>
           <w:rPr>
             <w:rStyle w:val="Hyperlink"/>
@@ -28998,7 +29018,7 @@
       <w:r>
         <w:t xml:space="preserve"> </w:t>
       </w:r>
-      <w:hyperlink r:id="rId107">
+      <w:hyperlink r:id="rId108">
         <w:r>
           <w:rPr>
             <w:rStyle w:val="Hyperlink"/>
@@ -29290,8 +29310,8 @@
         <w:t xml:space="preserve">(Billingsley 1995, sec. 15)</w:t>
       </w:r>
     </w:p>
-    <w:bookmarkEnd w:id="108"/>
-    <w:bookmarkStart w:id="111" w:name="rem-integral-nonneg-lower-sums"/>
+    <w:bookmarkEnd w:id="109"/>
+    <w:bookmarkStart w:id="112" w:name="rem-integral-nonneg-lower-sums"/>
     <w:p>
       <w:pPr>
         <w:pStyle w:val="BodyText"/>
@@ -29456,7 +29476,7 @@
       <w:r>
         <w:t xml:space="preserve"> </w:t>
       </w:r>
-      <w:hyperlink r:id="rId109">
+      <w:hyperlink r:id="rId110">
         <w:r>
           <w:rPr>
             <w:rStyle w:val="Hyperlink"/>
@@ -29628,7 +29648,7 @@
       <w:r>
         <w:t xml:space="preserve"> </w:t>
       </w:r>
-      <w:hyperlink r:id="rId110">
+      <w:hyperlink r:id="rId111">
         <w:r>
           <w:rPr>
             <w:rStyle w:val="Hyperlink"/>
@@ -29640,8 +29660,8 @@
         <w:t xml:space="preserve">).</w:t>
       </w:r>
     </w:p>
-    <w:bookmarkEnd w:id="111"/>
-    <w:bookmarkStart w:id="112" w:name="exm-integral-nonneg"/>
+    <w:bookmarkEnd w:id="112"/>
+    <w:bookmarkStart w:id="113" w:name="exm-integral-nonneg"/>
     <w:p>
       <w:pPr>
         <w:pStyle w:val="BodyText"/>
@@ -31069,8 +31089,8 @@
         <w:t xml:space="preserve">.</w:t>
       </w:r>
     </w:p>
-    <w:bookmarkEnd w:id="112"/>
-    <w:bookmarkStart w:id="113" w:name="def-integral"/>
+    <w:bookmarkEnd w:id="113"/>
+    <w:bookmarkStart w:id="114" w:name="def-integral"/>
     <w:p>
       <w:pPr>
         <w:pStyle w:val="BodyText"/>
@@ -31992,8 +32012,8 @@
         <w:t xml:space="preserve">(Billingsley 1995, sec. 15)</w:t>
       </w:r>
     </w:p>
-    <w:bookmarkEnd w:id="113"/>
-    <w:bookmarkStart w:id="114" w:name="exm-integral"/>
+    <w:bookmarkEnd w:id="114"/>
+    <w:bookmarkStart w:id="115" w:name="exm-integral"/>
     <w:p>
       <w:pPr>
         <w:pStyle w:val="BodyText"/>
@@ -32731,8 +32751,8 @@
         </m:oMath>
       </m:oMathPara>
     </w:p>
-    <w:bookmarkEnd w:id="114"/>
-    <w:bookmarkStart w:id="116" w:name="def-absolutely-integrable"/>
+    <w:bookmarkEnd w:id="115"/>
+    <w:bookmarkStart w:id="117" w:name="def-absolutely-integrable"/>
     <w:p>
       <w:pPr>
         <w:pStyle w:val="FirstParagraph"/>
@@ -32923,7 +32943,7 @@
       <w:r>
         <w:t xml:space="preserve"> </w:t>
       </w:r>
-      <w:hyperlink r:id="rId115">
+      <w:hyperlink r:id="rId116">
         <w:r>
           <w:rPr>
             <w:rStyle w:val="Hyperlink"/>
@@ -33031,8 +33051,8 @@
         <w:t xml:space="preserve">.</w:t>
       </w:r>
     </w:p>
-    <w:bookmarkEnd w:id="116"/>
-    <w:bookmarkStart w:id="117" w:name="rem-absolutely-integrable-integral"/>
+    <w:bookmarkEnd w:id="117"/>
+    <w:bookmarkStart w:id="118" w:name="rem-absolutely-integrable-integral"/>
     <w:p>
       <w:pPr>
         <w:pStyle w:val="BodyText"/>
@@ -33448,8 +33468,8 @@
         <w:t xml:space="preserve">) is a real number.</w:t>
       </w:r>
     </w:p>
-    <w:bookmarkEnd w:id="117"/>
-    <w:bookmarkStart w:id="118" w:name="exm-absolutely-integrable"/>
+    <w:bookmarkEnd w:id="118"/>
+    <w:bookmarkStart w:id="119" w:name="exm-absolutely-integrable"/>
     <w:p>
       <w:pPr>
         <w:pStyle w:val="BodyText"/>
@@ -33953,9 +33973,9 @@
         <w:t xml:space="preserve">).</w:t>
       </w:r>
     </w:p>
-    <w:bookmarkEnd w:id="118"/>
     <w:bookmarkEnd w:id="119"/>
-    <w:bookmarkStart w:id="130" w:name="lp-spaces"/>
+    <w:bookmarkEnd w:id="120"/>
+    <w:bookmarkStart w:id="131" w:name="lp-spaces"/>
     <w:p>
       <w:pPr>
         <w:pStyle w:val="Heading2"/>
@@ -33987,7 +34007,7 @@
         <w:t xml:space="preserve">spaces</w:t>
       </w:r>
     </w:p>
-    <w:bookmarkStart w:id="121" w:name="def-lp-space"/>
+    <w:bookmarkStart w:id="122" w:name="def-lp-space"/>
     <w:p>
       <w:pPr>
         <w:pStyle w:val="FirstParagraph"/>
@@ -34629,7 +34649,7 @@
       <w:r>
         <w:t xml:space="preserve"> </w:t>
       </w:r>
-      <w:hyperlink r:id="rId120">
+      <w:hyperlink r:id="rId121">
         <w:r>
           <w:rPr>
             <w:rStyle w:val="Hyperlink"/>
@@ -35239,8 +35259,8 @@
         <w:t xml:space="preserve">consists of equivalence classes of essentially bounded measurable functions.</w:t>
       </w:r>
     </w:p>
-    <w:bookmarkEnd w:id="121"/>
-    <w:bookmarkStart w:id="122" w:name="exm-lp-space"/>
+    <w:bookmarkEnd w:id="122"/>
+    <w:bookmarkStart w:id="123" w:name="exm-lp-space"/>
     <w:p>
       <w:pPr>
         <w:pStyle w:val="BodyText"/>
@@ -36481,8 +36501,8 @@
         <w:t xml:space="preserve">on finite-measure sets: higher exponents impose stricter integrability requirements near singularities.</w:t>
       </w:r>
     </w:p>
-    <w:bookmarkEnd w:id="122"/>
-    <w:bookmarkStart w:id="123" w:name="thm-holder-inequality"/>
+    <w:bookmarkEnd w:id="123"/>
+    <w:bookmarkStart w:id="124" w:name="thm-holder-inequality"/>
     <w:p>
       <w:pPr>
         <w:pStyle w:val="BodyText"/>
@@ -37206,8 +37226,8 @@
         <w:t xml:space="preserve">this inequality is the Cauchy-Schwarz inequality for integrals.</w:t>
       </w:r>
     </w:p>
-    <w:bookmarkEnd w:id="123"/>
-    <w:bookmarkStart w:id="124" w:name="thm-minkowski-inequality"/>
+    <w:bookmarkEnd w:id="124"/>
+    <w:bookmarkStart w:id="125" w:name="thm-minkowski-inequality"/>
     <w:p>
       <w:pPr>
         <w:pStyle w:val="BodyText"/>
@@ -37760,7 +37780,7 @@
       <w:r>
         <w:t xml:space="preserve"> </w:t>
       </w:r>
-      <w:hyperlink r:id="rId120">
+      <w:hyperlink r:id="rId121">
         <w:r>
           <w:rPr>
             <w:rStyle w:val="Hyperlink"/>
@@ -37772,8 +37792,8 @@
         <w:t xml:space="preserve">.</w:t>
       </w:r>
     </w:p>
-    <w:bookmarkEnd w:id="124"/>
-    <w:bookmarkStart w:id="126" w:name="exm-holder-inequality"/>
+    <w:bookmarkEnd w:id="125"/>
+    <w:bookmarkStart w:id="127" w:name="exm-holder-inequality"/>
     <w:p>
       <w:pPr>
         <w:pStyle w:val="BodyText"/>
@@ -38432,7 +38452,7 @@
       <w:r>
         <w:t xml:space="preserve"> </w:t>
       </w:r>
-      <w:hyperlink r:id="rId125">
+      <w:hyperlink r:id="rId126">
         <w:r>
           <w:rPr>
             <w:rStyle w:val="Hyperlink"/>
@@ -38709,8 +38729,8 @@
         <w:t xml:space="preserve">guaranteeing that the covariance between any two square-integrable random variables is finite.</w:t>
       </w:r>
     </w:p>
-    <w:bookmarkEnd w:id="126"/>
-    <w:bookmarkStart w:id="129" w:name="rem-lp-spaces-machine-learning"/>
+    <w:bookmarkEnd w:id="127"/>
+    <w:bookmarkStart w:id="130" w:name="rem-lp-spaces-machine-learning"/>
     <w:p>
       <w:pPr>
         <w:pStyle w:val="FirstParagraph"/>
@@ -39113,7 +39133,7 @@
       <w:r>
         <w:t xml:space="preserve"> </w:t>
       </w:r>
-      <w:hyperlink r:id="rId127">
+      <w:hyperlink r:id="rId128">
         <w:r>
           <w:rPr>
             <w:rStyle w:val="Hyperlink"/>
@@ -39490,7 +39510,7 @@
       <w:r>
         <w:t xml:space="preserve"> </w:t>
       </w:r>
-      <w:hyperlink r:id="rId128">
+      <w:hyperlink r:id="rId129">
         <w:r>
           <w:rPr>
             <w:rStyle w:val="Hyperlink"/>
@@ -40037,9 +40057,9 @@
         <w:t xml:space="preserve">minimizes the worst-case maximum error across all instances.</w:t>
       </w:r>
     </w:p>
-    <w:bookmarkEnd w:id="129"/>
     <w:bookmarkEnd w:id="130"/>
-    <w:bookmarkStart w:id="136" w:name="product-measures"/>
+    <w:bookmarkEnd w:id="131"/>
+    <w:bookmarkStart w:id="137" w:name="product-measures"/>
     <w:p>
       <w:pPr>
         <w:pStyle w:val="Heading2"/>
@@ -40048,7 +40068,7 @@
         <w:t xml:space="preserve">9 Product measures</w:t>
       </w:r>
     </w:p>
-    <w:bookmarkStart w:id="132" w:name="def-product-sigma-algebra"/>
+    <w:bookmarkStart w:id="133" w:name="def-product-sigma-algebra"/>
     <w:p>
       <w:pPr>
         <w:pStyle w:val="FirstParagraph"/>
@@ -40202,7 +40222,7 @@
       <w:r>
         <w:t xml:space="preserve"> </w:t>
       </w:r>
-      <w:hyperlink r:id="rId131">
+      <w:hyperlink r:id="rId132">
         <w:r>
           <w:rPr>
             <w:rStyle w:val="Hyperlink"/>
@@ -40396,8 +40416,8 @@
         <w:t xml:space="preserve">the measurable rectangles.</w:t>
       </w:r>
     </w:p>
-    <w:bookmarkEnd w:id="132"/>
-    <w:bookmarkStart w:id="133" w:name="exm-product-sigma-algebra"/>
+    <w:bookmarkEnd w:id="133"/>
+    <w:bookmarkStart w:id="134" w:name="exm-product-sigma-algebra"/>
     <w:p>
       <w:pPr>
         <w:pStyle w:val="BodyText"/>
@@ -40896,8 +40916,8 @@
         <w:t xml:space="preserve">.</w:t>
       </w:r>
     </w:p>
-    <w:bookmarkEnd w:id="133"/>
-    <w:bookmarkStart w:id="134" w:name="def-product-measure"/>
+    <w:bookmarkEnd w:id="134"/>
+    <w:bookmarkStart w:id="135" w:name="def-product-measure"/>
     <w:p>
       <w:pPr>
         <w:pStyle w:val="FirstParagraph"/>
@@ -41507,8 +41527,8 @@
         <w:t xml:space="preserve">.</w:t>
       </w:r>
     </w:p>
-    <w:bookmarkEnd w:id="134"/>
-    <w:bookmarkStart w:id="135" w:name="exm-product-measure"/>
+    <w:bookmarkEnd w:id="135"/>
+    <w:bookmarkStart w:id="136" w:name="exm-product-measure"/>
     <w:p>
       <w:pPr>
         <w:pStyle w:val="BodyText"/>
@@ -42165,9 +42185,9 @@
         <w:t xml:space="preserve">the area of the rectangle.</w:t>
       </w:r>
     </w:p>
-    <w:bookmarkEnd w:id="135"/>
     <w:bookmarkEnd w:id="136"/>
-    <w:bookmarkStart w:id="137" w:name="sec-further-reading"/>
+    <w:bookmarkEnd w:id="137"/>
+    <w:bookmarkStart w:id="138" w:name="sec-further-reading"/>
     <w:p>
       <w:pPr>
         <w:pStyle w:val="Heading2"/>
@@ -42270,8 +42290,8 @@
         <w:t xml:space="preserve">that opens with a chapter on introductory measure theory.</w:t>
       </w:r>
     </w:p>
-    <w:bookmarkEnd w:id="137"/>
-    <w:bookmarkStart w:id="146" w:name="references"/>
+    <w:bookmarkEnd w:id="138"/>
+    <w:bookmarkStart w:id="147" w:name="references"/>
     <w:p>
       <w:pPr>
         <w:pStyle w:val="Heading2"/>
@@ -42280,8 +42300,8 @@
         <w:t xml:space="preserve">References</w:t>
       </w:r>
     </w:p>
-    <w:bookmarkStart w:id="145" w:name="refs"/>
-    <w:bookmarkStart w:id="138" w:name="ref-billingsley1995probability"/>
+    <w:bookmarkStart w:id="146" w:name="refs"/>
+    <w:bookmarkStart w:id="139" w:name="ref-billingsley1995probability"/>
     <w:p>
       <w:pPr>
         <w:pStyle w:val="Bibliography"/>
@@ -42303,8 +42323,8 @@
         <w:t xml:space="preserve">. 3rd ed. Wiley Series in Probability and Mathematical Statistics. Wiley.</w:t>
       </w:r>
     </w:p>
-    <w:bookmarkEnd w:id="138"/>
-    <w:bookmarkStart w:id="140" w:name="ref-CaseBerg01"/>
+    <w:bookmarkEnd w:id="139"/>
+    <w:bookmarkStart w:id="141" w:name="ref-CaseBerg01"/>
     <w:p>
       <w:pPr>
         <w:pStyle w:val="Bibliography"/>
@@ -42328,7 +42348,7 @@
       <w:r>
         <w:t xml:space="preserve"> </w:t>
       </w:r>
-      <w:hyperlink r:id="rId139">
+      <w:hyperlink r:id="rId140">
         <w:r>
           <w:rPr>
             <w:rStyle w:val="Hyperlink"/>
@@ -42340,8 +42360,8 @@
         <w:t xml:space="preserve">.</w:t>
       </w:r>
     </w:p>
-    <w:bookmarkEnd w:id="140"/>
-    <w:bookmarkStart w:id="142" w:name="ref-folland1999real"/>
+    <w:bookmarkEnd w:id="141"/>
+    <w:bookmarkStart w:id="143" w:name="ref-folland1999real"/>
     <w:p>
       <w:pPr>
         <w:pStyle w:val="Bibliography"/>
@@ -42365,7 +42385,7 @@
       <w:r>
         <w:t xml:space="preserve"> </w:t>
       </w:r>
-      <w:hyperlink r:id="rId141">
+      <w:hyperlink r:id="rId142">
         <w:r>
           <w:rPr>
             <w:rStyle w:val="Hyperlink"/>
@@ -42377,8 +42397,8 @@
         <w:t xml:space="preserve">.</w:t>
       </w:r>
     </w:p>
-    <w:bookmarkEnd w:id="142"/>
-    <w:bookmarkStart w:id="144" w:name="ref-gut2013"/>
+    <w:bookmarkEnd w:id="143"/>
+    <w:bookmarkStart w:id="145" w:name="ref-gut2013"/>
     <w:p>
       <w:pPr>
         <w:pStyle w:val="Bibliography"/>
@@ -42402,7 +42422,7 @@
       <w:r>
         <w:t xml:space="preserve"> </w:t>
       </w:r>
-      <w:hyperlink r:id="rId143">
+      <w:hyperlink r:id="rId144">
         <w:r>
           <w:rPr>
             <w:rStyle w:val="Hyperlink"/>
@@ -42414,9 +42434,9 @@
         <w:t xml:space="preserve">.</w:t>
       </w:r>
     </w:p>
-    <w:bookmarkEnd w:id="144"/>
     <w:bookmarkEnd w:id="145"/>
     <w:bookmarkEnd w:id="146"/>
+    <w:bookmarkEnd w:id="147"/>
     <w:sectPr>
       <w:footnotePr>
         <w:numRestart w:val="eachSect"/>

</xml_diff>

<commit_message>
Deploying to gh-pages from @ Morrison-Lab/mds@d7272de415edafdc3da32df4051823d5f5809500 🚀
</commit_message>
<xml_diff>
--- a/measures.docx
+++ b/measures.docx
@@ -15,7 +15,7 @@
         <w:pStyle w:val="Date"/>
       </w:pPr>
       <w:r>
-        <w:t xml:space="preserve">Last modified: 2026-10-13 19:28:53 (PDT)</w:t>
+        <w:t xml:space="preserve">Last modified: 2026-10-13 20:27:09 (PDT)</w:t>
       </w:r>
     </w:p>
     <w:p>
@@ -106,7 +106,7 @@
           <w:rPr>
             <w:rStyle w:val="Hyperlink"/>
           </w:rPr>
-          <w:t xml:space="preserve">Definition 19</w:t>
+          <w:t xml:space="preserve">Definition 20</w:t>
         </w:r>
       </w:hyperlink>
       <w:r>
@@ -18503,7 +18503,7 @@
     </w:p>
     <w:bookmarkEnd w:id="74"/>
     <w:bookmarkEnd w:id="75"/>
-    <w:bookmarkStart w:id="99" w:name="measures"/>
+    <w:bookmarkStart w:id="100" w:name="measures"/>
     <w:p>
       <w:pPr>
         <w:pStyle w:val="Heading2"/>
@@ -21374,92 +21374,6 @@
         <w:t xml:space="preserve">.</w:t>
       </w:r>
     </w:p>
-    <w:p>
-      <w:pPr>
-        <w:pStyle w:val="BodyText"/>
-      </w:pPr>
-      <w:r>
-        <w:rPr>
-          <w:b/>
-          <w:bCs/>
-        </w:rPr>
-        <w:t xml:space="preserve">Lebesgue measure on an interval</w:t>
-      </w:r>
-      <w:r>
-        <w:t xml:space="preserve"> </w:t>
-      </w:r>
-      <m:oMath>
-        <m:r>
-          <m:t>I</m:t>
-        </m:r>
-      </m:oMath>
-      <w:r>
-        <w:t xml:space="preserve">, such as</w:t>
-      </w:r>
-      <w:r>
-        <w:t xml:space="preserve"> </w:t>
-      </w:r>
-      <m:oMath>
-        <m:r>
-          <m:rPr>
-            <m:sty m:val="p"/>
-          </m:rPr>
-          <m:t>[</m:t>
-        </m:r>
-        <m:r>
-          <m:t>0</m:t>
-        </m:r>
-        <m:r>
-          <m:rPr>
-            <m:sty m:val="p"/>
-          </m:rPr>
-          <m:t>,</m:t>
-        </m:r>
-        <m:r>
-          <m:t>1</m:t>
-        </m:r>
-        <m:r>
-          <m:rPr>
-            <m:sty m:val="p"/>
-          </m:rPr>
-          <m:t>]</m:t>
-        </m:r>
-      </m:oMath>
-      <w:r>
-        <w:t xml:space="preserve">,</w:t>
-      </w:r>
-      <w:r>
-        <w:t xml:space="preserve"> </w:t>
-      </w:r>
-      <w:r>
-        <w:t xml:space="preserve">is</w:t>
-      </w:r>
-      <w:r>
-        <w:t xml:space="preserve"> </w:t>
-      </w:r>
-      <m:oMath>
-        <m:r>
-          <m:t>λ</m:t>
-        </m:r>
-      </m:oMath>
-      <w:r>
-        <w:t xml:space="preserve"> </w:t>
-      </w:r>
-      <w:r>
-        <w:t xml:space="preserve">applied only to the Borel sets that are subsets of</w:t>
-      </w:r>
-      <w:r>
-        <w:t xml:space="preserve"> </w:t>
-      </w:r>
-      <m:oMath>
-        <m:r>
-          <m:t>I</m:t>
-        </m:r>
-      </m:oMath>
-      <w:r>
-        <w:t xml:space="preserve">.</w:t>
-      </w:r>
-    </w:p>
     <w:bookmarkEnd w:id="86"/>
     <w:bookmarkStart w:id="88" w:name="rem-lebesgue-measure-exists"/>
     <w:p>
@@ -21562,7 +21476,116 @@
       </w:r>
     </w:p>
     <w:bookmarkEnd w:id="88"/>
-    <w:bookmarkStart w:id="89" w:name="exm-lebesgue-measure"/>
+    <w:bookmarkStart w:id="89" w:name="def-lebesgue-measure-interval"/>
+    <w:p>
+      <w:pPr>
+        <w:pStyle w:val="BodyText"/>
+      </w:pPr>
+      <w:r>
+        <w:rPr>
+          <w:b/>
+          <w:bCs/>
+        </w:rPr>
+        <w:t xml:space="preserve">Definition 16 (Lebesgue measure on an interval)</w:t>
+      </w:r>
+      <w:r>
+        <w:t xml:space="preserve"> </w:t>
+      </w:r>
+      <w:r>
+        <w:rPr>
+          <w:b/>
+          <w:bCs/>
+        </w:rPr>
+        <w:t xml:space="preserve">Lebesgue measure on an interval</w:t>
+      </w:r>
+      <w:r>
+        <w:t xml:space="preserve"> </w:t>
+      </w:r>
+      <m:oMath>
+        <m:r>
+          <m:t>I</m:t>
+        </m:r>
+      </m:oMath>
+      <w:r>
+        <w:t xml:space="preserve">, such as</w:t>
+      </w:r>
+      <w:r>
+        <w:t xml:space="preserve"> </w:t>
+      </w:r>
+      <m:oMath>
+        <m:r>
+          <m:rPr>
+            <m:sty m:val="p"/>
+          </m:rPr>
+          <m:t>[</m:t>
+        </m:r>
+        <m:r>
+          <m:t>0</m:t>
+        </m:r>
+        <m:r>
+          <m:rPr>
+            <m:sty m:val="p"/>
+          </m:rPr>
+          <m:t>,</m:t>
+        </m:r>
+        <m:r>
+          <m:t>1</m:t>
+        </m:r>
+        <m:r>
+          <m:rPr>
+            <m:sty m:val="p"/>
+          </m:rPr>
+          <m:t>]</m:t>
+        </m:r>
+      </m:oMath>
+      <w:r>
+        <w:t xml:space="preserve">,</w:t>
+      </w:r>
+      <w:r>
+        <w:t xml:space="preserve"> </w:t>
+      </w:r>
+      <w:r>
+        <w:t xml:space="preserve">is</w:t>
+      </w:r>
+      <w:r>
+        <w:t xml:space="preserve"> </w:t>
+      </w:r>
+      <m:oMath>
+        <m:r>
+          <m:t>λ</m:t>
+        </m:r>
+      </m:oMath>
+      <w:r>
+        <w:t xml:space="preserve"> </w:t>
+      </w:r>
+      <w:r>
+        <w:t xml:space="preserve">(</w:t>
+      </w:r>
+      <w:hyperlink w:anchor="def-lebesgue-measure">
+        <w:r>
+          <w:rPr>
+            <w:rStyle w:val="Hyperlink"/>
+          </w:rPr>
+          <w:t xml:space="preserve">Definition 15</w:t>
+        </w:r>
+      </w:hyperlink>
+      <w:r>
+        <w:t xml:space="preserve">) applied only to the Borel sets that are subsets of</w:t>
+      </w:r>
+      <w:r>
+        <w:t xml:space="preserve"> </w:t>
+      </w:r>
+      <m:oMath>
+        <m:r>
+          <m:t>I</m:t>
+        </m:r>
+      </m:oMath>
+      <w:r>
+        <w:t xml:space="preserve">.</w:t>
+      </w:r>
+    </w:p>
+    <w:bookmarkEnd w:id="89"/>
+    <w:bookmarkStart w:id="90" w:name="exm-lebesgue-measure"/>
     <w:p>
       <w:pPr>
         <w:pStyle w:val="BodyText"/>
@@ -22378,8 +22401,8 @@
         </m:oMath>
       </m:oMathPara>
     </w:p>
-    <w:bookmarkEnd w:id="89"/>
-    <w:bookmarkStart w:id="92" w:name="rem-measure-size"/>
+    <w:bookmarkEnd w:id="90"/>
+    <w:bookmarkStart w:id="93" w:name="rem-measure-size"/>
     <w:p>
       <w:pPr>
         <w:pStyle w:val="FirstParagraph"/>
@@ -22794,7 +22817,7 @@
       <w:r>
         <w:t xml:space="preserve"> </w:t>
       </w:r>
-      <w:hyperlink r:id="rId90">
+      <w:hyperlink r:id="rId91">
         <w:r>
           <w:rPr>
             <w:rStyle w:val="Hyperlink"/>
@@ -22811,7 +22834,7 @@
       <w:r>
         <w:t xml:space="preserve"> </w:t>
       </w:r>
-      <w:hyperlink r:id="rId91">
+      <w:hyperlink r:id="rId92">
         <w:r>
           <w:rPr>
             <w:rStyle w:val="Hyperlink"/>
@@ -22826,8 +22849,8 @@
         <w:t xml:space="preserve">theorems.</w:t>
       </w:r>
     </w:p>
-    <w:bookmarkEnd w:id="92"/>
-    <w:bookmarkStart w:id="93" w:name="def-measure-zero"/>
+    <w:bookmarkEnd w:id="93"/>
+    <w:bookmarkStart w:id="94" w:name="def-measure-zero"/>
     <w:p>
       <w:pPr>
         <w:pStyle w:val="BodyText"/>
@@ -22837,7 +22860,7 @@
           <w:b/>
           <w:bCs/>
         </w:rPr>
-        <w:t xml:space="preserve">Definition 16 (Measure zero (null set))</w:t>
+        <w:t xml:space="preserve">Definition 17 (Measure zero (null set))</w:t>
       </w:r>
       <w:r>
         <w:t xml:space="preserve"> </w:t>
@@ -23025,8 +23048,8 @@
         <w:t xml:space="preserve">.</w:t>
       </w:r>
     </w:p>
-    <w:bookmarkEnd w:id="93"/>
-    <w:bookmarkStart w:id="94" w:name="exm-measure-zero"/>
+    <w:bookmarkEnd w:id="94"/>
+    <w:bookmarkStart w:id="95" w:name="exm-measure-zero"/>
     <w:p>
       <w:pPr>
         <w:pStyle w:val="BodyText"/>
@@ -23200,8 +23223,8 @@
         <w:t xml:space="preserve">although neither set is empty.</w:t>
       </w:r>
     </w:p>
-    <w:bookmarkEnd w:id="94"/>
-    <w:bookmarkStart w:id="95" w:name="def-almost-everywhere"/>
+    <w:bookmarkEnd w:id="95"/>
+    <w:bookmarkStart w:id="96" w:name="def-almost-everywhere"/>
     <w:p>
       <w:pPr>
         <w:pStyle w:val="FirstParagraph"/>
@@ -23211,7 +23234,7 @@
           <w:b/>
           <w:bCs/>
         </w:rPr>
-        <w:t xml:space="preserve">Definition 17 (Almost everywhere (</w:t>
+        <w:t xml:space="preserve">Definition 18 (Almost everywhere (</w:t>
       </w:r>
       <m:oMath>
         <m:r>
@@ -23451,8 +23474,8 @@
         <w:t xml:space="preserve">.</w:t>
       </w:r>
     </w:p>
-    <w:bookmarkEnd w:id="95"/>
-    <w:bookmarkStart w:id="96" w:name="exm-almost-everywhere"/>
+    <w:bookmarkEnd w:id="96"/>
+    <w:bookmarkStart w:id="97" w:name="exm-almost-everywhere"/>
     <w:p>
       <w:pPr>
         <w:pStyle w:val="BodyText"/>
@@ -23843,8 +23866,8 @@
         <w:t xml:space="preserve">so a statement holds almost everywhere only if it holds everywhere.</w:t>
       </w:r>
     </w:p>
-    <w:bookmarkEnd w:id="96"/>
-    <w:bookmarkStart w:id="97" w:name="def-sigma-finite"/>
+    <w:bookmarkEnd w:id="97"/>
+    <w:bookmarkStart w:id="98" w:name="def-sigma-finite"/>
     <w:p>
       <w:pPr>
         <w:pStyle w:val="BodyText"/>
@@ -23854,7 +23877,7 @@
           <w:b/>
           <w:bCs/>
         </w:rPr>
-        <w:t xml:space="preserve">Definition 18 (Finite and</w:t>
+        <w:t xml:space="preserve">Definition 19 (Finite and</w:t>
       </w:r>
       <w:r>
         <w:rPr>
@@ -24246,8 +24269,8 @@
         <w:t xml:space="preserve">.</w:t>
       </w:r>
     </w:p>
-    <w:bookmarkEnd w:id="97"/>
-    <w:bookmarkStart w:id="98" w:name="exm-sigma-finite"/>
+    <w:bookmarkEnd w:id="98"/>
+    <w:bookmarkStart w:id="99" w:name="exm-sigma-finite"/>
     <w:p>
       <w:pPr>
         <w:pStyle w:val="BodyText"/>
@@ -25090,9 +25113,9 @@
         <w:t xml:space="preserve">.</w:t>
       </w:r>
     </w:p>
-    <w:bookmarkEnd w:id="98"/>
     <w:bookmarkEnd w:id="99"/>
-    <w:bookmarkStart w:id="103" w:name="probability-measures"/>
+    <w:bookmarkEnd w:id="100"/>
+    <w:bookmarkStart w:id="105" w:name="probability-measures"/>
     <w:p>
       <w:pPr>
         <w:pStyle w:val="Heading2"/>
@@ -25101,7 +25124,7 @@
         <w:t xml:space="preserve">6 Probability measures</w:t>
       </w:r>
     </w:p>
-    <w:bookmarkStart w:id="100" w:name="def-probability-measure"/>
+    <w:bookmarkStart w:id="101" w:name="def-probability-measure"/>
     <w:p>
       <w:pPr>
         <w:pStyle w:val="FirstParagraph"/>
@@ -25111,7 +25134,7 @@
           <w:b/>
           <w:bCs/>
         </w:rPr>
-        <w:t xml:space="preserve">Definition 19 (Probability measure)</w:t>
+        <w:t xml:space="preserve">Definition 20 (Probability measure)</w:t>
       </w:r>
       <w:r>
         <w:t xml:space="preserve"> </w:t>
@@ -25312,189 +25335,11 @@
         </m:oMath>
       </m:oMathPara>
     </w:p>
+    <w:bookmarkEnd w:id="101"/>
+    <w:bookmarkStart w:id="102" w:name="exm-probability-measure"/>
     <w:p>
       <w:pPr>
         <w:pStyle w:val="FirstParagraph"/>
-      </w:pPr>
-      <w:r>
-        <w:t xml:space="preserve">Then</w:t>
-      </w:r>
-      <w:r>
-        <w:t xml:space="preserve"> </w:t>
-      </w:r>
-      <m:oMath>
-        <m:r>
-          <m:rPr>
-            <m:sty m:val="p"/>
-          </m:rPr>
-          <m:t>(</m:t>
-        </m:r>
-        <m:r>
-          <m:rPr>
-            <m:sty m:val="p"/>
-          </m:rPr>
-          <m:t>Ω</m:t>
-        </m:r>
-        <m:r>
-          <m:rPr>
-            <m:sty m:val="p"/>
-          </m:rPr>
-          <m:t>,</m:t>
-        </m:r>
-        <m:r>
-          <m:rPr>
-            <m:scr m:val="script"/>
-            <m:sty m:val="p"/>
-          </m:rPr>
-          <m:t>F</m:t>
-        </m:r>
-        <m:r>
-          <m:rPr>
-            <m:sty m:val="p"/>
-          </m:rPr>
-          <m:t>,</m:t>
-        </m:r>
-        <m:r>
-          <m:rPr>
-            <m:sty m:val="p"/>
-          </m:rPr>
-          <m:t>P</m:t>
-        </m:r>
-        <m:r>
-          <m:rPr>
-            <m:sty m:val="p"/>
-          </m:rPr>
-          <m:t>)</m:t>
-        </m:r>
-      </m:oMath>
-      <w:r>
-        <w:t xml:space="preserve"> </w:t>
-      </w:r>
-      <w:r>
-        <w:t xml:space="preserve">is a</w:t>
-      </w:r>
-      <w:r>
-        <w:t xml:space="preserve"> </w:t>
-      </w:r>
-      <w:r>
-        <w:rPr>
-          <w:b/>
-          <w:bCs/>
-        </w:rPr>
-        <w:t xml:space="preserve">probability space</w:t>
-      </w:r>
-      <w:r>
-        <w:t xml:space="preserve">,</w:t>
-      </w:r>
-      <w:r>
-        <w:t xml:space="preserve"> </w:t>
-      </w:r>
-      <m:oMath>
-        <m:r>
-          <m:rPr>
-            <m:sty m:val="p"/>
-          </m:rPr>
-          <m:t>Ω</m:t>
-        </m:r>
-      </m:oMath>
-      <w:r>
-        <w:t xml:space="preserve"> </w:t>
-      </w:r>
-      <w:r>
-        <w:t xml:space="preserve">is its</w:t>
-      </w:r>
-      <w:r>
-        <w:t xml:space="preserve"> </w:t>
-      </w:r>
-      <w:r>
-        <w:rPr>
-          <w:b/>
-          <w:bCs/>
-        </w:rPr>
-        <w:t xml:space="preserve">sample space</w:t>
-      </w:r>
-      <w:r>
-        <w:t xml:space="preserve">,</w:t>
-      </w:r>
-      <w:r>
-        <w:t xml:space="preserve"> </w:t>
-      </w:r>
-      <w:r>
-        <w:t xml:space="preserve">the elements of</w:t>
-      </w:r>
-      <w:r>
-        <w:t xml:space="preserve"> </w:t>
-      </w:r>
-      <m:oMath>
-        <m:r>
-          <m:rPr>
-            <m:sty m:val="p"/>
-          </m:rPr>
-          <m:t>Ω</m:t>
-        </m:r>
-      </m:oMath>
-      <w:r>
-        <w:t xml:space="preserve"> </w:t>
-      </w:r>
-      <w:r>
-        <w:t xml:space="preserve">are</w:t>
-      </w:r>
-      <w:r>
-        <w:t xml:space="preserve"> </w:t>
-      </w:r>
-      <w:r>
-        <w:rPr>
-          <w:b/>
-          <w:bCs/>
-        </w:rPr>
-        <w:t xml:space="preserve">outcomes</w:t>
-      </w:r>
-      <w:r>
-        <w:t xml:space="preserve">,</w:t>
-      </w:r>
-      <w:r>
-        <w:t xml:space="preserve"> </w:t>
-      </w:r>
-      <w:r>
-        <w:t xml:space="preserve">and the sets in</w:t>
-      </w:r>
-      <w:r>
-        <w:t xml:space="preserve"> </w:t>
-      </w:r>
-      <m:oMath>
-        <m:r>
-          <m:rPr>
-            <m:scr m:val="script"/>
-            <m:sty m:val="p"/>
-          </m:rPr>
-          <m:t>F</m:t>
-        </m:r>
-      </m:oMath>
-      <w:r>
-        <w:t xml:space="preserve"> </w:t>
-      </w:r>
-      <w:r>
-        <w:t xml:space="preserve">are</w:t>
-      </w:r>
-      <w:r>
-        <w:t xml:space="preserve"> </w:t>
-      </w:r>
-      <w:r>
-        <w:rPr>
-          <w:b/>
-          <w:bCs/>
-        </w:rPr>
-        <w:t xml:space="preserve">events</w:t>
-      </w:r>
-      <w:r>
-        <w:t xml:space="preserve">.</w:t>
-      </w:r>
-    </w:p>
-    <w:bookmarkEnd w:id="100"/>
-    <w:bookmarkStart w:id="101" w:name="exm-probability-measure"/>
-    <w:p>
-      <w:pPr>
-        <w:pStyle w:val="BodyText"/>
       </w:pPr>
       <w:r>
         <w:rPr>
@@ -26453,11 +26298,279 @@
         <w:t xml:space="preserve">.</w:t>
       </w:r>
     </w:p>
-    <w:bookmarkEnd w:id="101"/>
-    <w:bookmarkStart w:id="102" w:name="rem-mutually-exclusive"/>
+    <w:bookmarkEnd w:id="102"/>
+    <w:bookmarkStart w:id="103" w:name="def-probability-space"/>
     <w:p>
       <w:pPr>
         <w:pStyle w:val="FirstParagraph"/>
+      </w:pPr>
+      <w:r>
+        <w:rPr>
+          <w:b/>
+          <w:bCs/>
+        </w:rPr>
+        <w:t xml:space="preserve">Definition 21 (Probability space, sample space, outcomes and events)</w:t>
+      </w:r>
+      <w:r>
+        <w:t xml:space="preserve"> </w:t>
+      </w:r>
+      <w:r>
+        <w:t xml:space="preserve">For a probability measure</w:t>
+      </w:r>
+      <w:r>
+        <w:t xml:space="preserve"> </w:t>
+      </w:r>
+      <m:oMath>
+        <m:r>
+          <m:rPr>
+            <m:sty m:val="p"/>
+          </m:rPr>
+          <m:t>P</m:t>
+        </m:r>
+      </m:oMath>
+      <w:r>
+        <w:t xml:space="preserve"> </w:t>
+      </w:r>
+      <w:r>
+        <w:t xml:space="preserve">(</w:t>
+      </w:r>
+      <w:hyperlink w:anchor="def-probability-measure">
+        <w:r>
+          <w:rPr>
+            <w:rStyle w:val="Hyperlink"/>
+          </w:rPr>
+          <w:t xml:space="preserve">Definition 20</w:t>
+        </w:r>
+      </w:hyperlink>
+      <w:r>
+        <w:t xml:space="preserve">) on a</w:t>
+      </w:r>
+      <w:r>
+        <w:t xml:space="preserve"> </w:t>
+      </w:r>
+      <w:hyperlink w:anchor="def-measurable-space">
+        <w:r>
+          <w:rPr>
+            <w:rStyle w:val="Hyperlink"/>
+          </w:rPr>
+          <w:t xml:space="preserve">measurable space</w:t>
+        </w:r>
+      </w:hyperlink>
+      <w:r>
+        <w:t xml:space="preserve"> </w:t>
+      </w:r>
+      <m:oMath>
+        <m:r>
+          <m:rPr>
+            <m:sty m:val="p"/>
+          </m:rPr>
+          <m:t>(</m:t>
+        </m:r>
+        <m:r>
+          <m:rPr>
+            <m:sty m:val="p"/>
+          </m:rPr>
+          <m:t>Ω</m:t>
+        </m:r>
+        <m:r>
+          <m:rPr>
+            <m:sty m:val="p"/>
+          </m:rPr>
+          <m:t>,</m:t>
+        </m:r>
+        <m:r>
+          <m:rPr>
+            <m:scr m:val="script"/>
+            <m:sty m:val="p"/>
+          </m:rPr>
+          <m:t>F</m:t>
+        </m:r>
+        <m:r>
+          <m:rPr>
+            <m:sty m:val="p"/>
+          </m:rPr>
+          <m:t>)</m:t>
+        </m:r>
+      </m:oMath>
+      <w:r>
+        <w:t xml:space="preserve">,</w:t>
+      </w:r>
+      <w:r>
+        <w:t xml:space="preserve"> </w:t>
+      </w:r>
+      <m:oMath>
+        <m:r>
+          <m:rPr>
+            <m:sty m:val="p"/>
+          </m:rPr>
+          <m:t>(</m:t>
+        </m:r>
+        <m:r>
+          <m:rPr>
+            <m:sty m:val="p"/>
+          </m:rPr>
+          <m:t>Ω</m:t>
+        </m:r>
+        <m:r>
+          <m:rPr>
+            <m:sty m:val="p"/>
+          </m:rPr>
+          <m:t>,</m:t>
+        </m:r>
+        <m:r>
+          <m:rPr>
+            <m:scr m:val="script"/>
+            <m:sty m:val="p"/>
+          </m:rPr>
+          <m:t>F</m:t>
+        </m:r>
+        <m:r>
+          <m:rPr>
+            <m:sty m:val="p"/>
+          </m:rPr>
+          <m:t>,</m:t>
+        </m:r>
+        <m:r>
+          <m:rPr>
+            <m:sty m:val="p"/>
+          </m:rPr>
+          <m:t>P</m:t>
+        </m:r>
+        <m:r>
+          <m:rPr>
+            <m:sty m:val="p"/>
+          </m:rPr>
+          <m:t>)</m:t>
+        </m:r>
+      </m:oMath>
+      <w:r>
+        <w:t xml:space="preserve"> </w:t>
+      </w:r>
+      <w:r>
+        <w:t xml:space="preserve">is a</w:t>
+      </w:r>
+      <w:r>
+        <w:t xml:space="preserve"> </w:t>
+      </w:r>
+      <w:r>
+        <w:rPr>
+          <w:b/>
+          <w:bCs/>
+        </w:rPr>
+        <w:t xml:space="preserve">probability space</w:t>
+      </w:r>
+      <w:r>
+        <w:t xml:space="preserve">,</w:t>
+      </w:r>
+      <w:r>
+        <w:t xml:space="preserve"> </w:t>
+      </w:r>
+      <m:oMath>
+        <m:r>
+          <m:rPr>
+            <m:sty m:val="p"/>
+          </m:rPr>
+          <m:t>Ω</m:t>
+        </m:r>
+      </m:oMath>
+      <w:r>
+        <w:t xml:space="preserve"> </w:t>
+      </w:r>
+      <w:r>
+        <w:t xml:space="preserve">is its</w:t>
+      </w:r>
+      <w:r>
+        <w:t xml:space="preserve"> </w:t>
+      </w:r>
+      <w:r>
+        <w:rPr>
+          <w:b/>
+          <w:bCs/>
+        </w:rPr>
+        <w:t xml:space="preserve">sample space</w:t>
+      </w:r>
+      <w:r>
+        <w:t xml:space="preserve">,</w:t>
+      </w:r>
+      <w:r>
+        <w:t xml:space="preserve"> </w:t>
+      </w:r>
+      <w:r>
+        <w:t xml:space="preserve">the elements of</w:t>
+      </w:r>
+      <w:r>
+        <w:t xml:space="preserve"> </w:t>
+      </w:r>
+      <m:oMath>
+        <m:r>
+          <m:rPr>
+            <m:sty m:val="p"/>
+          </m:rPr>
+          <m:t>Ω</m:t>
+        </m:r>
+      </m:oMath>
+      <w:r>
+        <w:t xml:space="preserve"> </w:t>
+      </w:r>
+      <w:r>
+        <w:t xml:space="preserve">are</w:t>
+      </w:r>
+      <w:r>
+        <w:t xml:space="preserve"> </w:t>
+      </w:r>
+      <w:r>
+        <w:rPr>
+          <w:b/>
+          <w:bCs/>
+        </w:rPr>
+        <w:t xml:space="preserve">outcomes</w:t>
+      </w:r>
+      <w:r>
+        <w:t xml:space="preserve">,</w:t>
+      </w:r>
+      <w:r>
+        <w:t xml:space="preserve"> </w:t>
+      </w:r>
+      <w:r>
+        <w:t xml:space="preserve">and the sets in</w:t>
+      </w:r>
+      <w:r>
+        <w:t xml:space="preserve"> </w:t>
+      </w:r>
+      <m:oMath>
+        <m:r>
+          <m:rPr>
+            <m:scr m:val="script"/>
+            <m:sty m:val="p"/>
+          </m:rPr>
+          <m:t>F</m:t>
+        </m:r>
+      </m:oMath>
+      <w:r>
+        <w:t xml:space="preserve"> </w:t>
+      </w:r>
+      <w:r>
+        <w:t xml:space="preserve">are</w:t>
+      </w:r>
+      <w:r>
+        <w:t xml:space="preserve"> </w:t>
+      </w:r>
+      <w:r>
+        <w:rPr>
+          <w:b/>
+          <w:bCs/>
+        </w:rPr>
+        <w:t xml:space="preserve">events</w:t>
+      </w:r>
+      <w:r>
+        <w:t xml:space="preserve">.</w:t>
+      </w:r>
+    </w:p>
+    <w:bookmarkEnd w:id="103"/>
+    <w:bookmarkStart w:id="104" w:name="rem-mutually-exclusive"/>
+    <w:p>
+      <w:pPr>
+        <w:pStyle w:val="BodyText"/>
       </w:pPr>
       <w:r>
         <w:rPr>
@@ -26666,9 +26779,9 @@
         <w:t xml:space="preserve">no roll is both even and odd.</w:t>
       </w:r>
     </w:p>
-    <w:bookmarkEnd w:id="102"/>
-    <w:bookmarkEnd w:id="103"/>
-    <w:bookmarkStart w:id="121" w:name="measurable-functions-and-integrals"/>
+    <w:bookmarkEnd w:id="104"/>
+    <w:bookmarkEnd w:id="105"/>
+    <w:bookmarkStart w:id="124" w:name="measurable-functions-and-integrals"/>
     <w:p>
       <w:pPr>
         <w:pStyle w:val="Heading2"/>
@@ -26677,7 +26790,7 @@
         <w:t xml:space="preserve">7 Measurable functions and integrals</w:t>
       </w:r>
     </w:p>
-    <w:bookmarkStart w:id="104" w:name="def-measurable-function"/>
+    <w:bookmarkStart w:id="106" w:name="def-measurable-function"/>
     <w:p>
       <w:pPr>
         <w:pStyle w:val="FirstParagraph"/>
@@ -26687,7 +26800,7 @@
           <w:b/>
           <w:bCs/>
         </w:rPr>
-        <w:t xml:space="preserve">Definition 20 (Measurable function)</w:t>
+        <w:t xml:space="preserve">Definition 22 (Measurable function)</w:t>
       </w:r>
       <w:r>
         <w:t xml:space="preserve"> </w:t>
@@ -26970,8 +27083,8 @@
         </m:oMath>
       </m:oMathPara>
     </w:p>
-    <w:bookmarkEnd w:id="104"/>
-    <w:bookmarkStart w:id="106" w:name="rem-measurable-function-general"/>
+    <w:bookmarkEnd w:id="106"/>
+    <w:bookmarkStart w:id="108" w:name="rem-measurable-function-general"/>
     <w:p>
       <w:pPr>
         <w:pStyle w:val="FirstParagraph"/>
@@ -27292,7 +27405,7 @@
           <w:rPr>
             <w:rStyle w:val="Hyperlink"/>
           </w:rPr>
-          <w:t xml:space="preserve">Definition 20</w:t>
+          <w:t xml:space="preserve">Definition 22</w:t>
         </w:r>
       </w:hyperlink>
       <w:r>
@@ -27304,7 +27417,7 @@
       <w:r>
         <w:t xml:space="preserve"> </w:t>
       </w:r>
-      <w:hyperlink r:id="rId105">
+      <w:hyperlink r:id="rId107">
         <w:r>
           <w:rPr>
             <w:rStyle w:val="Hyperlink"/>
@@ -27473,15 +27586,15 @@
           <w:rPr>
             <w:rStyle w:val="Hyperlink"/>
           </w:rPr>
-          <w:t xml:space="preserve">Definition 20</w:t>
+          <w:t xml:space="preserve">Definition 22</w:t>
         </w:r>
       </w:hyperlink>
       <w:r>
         <w:t xml:space="preserve">.</w:t>
       </w:r>
     </w:p>
-    <w:bookmarkEnd w:id="106"/>
-    <w:bookmarkStart w:id="107" w:name="exm-measurable-function"/>
+    <w:bookmarkEnd w:id="108"/>
+    <w:bookmarkStart w:id="109" w:name="exm-measurable-function"/>
     <w:p>
       <w:pPr>
         <w:pStyle w:val="BodyText"/>
@@ -28402,8 +28515,8 @@
         <w:t xml:space="preserve">, is measurable.</w:t>
       </w:r>
     </w:p>
-    <w:bookmarkEnd w:id="107"/>
-    <w:bookmarkStart w:id="110" w:name="def-integral-nonneg"/>
+    <w:bookmarkEnd w:id="109"/>
+    <w:bookmarkStart w:id="112" w:name="def-integral-nonneg"/>
     <w:p>
       <w:pPr>
         <w:pStyle w:val="BodyText"/>
@@ -28413,7 +28526,7 @@
           <w:b/>
           <w:bCs/>
         </w:rPr>
-        <w:t xml:space="preserve">Definition 21 (Integral of a non-negative function)</w:t>
+        <w:t xml:space="preserve">Definition 23 (Integral of a non-negative function)</w:t>
       </w:r>
       <w:r>
         <w:t xml:space="preserve"> </w:t>
@@ -28828,7 +28941,7 @@
       <w:r>
         <w:t xml:space="preserve"> </w:t>
       </w:r>
-      <w:hyperlink r:id="rId108">
+      <w:hyperlink r:id="rId110">
         <w:r>
           <w:rPr>
             <w:rStyle w:val="Hyperlink"/>
@@ -29018,7 +29131,7 @@
       <w:r>
         <w:t xml:space="preserve"> </w:t>
       </w:r>
-      <w:hyperlink r:id="rId109">
+      <w:hyperlink r:id="rId111">
         <w:r>
           <w:rPr>
             <w:rStyle w:val="Hyperlink"/>
@@ -29310,8 +29423,8 @@
         <w:t xml:space="preserve">(Billingsley 1995, sec. 15)</w:t>
       </w:r>
     </w:p>
-    <w:bookmarkEnd w:id="110"/>
-    <w:bookmarkStart w:id="113" w:name="rem-integral-nonneg-lower-sums"/>
+    <w:bookmarkEnd w:id="112"/>
+    <w:bookmarkStart w:id="115" w:name="rem-integral-nonneg-lower-sums"/>
     <w:p>
       <w:pPr>
         <w:pStyle w:val="BodyText"/>
@@ -29337,7 +29450,7 @@
           <w:rPr>
             <w:rStyle w:val="Hyperlink"/>
           </w:rPr>
-          <w:t xml:space="preserve">Definition 21</w:t>
+          <w:t xml:space="preserve">Definition 23</w:t>
         </w:r>
       </w:hyperlink>
       <w:r>
@@ -29476,7 +29589,7 @@
       <w:r>
         <w:t xml:space="preserve"> </w:t>
       </w:r>
-      <w:hyperlink r:id="rId111">
+      <w:hyperlink r:id="rId113">
         <w:r>
           <w:rPr>
             <w:rStyle w:val="Hyperlink"/>
@@ -29648,7 +29761,7 @@
       <w:r>
         <w:t xml:space="preserve"> </w:t>
       </w:r>
-      <w:hyperlink r:id="rId112">
+      <w:hyperlink r:id="rId114">
         <w:r>
           <w:rPr>
             <w:rStyle w:val="Hyperlink"/>
@@ -29660,8 +29773,8 @@
         <w:t xml:space="preserve">).</w:t>
       </w:r>
     </w:p>
-    <w:bookmarkEnd w:id="113"/>
-    <w:bookmarkStart w:id="114" w:name="exm-integral-nonneg"/>
+    <w:bookmarkEnd w:id="115"/>
+    <w:bookmarkStart w:id="116" w:name="exm-integral-nonneg"/>
     <w:p>
       <w:pPr>
         <w:pStyle w:val="BodyText"/>
@@ -31089,8 +31202,8 @@
         <w:t xml:space="preserve">.</w:t>
       </w:r>
     </w:p>
-    <w:bookmarkEnd w:id="114"/>
-    <w:bookmarkStart w:id="115" w:name="def-integral"/>
+    <w:bookmarkEnd w:id="116"/>
+    <w:bookmarkStart w:id="117" w:name="def-positive-negative-parts"/>
     <w:p>
       <w:pPr>
         <w:pStyle w:val="BodyText"/>
@@ -31100,7 +31213,7 @@
           <w:b/>
           <w:bCs/>
         </w:rPr>
-        <w:t xml:space="preserve">Definition 22 (Integral of a real-valued function)</w:t>
+        <w:t xml:space="preserve">Definition 24 (Positive and negative parts of a function)</w:t>
       </w:r>
       <w:r>
         <w:t xml:space="preserve"> </w:t>
@@ -31641,6 +31754,329 @@
         <w:t xml:space="preserve"> </w:t>
       </w:r>
       <w:r>
+        <w:t xml:space="preserve">(</w:t>
+      </w:r>
+      <m:oMath>
+        <m:sSup>
+          <m:e>
+            <m:r>
+              <m:t>f</m:t>
+            </m:r>
+          </m:e>
+          <m:sup>
+            <m:r>
+              <m:rPr>
+                <m:sty m:val="p"/>
+              </m:rPr>
+              <m:t>+</m:t>
+            </m:r>
+          </m:sup>
+        </m:sSup>
+      </m:oMath>
+      <w:r>
+        <w:t xml:space="preserve">,</w:t>
+      </w:r>
+      <w:r>
+        <w:t xml:space="preserve"> </w:t>
+      </w:r>
+      <m:oMath>
+        <m:sSup>
+          <m:e>
+            <m:r>
+              <m:t>f</m:t>
+            </m:r>
+          </m:e>
+          <m:sup>
+            <m:r>
+              <m:rPr>
+                <m:sty m:val="p"/>
+              </m:rPr>
+              <m:t>−</m:t>
+            </m:r>
+          </m:sup>
+        </m:sSup>
+      </m:oMath>
+      <w:r>
+        <w:t xml:space="preserve">, and</w:t>
+      </w:r>
+      <w:r>
+        <w:t xml:space="preserve"> </w:t>
+      </w:r>
+      <m:oMath>
+        <m:r>
+          <m:t>​</m:t>
+        </m:r>
+        <m:d>
+          <m:dPr>
+            <m:begChr m:val="|"/>
+            <m:sepChr m:val=""/>
+            <m:endChr m:val="|"/>
+            <m:grow/>
+          </m:dPr>
+          <m:e>
+            <m:r>
+              <m:t>f</m:t>
+            </m:r>
+          </m:e>
+        </m:d>
+        <m:r>
+          <m:t>​</m:t>
+        </m:r>
+      </m:oMath>
+      <w:r>
+        <w:t xml:space="preserve"> </w:t>
+      </w:r>
+      <w:r>
+        <w:t xml:space="preserve">are measurable when</w:t>
+      </w:r>
+      <w:r>
+        <w:t xml:space="preserve"> </w:t>
+      </w:r>
+      <m:oMath>
+        <m:r>
+          <m:t>f</m:t>
+        </m:r>
+      </m:oMath>
+      <w:r>
+        <w:t xml:space="preserve"> </w:t>
+      </w:r>
+      <w:r>
+        <w:t xml:space="preserve">is</w:t>
+      </w:r>
+      <w:r>
+        <w:t xml:space="preserve"> </w:t>
+      </w:r>
+      <w:r>
+        <w:t xml:space="preserve">(Billingsley 1995, Theorem 13.3)</w:t>
+      </w:r>
+      <w:r>
+        <w:t xml:space="preserve">.)</w:t>
+      </w:r>
+    </w:p>
+    <w:bookmarkEnd w:id="117"/>
+    <w:bookmarkStart w:id="118" w:name="def-integral"/>
+    <w:p>
+      <w:pPr>
+        <w:pStyle w:val="BodyText"/>
+      </w:pPr>
+      <w:r>
+        <w:rPr>
+          <w:b/>
+          <w:bCs/>
+        </w:rPr>
+        <w:t xml:space="preserve">Definition 25 (Integral of a real-valued function)</w:t>
+      </w:r>
+      <w:r>
+        <w:t xml:space="preserve"> </w:t>
+      </w:r>
+      <w:r>
+        <w:t xml:space="preserve">Let</w:t>
+      </w:r>
+      <w:r>
+        <w:t xml:space="preserve"> </w:t>
+      </w:r>
+      <m:oMath>
+        <m:r>
+          <m:rPr>
+            <m:sty m:val="p"/>
+          </m:rPr>
+          <m:t>(</m:t>
+        </m:r>
+        <m:r>
+          <m:t>S</m:t>
+        </m:r>
+        <m:r>
+          <m:rPr>
+            <m:sty m:val="p"/>
+          </m:rPr>
+          <m:t>,</m:t>
+        </m:r>
+        <m:r>
+          <m:rPr>
+            <m:scr m:val="script"/>
+            <m:sty m:val="p"/>
+          </m:rPr>
+          <m:t>S</m:t>
+        </m:r>
+        <m:r>
+          <m:rPr>
+            <m:sty m:val="p"/>
+          </m:rPr>
+          <m:t>,</m:t>
+        </m:r>
+        <m:r>
+          <m:t>μ</m:t>
+        </m:r>
+        <m:r>
+          <m:rPr>
+            <m:sty m:val="p"/>
+          </m:rPr>
+          <m:t>)</m:t>
+        </m:r>
+      </m:oMath>
+      <w:r>
+        <w:t xml:space="preserve"> </w:t>
+      </w:r>
+      <w:r>
+        <w:t xml:space="preserve">be a</w:t>
+      </w:r>
+      <w:r>
+        <w:t xml:space="preserve"> </w:t>
+      </w:r>
+      <w:hyperlink w:anchor="def-measure-space">
+        <w:r>
+          <w:rPr>
+            <w:rStyle w:val="Hyperlink"/>
+          </w:rPr>
+          <w:t xml:space="preserve">measure space</w:t>
+        </w:r>
+      </w:hyperlink>
+      <w:r>
+        <w:t xml:space="preserve">,</w:t>
+      </w:r>
+      <w:r>
+        <w:t xml:space="preserve"> </w:t>
+      </w:r>
+      <w:r>
+        <w:t xml:space="preserve">and let</w:t>
+      </w:r>
+      <w:r>
+        <w:t xml:space="preserve"> </w:t>
+      </w:r>
+      <m:oMath>
+        <m:r>
+          <m:t>f</m:t>
+        </m:r>
+        <m:r>
+          <m:rPr>
+            <m:sty m:val="p"/>
+          </m:rPr>
+          <m:t>:</m:t>
+        </m:r>
+        <m:r>
+          <m:t>S</m:t>
+        </m:r>
+        <m:r>
+          <m:rPr>
+            <m:sty m:val="p"/>
+          </m:rPr>
+          <m:t>→</m:t>
+        </m:r>
+        <m:r>
+          <m:rPr>
+            <m:scr m:val="double-struck"/>
+            <m:sty m:val="p"/>
+          </m:rPr>
+          <m:t>R</m:t>
+        </m:r>
+      </m:oMath>
+      <w:r>
+        <w:t xml:space="preserve"> </w:t>
+      </w:r>
+      <w:r>
+        <w:t xml:space="preserve">be</w:t>
+      </w:r>
+      <w:r>
+        <w:t xml:space="preserve"> </w:t>
+      </w:r>
+      <w:hyperlink w:anchor="def-measurable-function">
+        <w:r>
+          <w:rPr>
+            <w:rStyle w:val="Hyperlink"/>
+          </w:rPr>
+          <w:t xml:space="preserve">measurable</w:t>
+        </w:r>
+      </w:hyperlink>
+      <w:r>
+        <w:t xml:space="preserve">.</w:t>
+      </w:r>
+      <w:r>
+        <w:t xml:space="preserve"> </w:t>
+      </w:r>
+      <w:r>
+        <w:t xml:space="preserve">Let</w:t>
+      </w:r>
+      <w:r>
+        <w:t xml:space="preserve"> </w:t>
+      </w:r>
+      <m:oMath>
+        <m:sSup>
+          <m:e>
+            <m:r>
+              <m:t>f</m:t>
+            </m:r>
+          </m:e>
+          <m:sup>
+            <m:r>
+              <m:rPr>
+                <m:sty m:val="p"/>
+              </m:rPr>
+              <m:t>+</m:t>
+            </m:r>
+          </m:sup>
+        </m:sSup>
+      </m:oMath>
+      <w:r>
+        <w:t xml:space="preserve"> </w:t>
+      </w:r>
+      <w:r>
+        <w:t xml:space="preserve">and</w:t>
+      </w:r>
+      <w:r>
+        <w:t xml:space="preserve"> </w:t>
+      </w:r>
+      <m:oMath>
+        <m:sSup>
+          <m:e>
+            <m:r>
+              <m:t>f</m:t>
+            </m:r>
+          </m:e>
+          <m:sup>
+            <m:r>
+              <m:rPr>
+                <m:sty m:val="p"/>
+              </m:rPr>
+              <m:t>−</m:t>
+            </m:r>
+          </m:sup>
+        </m:sSup>
+      </m:oMath>
+      <w:r>
+        <w:t xml:space="preserve"> </w:t>
+      </w:r>
+      <w:r>
+        <w:t xml:space="preserve">be the positive and negative parts of</w:t>
+      </w:r>
+      <w:r>
+        <w:t xml:space="preserve"> </w:t>
+      </w:r>
+      <m:oMath>
+        <m:r>
+          <m:t>f</m:t>
+        </m:r>
+      </m:oMath>
+      <w:r>
+        <w:t xml:space="preserve"> </w:t>
+      </w:r>
+      <w:r>
+        <w:t xml:space="preserve">(</w:t>
+      </w:r>
+      <w:hyperlink w:anchor="def-positive-negative-parts">
+        <w:r>
+          <w:rPr>
+            <w:rStyle w:val="Hyperlink"/>
+          </w:rPr>
+          <w:t xml:space="preserve">Definition 24</w:t>
+        </w:r>
+      </w:hyperlink>
+      <w:r>
+        <w:t xml:space="preserve">).</w:t>
+      </w:r>
+      <w:r>
+        <w:t xml:space="preserve"> </w:t>
+      </w:r>
+      <w:r>
         <w:t xml:space="preserve">The</w:t>
       </w:r>
       <w:r>
@@ -31866,7 +32302,7 @@
           <w:rPr>
             <w:rStyle w:val="Hyperlink"/>
           </w:rPr>
-          <w:t xml:space="preserve">Definition 21</w:t>
+          <w:t xml:space="preserve">Definition 23</w:t>
         </w:r>
       </w:hyperlink>
       <w:r>
@@ -31900,108 +32336,6 @@
       </w:r>
       <w:r>
         <w:t xml:space="preserve">is undefined.</w:t>
-      </w:r>
-      <w:r>
-        <w:t xml:space="preserve"> </w:t>
-      </w:r>
-      <w:r>
-        <w:t xml:space="preserve">(</w:t>
-      </w:r>
-      <m:oMath>
-        <m:sSup>
-          <m:e>
-            <m:r>
-              <m:t>f</m:t>
-            </m:r>
-          </m:e>
-          <m:sup>
-            <m:r>
-              <m:rPr>
-                <m:sty m:val="p"/>
-              </m:rPr>
-              <m:t>+</m:t>
-            </m:r>
-          </m:sup>
-        </m:sSup>
-      </m:oMath>
-      <w:r>
-        <w:t xml:space="preserve">,</w:t>
-      </w:r>
-      <w:r>
-        <w:t xml:space="preserve"> </w:t>
-      </w:r>
-      <m:oMath>
-        <m:sSup>
-          <m:e>
-            <m:r>
-              <m:t>f</m:t>
-            </m:r>
-          </m:e>
-          <m:sup>
-            <m:r>
-              <m:rPr>
-                <m:sty m:val="p"/>
-              </m:rPr>
-              <m:t>−</m:t>
-            </m:r>
-          </m:sup>
-        </m:sSup>
-      </m:oMath>
-      <w:r>
-        <w:t xml:space="preserve">, and</w:t>
-      </w:r>
-      <w:r>
-        <w:t xml:space="preserve"> </w:t>
-      </w:r>
-      <m:oMath>
-        <m:r>
-          <m:t>​</m:t>
-        </m:r>
-        <m:d>
-          <m:dPr>
-            <m:begChr m:val="|"/>
-            <m:sepChr m:val=""/>
-            <m:endChr m:val="|"/>
-            <m:grow/>
-          </m:dPr>
-          <m:e>
-            <m:r>
-              <m:t>f</m:t>
-            </m:r>
-          </m:e>
-        </m:d>
-        <m:r>
-          <m:t>​</m:t>
-        </m:r>
-      </m:oMath>
-      <w:r>
-        <w:t xml:space="preserve"> </w:t>
-      </w:r>
-      <w:r>
-        <w:t xml:space="preserve">are measurable when</w:t>
-      </w:r>
-      <w:r>
-        <w:t xml:space="preserve"> </w:t>
-      </w:r>
-      <m:oMath>
-        <m:r>
-          <m:t>f</m:t>
-        </m:r>
-      </m:oMath>
-      <w:r>
-        <w:t xml:space="preserve"> </w:t>
-      </w:r>
-      <w:r>
-        <w:t xml:space="preserve">is</w:t>
-      </w:r>
-      <w:r>
-        <w:t xml:space="preserve"> </w:t>
-      </w:r>
-      <w:r>
-        <w:t xml:space="preserve">(Billingsley 1995, Theorem 13.3)</w:t>
-      </w:r>
-      <w:r>
-        <w:t xml:space="preserve">.)</w:t>
       </w:r>
     </w:p>
     <w:p>
@@ -32012,8 +32346,8 @@
         <w:t xml:space="preserve">(Billingsley 1995, sec. 15)</w:t>
       </w:r>
     </w:p>
-    <w:bookmarkEnd w:id="115"/>
-    <w:bookmarkStart w:id="116" w:name="exm-integral"/>
+    <w:bookmarkEnd w:id="118"/>
+    <w:bookmarkStart w:id="119" w:name="exm-integral"/>
     <w:p>
       <w:pPr>
         <w:pStyle w:val="BodyText"/>
@@ -32751,8 +33085,8 @@
         </m:oMath>
       </m:oMathPara>
     </w:p>
-    <w:bookmarkEnd w:id="116"/>
-    <w:bookmarkStart w:id="118" w:name="def-absolutely-integrable"/>
+    <w:bookmarkEnd w:id="119"/>
+    <w:bookmarkStart w:id="121" w:name="def-absolutely-integrable"/>
     <w:p>
       <w:pPr>
         <w:pStyle w:val="FirstParagraph"/>
@@ -32762,7 +33096,7 @@
           <w:b/>
           <w:bCs/>
         </w:rPr>
-        <w:t xml:space="preserve">Definition 23 (Absolutely integrable function (integrable function, absolute integrability))</w:t>
+        <w:t xml:space="preserve">Definition 26 (Absolutely integrable function (integrable function, absolute integrability))</w:t>
       </w:r>
       <w:r>
         <w:t xml:space="preserve"> </w:t>
@@ -32943,7 +33277,7 @@
       <w:r>
         <w:t xml:space="preserve"> </w:t>
       </w:r>
-      <w:hyperlink r:id="rId117">
+      <w:hyperlink r:id="rId120">
         <w:r>
           <w:rPr>
             <w:rStyle w:val="Hyperlink"/>
@@ -33051,8 +33385,8 @@
         <w:t xml:space="preserve">.</w:t>
       </w:r>
     </w:p>
-    <w:bookmarkEnd w:id="118"/>
-    <w:bookmarkStart w:id="119" w:name="rem-absolutely-integrable-integral"/>
+    <w:bookmarkEnd w:id="121"/>
+    <w:bookmarkStart w:id="122" w:name="rem-absolutely-integrable-integral"/>
     <w:p>
       <w:pPr>
         <w:pStyle w:val="BodyText"/>
@@ -33319,7 +33653,7 @@
           <w:rPr>
             <w:rStyle w:val="Hyperlink"/>
           </w:rPr>
-          <w:t xml:space="preserve">Definition 21</w:t>
+          <w:t xml:space="preserve">Definition 23</w:t>
         </w:r>
       </w:hyperlink>
       <w:r>
@@ -33461,15 +33795,15 @@
           <w:rPr>
             <w:rStyle w:val="Hyperlink"/>
           </w:rPr>
-          <w:t xml:space="preserve">Definition 22</w:t>
+          <w:t xml:space="preserve">Definition 25</w:t>
         </w:r>
       </w:hyperlink>
       <w:r>
         <w:t xml:space="preserve">) is a real number.</w:t>
       </w:r>
     </w:p>
-    <w:bookmarkEnd w:id="119"/>
-    <w:bookmarkStart w:id="120" w:name="exm-absolutely-integrable"/>
+    <w:bookmarkEnd w:id="122"/>
+    <w:bookmarkStart w:id="123" w:name="exm-absolutely-integrable"/>
     <w:p>
       <w:pPr>
         <w:pStyle w:val="BodyText"/>
@@ -33973,9 +34307,9 @@
         <w:t xml:space="preserve">).</w:t>
       </w:r>
     </w:p>
-    <w:bookmarkEnd w:id="120"/>
-    <w:bookmarkEnd w:id="121"/>
-    <w:bookmarkStart w:id="132" w:name="lp-spaces"/>
+    <w:bookmarkEnd w:id="123"/>
+    <w:bookmarkEnd w:id="124"/>
+    <w:bookmarkStart w:id="136" w:name="lp-spaces"/>
     <w:p>
       <w:pPr>
         <w:pStyle w:val="Heading2"/>
@@ -34007,7 +34341,7 @@
         <w:t xml:space="preserve">spaces</w:t>
       </w:r>
     </w:p>
-    <w:bookmarkStart w:id="123" w:name="def-lp-space"/>
+    <w:bookmarkStart w:id="126" w:name="def-lp-space"/>
     <w:p>
       <w:pPr>
         <w:pStyle w:val="FirstParagraph"/>
@@ -34017,7 +34351,7 @@
           <w:b/>
           <w:bCs/>
         </w:rPr>
-        <w:t xml:space="preserve">Definition 24 (</w:t>
+        <w:t xml:space="preserve">Definition 27 (</w:t>
       </w:r>
       <m:oMath>
         <m:sSup>
@@ -34649,7 +34983,7 @@
       <w:r>
         <w:t xml:space="preserve"> </w:t>
       </w:r>
-      <w:hyperlink r:id="rId122">
+      <w:hyperlink r:id="rId125">
         <w:r>
           <w:rPr>
             <w:rStyle w:val="Hyperlink"/>
@@ -34894,11 +35228,1410 @@
       <w:r>
         <w:t xml:space="preserve">).</w:t>
       </w:r>
+      <w:r>
+        <w:t xml:space="preserve"> </w:t>
+      </w:r>
+      <w:r>
+        <w:t xml:space="preserve">The case</w:t>
+      </w:r>
+      <w:r>
+        <w:t xml:space="preserve"> </w:t>
+      </w:r>
+      <m:oMath>
+        <m:r>
+          <m:t>p</m:t>
+        </m:r>
+        <m:r>
+          <m:rPr>
+            <m:sty m:val="p"/>
+          </m:rPr>
+          <m:t>=</m:t>
+        </m:r>
+        <m:r>
+          <m:rPr>
+            <m:sty m:val="p"/>
+          </m:rPr>
+          <m:t>∞</m:t>
+        </m:r>
+      </m:oMath>
+      <w:r>
+        <w:t xml:space="preserve"> </w:t>
+      </w:r>
+      <w:r>
+        <w:t xml:space="preserve">is defined separately, in</w:t>
+      </w:r>
+      <w:r>
+        <w:t xml:space="preserve"> </w:t>
+      </w:r>
+      <w:hyperlink w:anchor="def-linf-space">
+        <w:r>
+          <w:rPr>
+            <w:rStyle w:val="Hyperlink"/>
+          </w:rPr>
+          <w:t xml:space="preserve">Definition 28</w:t>
+        </w:r>
+      </w:hyperlink>
+      <w:r>
+        <w:t xml:space="preserve">.</w:t>
+      </w:r>
     </w:p>
+    <w:bookmarkEnd w:id="126"/>
+    <w:bookmarkStart w:id="127" w:name="exm-lp-space"/>
     <w:p>
       <w:pPr>
         <w:pStyle w:val="BodyText"/>
       </w:pPr>
+      <w:r>
+        <w:rPr>
+          <w:b/>
+          <w:bCs/>
+        </w:rPr>
+        <w:t xml:space="preserve">Example 29 (An</w:t>
+      </w:r>
+      <w:r>
+        <w:rPr>
+          <w:b/>
+          <w:bCs/>
+        </w:rPr>
+        <w:t xml:space="preserve"> </w:t>
+      </w:r>
+      <m:oMath>
+        <m:sSup>
+          <m:e>
+            <m:r>
+              <m:t>L</m:t>
+            </m:r>
+          </m:e>
+          <m:sup>
+            <m:r>
+              <m:t>1</m:t>
+            </m:r>
+          </m:sup>
+        </m:sSup>
+      </m:oMath>
+      <w:r>
+        <w:rPr>
+          <w:b/>
+          <w:bCs/>
+        </w:rPr>
+        <w:t xml:space="preserve"> </w:t>
+      </w:r>
+      <w:r>
+        <w:rPr>
+          <w:b/>
+          <w:bCs/>
+        </w:rPr>
+        <w:t xml:space="preserve">function not in</w:t>
+      </w:r>
+      <w:r>
+        <w:rPr>
+          <w:b/>
+          <w:bCs/>
+        </w:rPr>
+        <w:t xml:space="preserve"> </w:t>
+      </w:r>
+      <m:oMath>
+        <m:sSup>
+          <m:e>
+            <m:r>
+              <m:t>L</m:t>
+            </m:r>
+          </m:e>
+          <m:sup>
+            <m:r>
+              <m:t>2</m:t>
+            </m:r>
+          </m:sup>
+        </m:sSup>
+      </m:oMath>
+      <w:r>
+        <w:rPr>
+          <w:b/>
+          <w:bCs/>
+        </w:rPr>
+        <w:t xml:space="preserve">)</w:t>
+      </w:r>
+      <w:r>
+        <w:t xml:space="preserve"> </w:t>
+      </w:r>
+      <w:r>
+        <w:t xml:space="preserve">Consider the interval</w:t>
+      </w:r>
+      <w:r>
+        <w:t xml:space="preserve"> </w:t>
+      </w:r>
+      <m:oMath>
+        <m:r>
+          <m:rPr>
+            <m:sty m:val="p"/>
+          </m:rPr>
+          <m:t>(</m:t>
+        </m:r>
+        <m:r>
+          <m:t>0</m:t>
+        </m:r>
+        <m:r>
+          <m:rPr>
+            <m:sty m:val="p"/>
+          </m:rPr>
+          <m:t>,</m:t>
+        </m:r>
+        <m:r>
+          <m:t>1</m:t>
+        </m:r>
+        <m:r>
+          <m:rPr>
+            <m:sty m:val="p"/>
+          </m:rPr>
+          <m:t>)</m:t>
+        </m:r>
+      </m:oMath>
+      <w:r>
+        <w:t xml:space="preserve"> </w:t>
+      </w:r>
+      <w:r>
+        <w:t xml:space="preserve">equipped with the Borel</w:t>
+      </w:r>
+      <w:r>
+        <w:t xml:space="preserve"> </w:t>
+      </w:r>
+      <m:oMath>
+        <m:r>
+          <m:t>σ</m:t>
+        </m:r>
+      </m:oMath>
+      <w:r>
+        <w:t xml:space="preserve">-algebra (</w:t>
+      </w:r>
+      <w:hyperlink w:anchor="def-borel-sigma-algebra">
+        <w:r>
+          <w:rPr>
+            <w:rStyle w:val="Hyperlink"/>
+          </w:rPr>
+          <w:t xml:space="preserve">Definition 4</w:t>
+        </w:r>
+      </w:hyperlink>
+      <w:r>
+        <w:t xml:space="preserve">)</w:t>
+      </w:r>
+      <w:r>
+        <w:t xml:space="preserve"> </w:t>
+      </w:r>
+      <w:r>
+        <w:t xml:space="preserve">and Lebesgue measure</w:t>
+      </w:r>
+      <w:r>
+        <w:t xml:space="preserve"> </w:t>
+      </w:r>
+      <m:oMath>
+        <m:r>
+          <m:t>μ</m:t>
+        </m:r>
+      </m:oMath>
+      <w:r>
+        <w:t xml:space="preserve"> </w:t>
+      </w:r>
+      <w:r>
+        <w:t xml:space="preserve">(</w:t>
+      </w:r>
+      <w:hyperlink w:anchor="def-lebesgue-measure">
+        <w:r>
+          <w:rPr>
+            <w:rStyle w:val="Hyperlink"/>
+          </w:rPr>
+          <w:t xml:space="preserve">Definition 15</w:t>
+        </w:r>
+      </w:hyperlink>
+      <w:r>
+        <w:t xml:space="preserve">).</w:t>
+      </w:r>
+      <w:r>
+        <w:t xml:space="preserve"> </w:t>
+      </w:r>
+      <w:r>
+        <w:t xml:space="preserve">Define</w:t>
+      </w:r>
+      <w:r>
+        <w:t xml:space="preserve"> </w:t>
+      </w:r>
+      <m:oMath>
+        <m:r>
+          <m:t>f</m:t>
+        </m:r>
+        <m:r>
+          <m:rPr>
+            <m:sty m:val="p"/>
+          </m:rPr>
+          <m:t>:</m:t>
+        </m:r>
+        <m:r>
+          <m:rPr>
+            <m:sty m:val="p"/>
+          </m:rPr>
+          <m:t>(</m:t>
+        </m:r>
+        <m:r>
+          <m:t>0</m:t>
+        </m:r>
+        <m:r>
+          <m:rPr>
+            <m:sty m:val="p"/>
+          </m:rPr>
+          <m:t>,</m:t>
+        </m:r>
+        <m:r>
+          <m:t>1</m:t>
+        </m:r>
+        <m:r>
+          <m:rPr>
+            <m:sty m:val="p"/>
+          </m:rPr>
+          <m:t>)</m:t>
+        </m:r>
+        <m:r>
+          <m:rPr>
+            <m:sty m:val="p"/>
+          </m:rPr>
+          <m:t>→</m:t>
+        </m:r>
+        <m:r>
+          <m:rPr>
+            <m:scr m:val="double-struck"/>
+            <m:sty m:val="p"/>
+          </m:rPr>
+          <m:t>R</m:t>
+        </m:r>
+      </m:oMath>
+      <w:r>
+        <w:t xml:space="preserve"> </w:t>
+      </w:r>
+      <w:r>
+        <w:t xml:space="preserve">by</w:t>
+      </w:r>
+      <w:r>
+        <w:t xml:space="preserve"> </w:t>
+      </w:r>
+      <m:oMath>
+        <m:r>
+          <m:t>f</m:t>
+        </m:r>
+        <m:r>
+          <m:rPr>
+            <m:sty m:val="p"/>
+          </m:rPr>
+          <m:t>(</m:t>
+        </m:r>
+        <m:r>
+          <m:t>x</m:t>
+        </m:r>
+        <m:r>
+          <m:rPr>
+            <m:sty m:val="p"/>
+          </m:rPr>
+          <m:t>)</m:t>
+        </m:r>
+        <m:r>
+          <m:rPr>
+            <m:sty m:val="p"/>
+          </m:rPr>
+          <m:t>=</m:t>
+        </m:r>
+        <m:sSup>
+          <m:e>
+            <m:r>
+              <m:t>x</m:t>
+            </m:r>
+          </m:e>
+          <m:sup>
+            <m:r>
+              <m:rPr>
+                <m:sty m:val="p"/>
+              </m:rPr>
+              <m:t>−</m:t>
+            </m:r>
+            <m:r>
+              <m:t>1</m:t>
+            </m:r>
+            <m:r>
+              <m:rPr>
+                <m:sty m:val="p"/>
+              </m:rPr>
+              <m:t>/</m:t>
+            </m:r>
+            <m:r>
+              <m:t>2</m:t>
+            </m:r>
+          </m:sup>
+        </m:sSup>
+      </m:oMath>
+      <w:r>
+        <w:t xml:space="preserve">.</w:t>
+      </w:r>
+    </w:p>
+    <w:p>
+      <w:pPr>
+        <w:pStyle w:val="Compact"/>
+        <w:numPr>
+          <w:ilvl w:val="0"/>
+          <w:numId w:val="1018"/>
+        </w:numPr>
+      </w:pPr>
+      <w:r>
+        <w:t xml:space="preserve">For</w:t>
+      </w:r>
+      <w:r>
+        <w:t xml:space="preserve"> </w:t>
+      </w:r>
+      <m:oMath>
+        <m:r>
+          <m:t>p</m:t>
+        </m:r>
+        <m:r>
+          <m:rPr>
+            <m:sty m:val="p"/>
+          </m:rPr>
+          <m:t>=</m:t>
+        </m:r>
+        <m:r>
+          <m:t>1</m:t>
+        </m:r>
+      </m:oMath>
+      <w:r>
+        <w:t xml:space="preserve">:</w:t>
+      </w:r>
+    </w:p>
+    <w:p>
+      <w:pPr>
+        <w:pStyle w:val="Compact"/>
+      </w:pPr>
+      <m:oMathPara>
+        <m:oMathParaPr>
+          <m:jc m:val="center"/>
+        </m:oMathParaPr>
+        <m:oMath>
+          <m:eqArr>
+            <m:e>
+              <m:r>
+                <m:t>​</m:t>
+              </m:r>
+              <m:d>
+                <m:dPr>
+                  <m:begChr m:val="∥"/>
+                  <m:sepChr m:val=""/>
+                  <m:endChr m:val="∥"/>
+                  <m:grow/>
+                </m:dPr>
+                <m:e>
+                  <m:r>
+                    <m:t>f</m:t>
+                  </m:r>
+                </m:e>
+              </m:d>
+              <m:sSub>
+                <m:e>
+                  <m:r>
+                    <m:t>​</m:t>
+                  </m:r>
+                </m:e>
+                <m:sub>
+                  <m:r>
+                    <m:t>1</m:t>
+                  </m:r>
+                </m:sub>
+              </m:sSub>
+              <m:r>
+                <m:t>&amp;</m:t>
+              </m:r>
+              <m:r>
+                <m:rPr>
+                  <m:sty m:val="p"/>
+                </m:rPr>
+                <m:t>=</m:t>
+              </m:r>
+              <m:nary>
+                <m:naryPr>
+                  <m:chr m:val="∫"/>
+                  <m:limLoc m:val="subSup"/>
+                  <m:subHide m:val="off"/>
+                  <m:supHide m:val="off"/>
+                </m:naryPr>
+                <m:sub>
+                  <m:r>
+                    <m:t>0</m:t>
+                  </m:r>
+                </m:sub>
+                <m:sup>
+                  <m:r>
+                    <m:t>1</m:t>
+                  </m:r>
+                </m:sup>
+                <m:e>
+                  <m:sSup>
+                    <m:e>
+                      <m:r>
+                        <m:t>x</m:t>
+                      </m:r>
+                    </m:e>
+                    <m:sup>
+                      <m:r>
+                        <m:rPr>
+                          <m:sty m:val="p"/>
+                        </m:rPr>
+                        <m:t>−</m:t>
+                      </m:r>
+                      <m:r>
+                        <m:t>1</m:t>
+                      </m:r>
+                      <m:r>
+                        <m:rPr>
+                          <m:sty m:val="p"/>
+                        </m:rPr>
+                        <m:t>/</m:t>
+                      </m:r>
+                      <m:r>
+                        <m:t>2</m:t>
+                      </m:r>
+                    </m:sup>
+                  </m:sSup>
+                </m:e>
+              </m:nary>
+              <m:r>
+                <m:t> </m:t>
+              </m:r>
+              <m:r>
+                <m:t>d</m:t>
+              </m:r>
+              <m:r>
+                <m:t>x</m:t>
+              </m:r>
+            </m:e>
+            <m:e>
+              <m:r>
+                <m:t>&amp;</m:t>
+              </m:r>
+              <m:r>
+                <m:rPr>
+                  <m:sty m:val="p"/>
+                </m:rPr>
+                <m:t>=</m:t>
+              </m:r>
+              <m:r>
+                <m:t>​</m:t>
+              </m:r>
+              <m:d>
+                <m:dPr>
+                  <m:begChr m:val="["/>
+                  <m:sepChr m:val=""/>
+                  <m:endChr m:val="]"/>
+                  <m:grow/>
+                </m:dPr>
+                <m:e>
+                  <m:r>
+                    <m:t>2</m:t>
+                  </m:r>
+                  <m:sSup>
+                    <m:e>
+                      <m:r>
+                        <m:t>x</m:t>
+                      </m:r>
+                    </m:e>
+                    <m:sup>
+                      <m:r>
+                        <m:t>1</m:t>
+                      </m:r>
+                      <m:r>
+                        <m:rPr>
+                          <m:sty m:val="p"/>
+                        </m:rPr>
+                        <m:t>/</m:t>
+                      </m:r>
+                      <m:r>
+                        <m:t>2</m:t>
+                      </m:r>
+                    </m:sup>
+                  </m:sSup>
+                </m:e>
+              </m:d>
+              <m:sSubSup>
+                <m:e>
+                  <m:r>
+                    <m:t>​</m:t>
+                  </m:r>
+                </m:e>
+                <m:sub>
+                  <m:r>
+                    <m:t>0</m:t>
+                  </m:r>
+                </m:sub>
+                <m:sup>
+                  <m:r>
+                    <m:t>1</m:t>
+                  </m:r>
+                </m:sup>
+              </m:sSubSup>
+            </m:e>
+            <m:e>
+              <m:r>
+                <m:t>&amp;</m:t>
+              </m:r>
+              <m:r>
+                <m:rPr>
+                  <m:sty m:val="p"/>
+                </m:rPr>
+                <m:t>=</m:t>
+              </m:r>
+              <m:r>
+                <m:t>2</m:t>
+              </m:r>
+            </m:e>
+            <m:e>
+              <m:r>
+                <m:t>&amp;</m:t>
+              </m:r>
+              <m:r>
+                <m:rPr>
+                  <m:sty m:val="p"/>
+                </m:rPr>
+                <m:t>&lt;</m:t>
+              </m:r>
+              <m:r>
+                <m:rPr>
+                  <m:sty m:val="p"/>
+                </m:rPr>
+                <m:t>∞</m:t>
+              </m:r>
+              <m:r>
+                <m:rPr>
+                  <m:sty m:val="p"/>
+                </m:rPr>
+                <m:t>,</m:t>
+              </m:r>
+            </m:e>
+          </m:eqArr>
+        </m:oMath>
+      </m:oMathPara>
+    </w:p>
+    <w:p>
+      <w:pPr>
+        <w:pStyle w:val="Compact"/>
+        <w:numPr>
+          <w:ilvl w:val="0"/>
+          <w:numId w:val="1000"/>
+        </w:numPr>
+      </w:pPr>
+      <w:r>
+        <w:t xml:space="preserve">so</w:t>
+      </w:r>
+      <w:r>
+        <w:t xml:space="preserve"> </w:t>
+      </w:r>
+      <m:oMath>
+        <m:r>
+          <m:t>f</m:t>
+        </m:r>
+        <m:r>
+          <m:rPr>
+            <m:sty m:val="p"/>
+          </m:rPr>
+          <m:t>∈</m:t>
+        </m:r>
+        <m:sSup>
+          <m:e>
+            <m:r>
+              <m:t>L</m:t>
+            </m:r>
+          </m:e>
+          <m:sup>
+            <m:r>
+              <m:t>1</m:t>
+            </m:r>
+          </m:sup>
+        </m:sSup>
+        <m:r>
+          <m:rPr>
+            <m:sty m:val="p"/>
+          </m:rPr>
+          <m:t>(</m:t>
+        </m:r>
+        <m:r>
+          <m:rPr>
+            <m:sty m:val="p"/>
+          </m:rPr>
+          <m:t>(</m:t>
+        </m:r>
+        <m:r>
+          <m:t>0</m:t>
+        </m:r>
+        <m:r>
+          <m:rPr>
+            <m:sty m:val="p"/>
+          </m:rPr>
+          <m:t>,</m:t>
+        </m:r>
+        <m:r>
+          <m:t>1</m:t>
+        </m:r>
+        <m:r>
+          <m:rPr>
+            <m:sty m:val="p"/>
+          </m:rPr>
+          <m:t>)</m:t>
+        </m:r>
+        <m:r>
+          <m:rPr>
+            <m:sty m:val="p"/>
+          </m:rPr>
+          <m:t>,</m:t>
+        </m:r>
+        <m:r>
+          <m:t>μ</m:t>
+        </m:r>
+        <m:r>
+          <m:rPr>
+            <m:sty m:val="p"/>
+          </m:rPr>
+          <m:t>)</m:t>
+        </m:r>
+      </m:oMath>
+      <w:r>
+        <w:t xml:space="preserve">.</w:t>
+      </w:r>
+    </w:p>
+    <w:p>
+      <w:pPr>
+        <w:pStyle w:val="Compact"/>
+        <w:numPr>
+          <w:ilvl w:val="0"/>
+          <w:numId w:val="1018"/>
+        </w:numPr>
+      </w:pPr>
+      <w:r>
+        <w:t xml:space="preserve">For</w:t>
+      </w:r>
+      <w:r>
+        <w:t xml:space="preserve"> </w:t>
+      </w:r>
+      <m:oMath>
+        <m:r>
+          <m:t>p</m:t>
+        </m:r>
+        <m:r>
+          <m:rPr>
+            <m:sty m:val="p"/>
+          </m:rPr>
+          <m:t>=</m:t>
+        </m:r>
+        <m:r>
+          <m:t>2</m:t>
+        </m:r>
+      </m:oMath>
+      <w:r>
+        <w:t xml:space="preserve">:</w:t>
+      </w:r>
+    </w:p>
+    <w:p>
+      <w:pPr>
+        <w:pStyle w:val="Compact"/>
+      </w:pPr>
+      <m:oMathPara>
+        <m:oMathParaPr>
+          <m:jc m:val="center"/>
+        </m:oMathParaPr>
+        <m:oMath>
+          <m:eqArr>
+            <m:e>
+              <m:r>
+                <m:t>​</m:t>
+              </m:r>
+              <m:d>
+                <m:dPr>
+                  <m:begChr m:val="|"/>
+                  <m:sepChr m:val=""/>
+                  <m:endChr m:val="|"/>
+                  <m:grow/>
+                </m:dPr>
+                <m:e>
+                  <m:r>
+                    <m:t>f</m:t>
+                  </m:r>
+                  <m:r>
+                    <m:rPr>
+                      <m:sty m:val="p"/>
+                    </m:rPr>
+                    <m:t>(</m:t>
+                  </m:r>
+                  <m:r>
+                    <m:t>x</m:t>
+                  </m:r>
+                  <m:r>
+                    <m:rPr>
+                      <m:sty m:val="p"/>
+                    </m:rPr>
+                    <m:t>)</m:t>
+                  </m:r>
+                </m:e>
+              </m:d>
+              <m:sSup>
+                <m:e>
+                  <m:r>
+                    <m:t>​</m:t>
+                  </m:r>
+                </m:e>
+                <m:sup>
+                  <m:r>
+                    <m:t>2</m:t>
+                  </m:r>
+                </m:sup>
+              </m:sSup>
+              <m:r>
+                <m:t>&amp;</m:t>
+              </m:r>
+              <m:r>
+                <m:rPr>
+                  <m:sty m:val="p"/>
+                </m:rPr>
+                <m:t>=</m:t>
+              </m:r>
+              <m:r>
+                <m:t>​</m:t>
+              </m:r>
+              <m:d>
+                <m:dPr>
+                  <m:begChr m:val="("/>
+                  <m:sepChr m:val=""/>
+                  <m:endChr m:val=")"/>
+                  <m:grow/>
+                </m:dPr>
+                <m:e>
+                  <m:sSup>
+                    <m:e>
+                      <m:r>
+                        <m:t>x</m:t>
+                      </m:r>
+                    </m:e>
+                    <m:sup>
+                      <m:r>
+                        <m:rPr>
+                          <m:sty m:val="p"/>
+                        </m:rPr>
+                        <m:t>−</m:t>
+                      </m:r>
+                      <m:r>
+                        <m:t>1</m:t>
+                      </m:r>
+                      <m:r>
+                        <m:rPr>
+                          <m:sty m:val="p"/>
+                        </m:rPr>
+                        <m:t>/</m:t>
+                      </m:r>
+                      <m:r>
+                        <m:t>2</m:t>
+                      </m:r>
+                    </m:sup>
+                  </m:sSup>
+                </m:e>
+              </m:d>
+              <m:sSup>
+                <m:e>
+                  <m:r>
+                    <m:t>​</m:t>
+                  </m:r>
+                </m:e>
+                <m:sup>
+                  <m:r>
+                    <m:t>2</m:t>
+                  </m:r>
+                </m:sup>
+              </m:sSup>
+            </m:e>
+            <m:e>
+              <m:r>
+                <m:t>&amp;</m:t>
+              </m:r>
+              <m:r>
+                <m:rPr>
+                  <m:sty m:val="p"/>
+                </m:rPr>
+                <m:t>=</m:t>
+              </m:r>
+              <m:f>
+                <m:fPr>
+                  <m:type m:val="bar"/>
+                </m:fPr>
+                <m:num>
+                  <m:r>
+                    <m:t>1</m:t>
+                  </m:r>
+                </m:num>
+                <m:den>
+                  <m:r>
+                    <m:t>x</m:t>
+                  </m:r>
+                </m:den>
+              </m:f>
+              <m:r>
+                <m:rPr>
+                  <m:sty m:val="p"/>
+                </m:rPr>
+                <m:t>.</m:t>
+              </m:r>
+            </m:e>
+          </m:eqArr>
+        </m:oMath>
+      </m:oMathPara>
+    </w:p>
+    <w:p>
+      <w:pPr>
+        <w:pStyle w:val="Compact"/>
+        <w:numPr>
+          <w:ilvl w:val="0"/>
+          <w:numId w:val="1000"/>
+        </w:numPr>
+      </w:pPr>
+      <w:r>
+        <w:t xml:space="preserve">The integral is:</w:t>
+      </w:r>
+    </w:p>
+    <w:p>
+      <w:pPr>
+        <w:pStyle w:val="Compact"/>
+      </w:pPr>
+      <m:oMathPara>
+        <m:oMathParaPr>
+          <m:jc m:val="center"/>
+        </m:oMathParaPr>
+        <m:oMath>
+          <m:eqArr>
+            <m:e>
+              <m:nary>
+                <m:naryPr>
+                  <m:chr m:val="∫"/>
+                  <m:limLoc m:val="subSup"/>
+                  <m:subHide m:val="off"/>
+                  <m:supHide m:val="off"/>
+                </m:naryPr>
+                <m:sub>
+                  <m:r>
+                    <m:t>0</m:t>
+                  </m:r>
+                </m:sub>
+                <m:sup>
+                  <m:r>
+                    <m:t>1</m:t>
+                  </m:r>
+                </m:sup>
+                <m:e>
+                  <m:f>
+                    <m:fPr>
+                      <m:type m:val="bar"/>
+                    </m:fPr>
+                    <m:num>
+                      <m:r>
+                        <m:t>1</m:t>
+                      </m:r>
+                    </m:num>
+                    <m:den>
+                      <m:r>
+                        <m:t>x</m:t>
+                      </m:r>
+                    </m:den>
+                  </m:f>
+                </m:e>
+              </m:nary>
+              <m:r>
+                <m:t> </m:t>
+              </m:r>
+              <m:r>
+                <m:t>d</m:t>
+              </m:r>
+              <m:r>
+                <m:t>x</m:t>
+              </m:r>
+              <m:r>
+                <m:t>&amp;</m:t>
+              </m:r>
+              <m:r>
+                <m:rPr>
+                  <m:sty m:val="p"/>
+                </m:rPr>
+                <m:t>=</m:t>
+              </m:r>
+              <m:limLow>
+                <m:e>
+                  <m:r>
+                    <m:rPr>
+                      <m:sty m:val="p"/>
+                    </m:rPr>
+                    <m:t>lim</m:t>
+                  </m:r>
+                </m:e>
+                <m:lim>
+                  <m:r>
+                    <m:t>ε</m:t>
+                  </m:r>
+                  <m:r>
+                    <m:rPr>
+                      <m:sty m:val="p"/>
+                    </m:rPr>
+                    <m:t>→</m:t>
+                  </m:r>
+                  <m:sSup>
+                    <m:e>
+                      <m:r>
+                        <m:t>0</m:t>
+                      </m:r>
+                    </m:e>
+                    <m:sup>
+                      <m:r>
+                        <m:rPr>
+                          <m:sty m:val="p"/>
+                        </m:rPr>
+                        <m:t>+</m:t>
+                      </m:r>
+                    </m:sup>
+                  </m:sSup>
+                </m:lim>
+              </m:limLow>
+              <m:r>
+                <m:t>​</m:t>
+              </m:r>
+              <m:d>
+                <m:dPr>
+                  <m:begChr m:val="["/>
+                  <m:sepChr m:val=""/>
+                  <m:endChr m:val="]"/>
+                  <m:grow/>
+                </m:dPr>
+                <m:e>
+                  <m:r>
+                    <m:rPr>
+                      <m:sty m:val="p"/>
+                    </m:rPr>
+                    <m:t>ln</m:t>
+                  </m:r>
+                  <m:r>
+                    <m:t>x</m:t>
+                  </m:r>
+                </m:e>
+              </m:d>
+              <m:sSubSup>
+                <m:e>
+                  <m:r>
+                    <m:t>​</m:t>
+                  </m:r>
+                </m:e>
+                <m:sub>
+                  <m:r>
+                    <m:t>ε</m:t>
+                  </m:r>
+                </m:sub>
+                <m:sup>
+                  <m:r>
+                    <m:t>1</m:t>
+                  </m:r>
+                </m:sup>
+              </m:sSubSup>
+            </m:e>
+            <m:e>
+              <m:r>
+                <m:t>&amp;</m:t>
+              </m:r>
+              <m:r>
+                <m:rPr>
+                  <m:sty m:val="p"/>
+                </m:rPr>
+                <m:t>=</m:t>
+              </m:r>
+              <m:limLow>
+                <m:e>
+                  <m:r>
+                    <m:rPr>
+                      <m:sty m:val="p"/>
+                    </m:rPr>
+                    <m:t>lim</m:t>
+                  </m:r>
+                </m:e>
+                <m:lim>
+                  <m:r>
+                    <m:t>ε</m:t>
+                  </m:r>
+                  <m:r>
+                    <m:rPr>
+                      <m:sty m:val="p"/>
+                    </m:rPr>
+                    <m:t>→</m:t>
+                  </m:r>
+                  <m:sSup>
+                    <m:e>
+                      <m:r>
+                        <m:t>0</m:t>
+                      </m:r>
+                    </m:e>
+                    <m:sup>
+                      <m:r>
+                        <m:rPr>
+                          <m:sty m:val="p"/>
+                        </m:rPr>
+                        <m:t>+</m:t>
+                      </m:r>
+                    </m:sup>
+                  </m:sSup>
+                </m:lim>
+              </m:limLow>
+              <m:r>
+                <m:rPr>
+                  <m:sty m:val="p"/>
+                </m:rPr>
+                <m:t>(</m:t>
+              </m:r>
+              <m:r>
+                <m:rPr>
+                  <m:sty m:val="p"/>
+                </m:rPr>
+                <m:t>−</m:t>
+              </m:r>
+              <m:r>
+                <m:rPr>
+                  <m:sty m:val="p"/>
+                </m:rPr>
+                <m:t>ln</m:t>
+              </m:r>
+              <m:r>
+                <m:t>ε</m:t>
+              </m:r>
+              <m:r>
+                <m:rPr>
+                  <m:sty m:val="p"/>
+                </m:rPr>
+                <m:t>)</m:t>
+              </m:r>
+            </m:e>
+            <m:e>
+              <m:r>
+                <m:t>&amp;</m:t>
+              </m:r>
+              <m:r>
+                <m:rPr>
+                  <m:sty m:val="p"/>
+                </m:rPr>
+                <m:t>=</m:t>
+              </m:r>
+              <m:r>
+                <m:rPr>
+                  <m:sty m:val="p"/>
+                </m:rPr>
+                <m:t>∞</m:t>
+              </m:r>
+              <m:r>
+                <m:rPr>
+                  <m:sty m:val="p"/>
+                </m:rPr>
+                <m:t>.</m:t>
+              </m:r>
+            </m:e>
+          </m:eqArr>
+        </m:oMath>
+      </m:oMathPara>
+    </w:p>
+    <w:p>
+      <w:pPr>
+        <w:pStyle w:val="Compact"/>
+        <w:numPr>
+          <w:ilvl w:val="0"/>
+          <w:numId w:val="1000"/>
+        </w:numPr>
+      </w:pPr>
+      <w:r>
+        <w:t xml:space="preserve">Therefore,</w:t>
+      </w:r>
+      <w:r>
+        <w:t xml:space="preserve"> </w:t>
+      </w:r>
+      <m:oMath>
+        <m:r>
+          <m:t>​</m:t>
+        </m:r>
+        <m:d>
+          <m:dPr>
+            <m:begChr m:val="∥"/>
+            <m:sepChr m:val=""/>
+            <m:endChr m:val="∥"/>
+            <m:grow/>
+          </m:dPr>
+          <m:e>
+            <m:r>
+              <m:t>f</m:t>
+            </m:r>
+          </m:e>
+        </m:d>
+        <m:sSub>
+          <m:e>
+            <m:r>
+              <m:t>​</m:t>
+            </m:r>
+          </m:e>
+          <m:sub>
+            <m:r>
+              <m:t>2</m:t>
+            </m:r>
+          </m:sub>
+        </m:sSub>
+        <m:r>
+          <m:rPr>
+            <m:sty m:val="p"/>
+          </m:rPr>
+          <m:t>=</m:t>
+        </m:r>
+        <m:r>
+          <m:rPr>
+            <m:sty m:val="p"/>
+          </m:rPr>
+          <m:t>∞</m:t>
+        </m:r>
+      </m:oMath>
+      <w:r>
+        <w:t xml:space="preserve">, so</w:t>
+      </w:r>
+      <w:r>
+        <w:t xml:space="preserve"> </w:t>
+      </w:r>
+      <m:oMath>
+        <m:r>
+          <m:t>f</m:t>
+        </m:r>
+        <m:r>
+          <m:rPr>
+            <m:sty m:val="p"/>
+          </m:rPr>
+          <m:t>∉</m:t>
+        </m:r>
+        <m:sSup>
+          <m:e>
+            <m:r>
+              <m:t>L</m:t>
+            </m:r>
+          </m:e>
+          <m:sup>
+            <m:r>
+              <m:t>2</m:t>
+            </m:r>
+          </m:sup>
+        </m:sSup>
+        <m:r>
+          <m:rPr>
+            <m:sty m:val="p"/>
+          </m:rPr>
+          <m:t>(</m:t>
+        </m:r>
+        <m:r>
+          <m:rPr>
+            <m:sty m:val="p"/>
+          </m:rPr>
+          <m:t>(</m:t>
+        </m:r>
+        <m:r>
+          <m:t>0</m:t>
+        </m:r>
+        <m:r>
+          <m:rPr>
+            <m:sty m:val="p"/>
+          </m:rPr>
+          <m:t>,</m:t>
+        </m:r>
+        <m:r>
+          <m:t>1</m:t>
+        </m:r>
+        <m:r>
+          <m:rPr>
+            <m:sty m:val="p"/>
+          </m:rPr>
+          <m:t>)</m:t>
+        </m:r>
+        <m:r>
+          <m:rPr>
+            <m:sty m:val="p"/>
+          </m:rPr>
+          <m:t>,</m:t>
+        </m:r>
+        <m:r>
+          <m:t>μ</m:t>
+        </m:r>
+        <m:r>
+          <m:rPr>
+            <m:sty m:val="p"/>
+          </m:rPr>
+          <m:t>)</m:t>
+        </m:r>
+      </m:oMath>
+      <w:r>
+        <w:t xml:space="preserve">.</w:t>
+      </w:r>
+    </w:p>
+    <w:p>
+      <w:pPr>
+        <w:pStyle w:val="FirstParagraph"/>
+      </w:pPr>
+      <w:r>
+        <w:t xml:space="preserve">This shows that</w:t>
+      </w:r>
+      <w:r>
+        <w:t xml:space="preserve"> </w:t>
+      </w:r>
+      <m:oMath>
+        <m:sSup>
+          <m:e>
+            <m:r>
+              <m:t>L</m:t>
+            </m:r>
+          </m:e>
+          <m:sup>
+            <m:r>
+              <m:t>2</m:t>
+            </m:r>
+          </m:sup>
+        </m:sSup>
+        <m:r>
+          <m:rPr>
+            <m:sty m:val="p"/>
+          </m:rPr>
+          <m:t>⊂</m:t>
+        </m:r>
+        <m:sSup>
+          <m:e>
+            <m:r>
+              <m:t>L</m:t>
+            </m:r>
+          </m:e>
+          <m:sup>
+            <m:r>
+              <m:t>1</m:t>
+            </m:r>
+          </m:sup>
+        </m:sSup>
+      </m:oMath>
+      <w:r>
+        <w:t xml:space="preserve"> </w:t>
+      </w:r>
+      <w:r>
+        <w:t xml:space="preserve">on finite-measure sets: higher exponents impose stricter integrability requirements near singularities.</w:t>
+      </w:r>
+    </w:p>
+    <w:bookmarkEnd w:id="127"/>
+    <w:bookmarkStart w:id="128" w:name="def-linf-space"/>
+    <w:p>
+      <w:pPr>
+        <w:pStyle w:val="BodyText"/>
+      </w:pPr>
+      <w:r>
+        <w:rPr>
+          <w:b/>
+          <w:bCs/>
+        </w:rPr>
+        <w:t xml:space="preserve">Definition 28 (</w:t>
+      </w:r>
+      <m:oMath>
+        <m:sSup>
+          <m:e>
+            <m:r>
+              <m:t>L</m:t>
+            </m:r>
+          </m:e>
+          <m:sup>
+            <m:r>
+              <m:rPr>
+                <m:sty m:val="p"/>
+              </m:rPr>
+              <m:t>∞</m:t>
+            </m:r>
+          </m:sup>
+        </m:sSup>
+      </m:oMath>
+      <w:r>
+        <w:rPr>
+          <w:b/>
+          <w:bCs/>
+        </w:rPr>
+        <w:t xml:space="preserve"> </w:t>
+      </w:r>
+      <w:r>
+        <w:rPr>
+          <w:b/>
+          <w:bCs/>
+        </w:rPr>
+        <w:t xml:space="preserve">space and essential supremum norm)</w:t>
+      </w:r>
+      <w:r>
+        <w:t xml:space="preserve"> </w:t>
+      </w:r>
+      <w:r>
+        <w:t xml:space="preserve">Let</w:t>
+      </w:r>
+      <w:r>
+        <w:t xml:space="preserve"> </w:t>
+      </w:r>
+      <m:oMath>
+        <m:r>
+          <m:rPr>
+            <m:sty m:val="p"/>
+          </m:rPr>
+          <m:t>(</m:t>
+        </m:r>
+        <m:r>
+          <m:t>S</m:t>
+        </m:r>
+        <m:r>
+          <m:rPr>
+            <m:sty m:val="p"/>
+          </m:rPr>
+          <m:t>,</m:t>
+        </m:r>
+        <m:r>
+          <m:rPr>
+            <m:scr m:val="script"/>
+            <m:sty m:val="p"/>
+          </m:rPr>
+          <m:t>S</m:t>
+        </m:r>
+        <m:r>
+          <m:rPr>
+            <m:sty m:val="p"/>
+          </m:rPr>
+          <m:t>,</m:t>
+        </m:r>
+        <m:r>
+          <m:t>μ</m:t>
+        </m:r>
+        <m:r>
+          <m:rPr>
+            <m:sty m:val="p"/>
+          </m:rPr>
+          <m:t>)</m:t>
+        </m:r>
+      </m:oMath>
+      <w:r>
+        <w:t xml:space="preserve"> </w:t>
+      </w:r>
+      <w:r>
+        <w:t xml:space="preserve">be a</w:t>
+      </w:r>
+      <w:r>
+        <w:t xml:space="preserve"> </w:t>
+      </w:r>
+      <w:hyperlink w:anchor="def-measure-space">
+        <w:r>
+          <w:rPr>
+            <w:rStyle w:val="Hyperlink"/>
+          </w:rPr>
+          <w:t xml:space="preserve">measure space</w:t>
+        </w:r>
+      </w:hyperlink>
+      <w:r>
+        <w:t xml:space="preserve">.</w:t>
+      </w:r>
+      <w:r>
+        <w:t xml:space="preserve"> </w:t>
+      </w:r>
       <w:r>
         <w:t xml:space="preserve">For</w:t>
       </w:r>
@@ -34976,7 +36709,54 @@
         <w:t xml:space="preserve">norm</w:t>
       </w:r>
       <w:r>
-        <w:t xml:space="preserve">) is:</w:t>
+        <w:t xml:space="preserve">) of a</w:t>
+      </w:r>
+      <w:r>
+        <w:t xml:space="preserve"> </w:t>
+      </w:r>
+      <w:hyperlink w:anchor="def-measurable-function">
+        <w:r>
+          <w:rPr>
+            <w:rStyle w:val="Hyperlink"/>
+          </w:rPr>
+          <w:t xml:space="preserve">measurable function</w:t>
+        </w:r>
+      </w:hyperlink>
+      <w:r>
+        <w:t xml:space="preserve"> </w:t>
+      </w:r>
+      <m:oMath>
+        <m:r>
+          <m:t>f</m:t>
+        </m:r>
+        <m:r>
+          <m:rPr>
+            <m:sty m:val="p"/>
+          </m:rPr>
+          <m:t>:</m:t>
+        </m:r>
+        <m:r>
+          <m:t>S</m:t>
+        </m:r>
+        <m:r>
+          <m:rPr>
+            <m:sty m:val="p"/>
+          </m:rPr>
+          <m:t>→</m:t>
+        </m:r>
+        <m:r>
+          <m:rPr>
+            <m:scr m:val="double-struck"/>
+            <m:sty m:val="p"/>
+          </m:rPr>
+          <m:t>R</m:t>
+        </m:r>
+      </m:oMath>
+      <w:r>
+        <w:t xml:space="preserve"> </w:t>
+      </w:r>
+      <w:r>
+        <w:t xml:space="preserve">is:</w:t>
       </w:r>
     </w:p>
     <w:p>
@@ -35256,1253 +37036,48 @@
         <w:t xml:space="preserve"> </w:t>
       </w:r>
       <w:r>
-        <w:t xml:space="preserve">consists of equivalence classes of essentially bounded measurable functions.</w:t>
-      </w:r>
-    </w:p>
-    <w:bookmarkEnd w:id="123"/>
-    <w:bookmarkStart w:id="124" w:name="exm-lp-space"/>
-    <w:p>
-      <w:pPr>
-        <w:pStyle w:val="BodyText"/>
-      </w:pPr>
-      <w:r>
-        <w:rPr>
-          <w:b/>
-          <w:bCs/>
-        </w:rPr>
-        <w:t xml:space="preserve">Example 29 (An</w:t>
-      </w:r>
-      <w:r>
-        <w:rPr>
-          <w:b/>
-          <w:bCs/>
-        </w:rPr>
-        <w:t xml:space="preserve"> </w:t>
-      </w:r>
-      <m:oMath>
-        <m:sSup>
-          <m:e>
-            <m:r>
-              <m:t>L</m:t>
-            </m:r>
-          </m:e>
-          <m:sup>
-            <m:r>
-              <m:t>1</m:t>
-            </m:r>
-          </m:sup>
-        </m:sSup>
-      </m:oMath>
-      <w:r>
-        <w:rPr>
-          <w:b/>
-          <w:bCs/>
-        </w:rPr>
-        <w:t xml:space="preserve"> </w:t>
-      </w:r>
-      <w:r>
-        <w:rPr>
-          <w:b/>
-          <w:bCs/>
-        </w:rPr>
-        <w:t xml:space="preserve">function not in</w:t>
-      </w:r>
-      <w:r>
-        <w:rPr>
-          <w:b/>
-          <w:bCs/>
-        </w:rPr>
-        <w:t xml:space="preserve"> </w:t>
-      </w:r>
-      <m:oMath>
-        <m:sSup>
-          <m:e>
-            <m:r>
-              <m:t>L</m:t>
-            </m:r>
-          </m:e>
-          <m:sup>
-            <m:r>
-              <m:t>2</m:t>
-            </m:r>
-          </m:sup>
-        </m:sSup>
-      </m:oMath>
-      <w:r>
-        <w:rPr>
-          <w:b/>
-          <w:bCs/>
-        </w:rPr>
-        <w:t xml:space="preserve">)</w:t>
-      </w:r>
-      <w:r>
-        <w:t xml:space="preserve"> </w:t>
-      </w:r>
-      <w:r>
-        <w:t xml:space="preserve">Consider the interval</w:t>
-      </w:r>
-      <w:r>
-        <w:t xml:space="preserve"> </w:t>
-      </w:r>
-      <m:oMath>
-        <m:r>
-          <m:rPr>
-            <m:sty m:val="p"/>
-          </m:rPr>
-          <m:t>(</m:t>
-        </m:r>
-        <m:r>
-          <m:t>0</m:t>
-        </m:r>
-        <m:r>
-          <m:rPr>
-            <m:sty m:val="p"/>
-          </m:rPr>
-          <m:t>,</m:t>
-        </m:r>
-        <m:r>
-          <m:t>1</m:t>
-        </m:r>
-        <m:r>
-          <m:rPr>
-            <m:sty m:val="p"/>
-          </m:rPr>
-          <m:t>)</m:t>
-        </m:r>
-      </m:oMath>
-      <w:r>
-        <w:t xml:space="preserve"> </w:t>
-      </w:r>
-      <w:r>
-        <w:t xml:space="preserve">equipped with the Borel</w:t>
-      </w:r>
-      <w:r>
-        <w:t xml:space="preserve"> </w:t>
-      </w:r>
-      <m:oMath>
-        <m:r>
-          <m:t>σ</m:t>
-        </m:r>
-      </m:oMath>
-      <w:r>
-        <w:t xml:space="preserve">-algebra (</w:t>
-      </w:r>
-      <w:hyperlink w:anchor="def-borel-sigma-algebra">
+        <w:t xml:space="preserve">consists of equivalence classes of essentially bounded measurable functions,</w:t>
+      </w:r>
+      <w:r>
+        <w:t xml:space="preserve"> </w:t>
+      </w:r>
+      <w:r>
+        <w:t xml:space="preserve">identified as in</w:t>
+      </w:r>
+      <w:r>
+        <w:t xml:space="preserve"> </w:t>
+      </w:r>
+      <w:hyperlink w:anchor="def-lp-space">
         <w:r>
           <w:rPr>
             <w:rStyle w:val="Hyperlink"/>
           </w:rPr>
-          <w:t xml:space="preserve">Definition 4</w:t>
+          <w:t xml:space="preserve">Definition 27</w:t>
         </w:r>
       </w:hyperlink>
       <w:r>
-        <w:t xml:space="preserve">)</w:t>
-      </w:r>
-      <w:r>
-        <w:t xml:space="preserve"> </w:t>
-      </w:r>
-      <w:r>
-        <w:t xml:space="preserve">and Lebesgue measure</w:t>
-      </w:r>
-      <w:r>
-        <w:t xml:space="preserve"> </w:t>
-      </w:r>
-      <m:oMath>
-        <m:r>
-          <m:t>μ</m:t>
-        </m:r>
-      </m:oMath>
-      <w:r>
-        <w:t xml:space="preserve"> </w:t>
-      </w:r>
-      <w:r>
-        <w:t xml:space="preserve">(</w:t>
-      </w:r>
-      <w:hyperlink w:anchor="def-lebesgue-measure">
+        <w:t xml:space="preserve"> </w:t>
+      </w:r>
+      <w:r>
+        <w:t xml:space="preserve">when they are equal</w:t>
+      </w:r>
+      <w:r>
+        <w:t xml:space="preserve"> </w:t>
+      </w:r>
+      <w:hyperlink w:anchor="def-almost-everywhere">
         <w:r>
           <w:rPr>
             <w:rStyle w:val="Hyperlink"/>
           </w:rPr>
-          <w:t xml:space="preserve">Definition 15</w:t>
+          <w:t xml:space="preserve">almost everywhere</w:t>
         </w:r>
       </w:hyperlink>
       <w:r>
-        <w:t xml:space="preserve">).</w:t>
-      </w:r>
-      <w:r>
-        <w:t xml:space="preserve"> </w:t>
-      </w:r>
-      <w:r>
-        <w:t xml:space="preserve">Define</w:t>
-      </w:r>
-      <w:r>
-        <w:t xml:space="preserve"> </w:t>
-      </w:r>
-      <m:oMath>
-        <m:r>
-          <m:t>f</m:t>
-        </m:r>
-        <m:r>
-          <m:rPr>
-            <m:sty m:val="p"/>
-          </m:rPr>
-          <m:t>:</m:t>
-        </m:r>
-        <m:r>
-          <m:rPr>
-            <m:sty m:val="p"/>
-          </m:rPr>
-          <m:t>(</m:t>
-        </m:r>
-        <m:r>
-          <m:t>0</m:t>
-        </m:r>
-        <m:r>
-          <m:rPr>
-            <m:sty m:val="p"/>
-          </m:rPr>
-          <m:t>,</m:t>
-        </m:r>
-        <m:r>
-          <m:t>1</m:t>
-        </m:r>
-        <m:r>
-          <m:rPr>
-            <m:sty m:val="p"/>
-          </m:rPr>
-          <m:t>)</m:t>
-        </m:r>
-        <m:r>
-          <m:rPr>
-            <m:sty m:val="p"/>
-          </m:rPr>
-          <m:t>→</m:t>
-        </m:r>
-        <m:r>
-          <m:rPr>
-            <m:scr m:val="double-struck"/>
-            <m:sty m:val="p"/>
-          </m:rPr>
-          <m:t>R</m:t>
-        </m:r>
-      </m:oMath>
-      <w:r>
-        <w:t xml:space="preserve"> </w:t>
-      </w:r>
-      <w:r>
-        <w:t xml:space="preserve">by</w:t>
-      </w:r>
-      <w:r>
-        <w:t xml:space="preserve"> </w:t>
-      </w:r>
-      <m:oMath>
-        <m:r>
-          <m:t>f</m:t>
-        </m:r>
-        <m:r>
-          <m:rPr>
-            <m:sty m:val="p"/>
-          </m:rPr>
-          <m:t>(</m:t>
-        </m:r>
-        <m:r>
-          <m:t>x</m:t>
-        </m:r>
-        <m:r>
-          <m:rPr>
-            <m:sty m:val="p"/>
-          </m:rPr>
-          <m:t>)</m:t>
-        </m:r>
-        <m:r>
-          <m:rPr>
-            <m:sty m:val="p"/>
-          </m:rPr>
-          <m:t>=</m:t>
-        </m:r>
-        <m:sSup>
-          <m:e>
-            <m:r>
-              <m:t>x</m:t>
-            </m:r>
-          </m:e>
-          <m:sup>
-            <m:r>
-              <m:rPr>
-                <m:sty m:val="p"/>
-              </m:rPr>
-              <m:t>−</m:t>
-            </m:r>
-            <m:r>
-              <m:t>1</m:t>
-            </m:r>
-            <m:r>
-              <m:rPr>
-                <m:sty m:val="p"/>
-              </m:rPr>
-              <m:t>/</m:t>
-            </m:r>
-            <m:r>
-              <m:t>2</m:t>
-            </m:r>
-          </m:sup>
-        </m:sSup>
-      </m:oMath>
-      <w:r>
         <w:t xml:space="preserve">.</w:t>
       </w:r>
     </w:p>
-    <w:p>
-      <w:pPr>
-        <w:pStyle w:val="Compact"/>
-        <w:numPr>
-          <w:ilvl w:val="0"/>
-          <w:numId w:val="1018"/>
-        </w:numPr>
-      </w:pPr>
-      <w:r>
-        <w:t xml:space="preserve">For</w:t>
-      </w:r>
-      <w:r>
-        <w:t xml:space="preserve"> </w:t>
-      </w:r>
-      <m:oMath>
-        <m:r>
-          <m:t>p</m:t>
-        </m:r>
-        <m:r>
-          <m:rPr>
-            <m:sty m:val="p"/>
-          </m:rPr>
-          <m:t>=</m:t>
-        </m:r>
-        <m:r>
-          <m:t>1</m:t>
-        </m:r>
-      </m:oMath>
-      <w:r>
-        <w:t xml:space="preserve">:</w:t>
-      </w:r>
-    </w:p>
-    <w:p>
-      <w:pPr>
-        <w:pStyle w:val="Compact"/>
-      </w:pPr>
-      <m:oMathPara>
-        <m:oMathParaPr>
-          <m:jc m:val="center"/>
-        </m:oMathParaPr>
-        <m:oMath>
-          <m:eqArr>
-            <m:e>
-              <m:r>
-                <m:t>​</m:t>
-              </m:r>
-              <m:d>
-                <m:dPr>
-                  <m:begChr m:val="∥"/>
-                  <m:sepChr m:val=""/>
-                  <m:endChr m:val="∥"/>
-                  <m:grow/>
-                </m:dPr>
-                <m:e>
-                  <m:r>
-                    <m:t>f</m:t>
-                  </m:r>
-                </m:e>
-              </m:d>
-              <m:sSub>
-                <m:e>
-                  <m:r>
-                    <m:t>​</m:t>
-                  </m:r>
-                </m:e>
-                <m:sub>
-                  <m:r>
-                    <m:t>1</m:t>
-                  </m:r>
-                </m:sub>
-              </m:sSub>
-              <m:r>
-                <m:t>&amp;</m:t>
-              </m:r>
-              <m:r>
-                <m:rPr>
-                  <m:sty m:val="p"/>
-                </m:rPr>
-                <m:t>=</m:t>
-              </m:r>
-              <m:nary>
-                <m:naryPr>
-                  <m:chr m:val="∫"/>
-                  <m:limLoc m:val="subSup"/>
-                  <m:subHide m:val="off"/>
-                  <m:supHide m:val="off"/>
-                </m:naryPr>
-                <m:sub>
-                  <m:r>
-                    <m:t>0</m:t>
-                  </m:r>
-                </m:sub>
-                <m:sup>
-                  <m:r>
-                    <m:t>1</m:t>
-                  </m:r>
-                </m:sup>
-                <m:e>
-                  <m:sSup>
-                    <m:e>
-                      <m:r>
-                        <m:t>x</m:t>
-                      </m:r>
-                    </m:e>
-                    <m:sup>
-                      <m:r>
-                        <m:rPr>
-                          <m:sty m:val="p"/>
-                        </m:rPr>
-                        <m:t>−</m:t>
-                      </m:r>
-                      <m:r>
-                        <m:t>1</m:t>
-                      </m:r>
-                      <m:r>
-                        <m:rPr>
-                          <m:sty m:val="p"/>
-                        </m:rPr>
-                        <m:t>/</m:t>
-                      </m:r>
-                      <m:r>
-                        <m:t>2</m:t>
-                      </m:r>
-                    </m:sup>
-                  </m:sSup>
-                </m:e>
-              </m:nary>
-              <m:r>
-                <m:t> </m:t>
-              </m:r>
-              <m:r>
-                <m:t>d</m:t>
-              </m:r>
-              <m:r>
-                <m:t>x</m:t>
-              </m:r>
-            </m:e>
-            <m:e>
-              <m:r>
-                <m:t>&amp;</m:t>
-              </m:r>
-              <m:r>
-                <m:rPr>
-                  <m:sty m:val="p"/>
-                </m:rPr>
-                <m:t>=</m:t>
-              </m:r>
-              <m:r>
-                <m:t>​</m:t>
-              </m:r>
-              <m:d>
-                <m:dPr>
-                  <m:begChr m:val="["/>
-                  <m:sepChr m:val=""/>
-                  <m:endChr m:val="]"/>
-                  <m:grow/>
-                </m:dPr>
-                <m:e>
-                  <m:r>
-                    <m:t>2</m:t>
-                  </m:r>
-                  <m:sSup>
-                    <m:e>
-                      <m:r>
-                        <m:t>x</m:t>
-                      </m:r>
-                    </m:e>
-                    <m:sup>
-                      <m:r>
-                        <m:t>1</m:t>
-                      </m:r>
-                      <m:r>
-                        <m:rPr>
-                          <m:sty m:val="p"/>
-                        </m:rPr>
-                        <m:t>/</m:t>
-                      </m:r>
-                      <m:r>
-                        <m:t>2</m:t>
-                      </m:r>
-                    </m:sup>
-                  </m:sSup>
-                </m:e>
-              </m:d>
-              <m:sSubSup>
-                <m:e>
-                  <m:r>
-                    <m:t>​</m:t>
-                  </m:r>
-                </m:e>
-                <m:sub>
-                  <m:r>
-                    <m:t>0</m:t>
-                  </m:r>
-                </m:sub>
-                <m:sup>
-                  <m:r>
-                    <m:t>1</m:t>
-                  </m:r>
-                </m:sup>
-              </m:sSubSup>
-            </m:e>
-            <m:e>
-              <m:r>
-                <m:t>&amp;</m:t>
-              </m:r>
-              <m:r>
-                <m:rPr>
-                  <m:sty m:val="p"/>
-                </m:rPr>
-                <m:t>=</m:t>
-              </m:r>
-              <m:r>
-                <m:t>2</m:t>
-              </m:r>
-            </m:e>
-            <m:e>
-              <m:r>
-                <m:t>&amp;</m:t>
-              </m:r>
-              <m:r>
-                <m:rPr>
-                  <m:sty m:val="p"/>
-                </m:rPr>
-                <m:t>&lt;</m:t>
-              </m:r>
-              <m:r>
-                <m:rPr>
-                  <m:sty m:val="p"/>
-                </m:rPr>
-                <m:t>∞</m:t>
-              </m:r>
-              <m:r>
-                <m:rPr>
-                  <m:sty m:val="p"/>
-                </m:rPr>
-                <m:t>,</m:t>
-              </m:r>
-            </m:e>
-          </m:eqArr>
-        </m:oMath>
-      </m:oMathPara>
-    </w:p>
-    <w:p>
-      <w:pPr>
-        <w:pStyle w:val="Compact"/>
-        <w:numPr>
-          <w:ilvl w:val="0"/>
-          <w:numId w:val="1000"/>
-        </w:numPr>
-      </w:pPr>
-      <w:r>
-        <w:t xml:space="preserve">so</w:t>
-      </w:r>
-      <w:r>
-        <w:t xml:space="preserve"> </w:t>
-      </w:r>
-      <m:oMath>
-        <m:r>
-          <m:t>f</m:t>
-        </m:r>
-        <m:r>
-          <m:rPr>
-            <m:sty m:val="p"/>
-          </m:rPr>
-          <m:t>∈</m:t>
-        </m:r>
-        <m:sSup>
-          <m:e>
-            <m:r>
-              <m:t>L</m:t>
-            </m:r>
-          </m:e>
-          <m:sup>
-            <m:r>
-              <m:t>1</m:t>
-            </m:r>
-          </m:sup>
-        </m:sSup>
-        <m:r>
-          <m:rPr>
-            <m:sty m:val="p"/>
-          </m:rPr>
-          <m:t>(</m:t>
-        </m:r>
-        <m:r>
-          <m:rPr>
-            <m:sty m:val="p"/>
-          </m:rPr>
-          <m:t>(</m:t>
-        </m:r>
-        <m:r>
-          <m:t>0</m:t>
-        </m:r>
-        <m:r>
-          <m:rPr>
-            <m:sty m:val="p"/>
-          </m:rPr>
-          <m:t>,</m:t>
-        </m:r>
-        <m:r>
-          <m:t>1</m:t>
-        </m:r>
-        <m:r>
-          <m:rPr>
-            <m:sty m:val="p"/>
-          </m:rPr>
-          <m:t>)</m:t>
-        </m:r>
-        <m:r>
-          <m:rPr>
-            <m:sty m:val="p"/>
-          </m:rPr>
-          <m:t>,</m:t>
-        </m:r>
-        <m:r>
-          <m:t>μ</m:t>
-        </m:r>
-        <m:r>
-          <m:rPr>
-            <m:sty m:val="p"/>
-          </m:rPr>
-          <m:t>)</m:t>
-        </m:r>
-      </m:oMath>
-      <w:r>
-        <w:t xml:space="preserve">.</w:t>
-      </w:r>
-    </w:p>
-    <w:p>
-      <w:pPr>
-        <w:pStyle w:val="Compact"/>
-        <w:numPr>
-          <w:ilvl w:val="0"/>
-          <w:numId w:val="1018"/>
-        </w:numPr>
-      </w:pPr>
-      <w:r>
-        <w:t xml:space="preserve">For</w:t>
-      </w:r>
-      <w:r>
-        <w:t xml:space="preserve"> </w:t>
-      </w:r>
-      <m:oMath>
-        <m:r>
-          <m:t>p</m:t>
-        </m:r>
-        <m:r>
-          <m:rPr>
-            <m:sty m:val="p"/>
-          </m:rPr>
-          <m:t>=</m:t>
-        </m:r>
-        <m:r>
-          <m:t>2</m:t>
-        </m:r>
-      </m:oMath>
-      <w:r>
-        <w:t xml:space="preserve">:</w:t>
-      </w:r>
-    </w:p>
-    <w:p>
-      <w:pPr>
-        <w:pStyle w:val="Compact"/>
-      </w:pPr>
-      <m:oMathPara>
-        <m:oMathParaPr>
-          <m:jc m:val="center"/>
-        </m:oMathParaPr>
-        <m:oMath>
-          <m:eqArr>
-            <m:e>
-              <m:r>
-                <m:t>​</m:t>
-              </m:r>
-              <m:d>
-                <m:dPr>
-                  <m:begChr m:val="|"/>
-                  <m:sepChr m:val=""/>
-                  <m:endChr m:val="|"/>
-                  <m:grow/>
-                </m:dPr>
-                <m:e>
-                  <m:r>
-                    <m:t>f</m:t>
-                  </m:r>
-                  <m:r>
-                    <m:rPr>
-                      <m:sty m:val="p"/>
-                    </m:rPr>
-                    <m:t>(</m:t>
-                  </m:r>
-                  <m:r>
-                    <m:t>x</m:t>
-                  </m:r>
-                  <m:r>
-                    <m:rPr>
-                      <m:sty m:val="p"/>
-                    </m:rPr>
-                    <m:t>)</m:t>
-                  </m:r>
-                </m:e>
-              </m:d>
-              <m:sSup>
-                <m:e>
-                  <m:r>
-                    <m:t>​</m:t>
-                  </m:r>
-                </m:e>
-                <m:sup>
-                  <m:r>
-                    <m:t>2</m:t>
-                  </m:r>
-                </m:sup>
-              </m:sSup>
-              <m:r>
-                <m:t>&amp;</m:t>
-              </m:r>
-              <m:r>
-                <m:rPr>
-                  <m:sty m:val="p"/>
-                </m:rPr>
-                <m:t>=</m:t>
-              </m:r>
-              <m:r>
-                <m:t>​</m:t>
-              </m:r>
-              <m:d>
-                <m:dPr>
-                  <m:begChr m:val="("/>
-                  <m:sepChr m:val=""/>
-                  <m:endChr m:val=")"/>
-                  <m:grow/>
-                </m:dPr>
-                <m:e>
-                  <m:sSup>
-                    <m:e>
-                      <m:r>
-                        <m:t>x</m:t>
-                      </m:r>
-                    </m:e>
-                    <m:sup>
-                      <m:r>
-                        <m:rPr>
-                          <m:sty m:val="p"/>
-                        </m:rPr>
-                        <m:t>−</m:t>
-                      </m:r>
-                      <m:r>
-                        <m:t>1</m:t>
-                      </m:r>
-                      <m:r>
-                        <m:rPr>
-                          <m:sty m:val="p"/>
-                        </m:rPr>
-                        <m:t>/</m:t>
-                      </m:r>
-                      <m:r>
-                        <m:t>2</m:t>
-                      </m:r>
-                    </m:sup>
-                  </m:sSup>
-                </m:e>
-              </m:d>
-              <m:sSup>
-                <m:e>
-                  <m:r>
-                    <m:t>​</m:t>
-                  </m:r>
-                </m:e>
-                <m:sup>
-                  <m:r>
-                    <m:t>2</m:t>
-                  </m:r>
-                </m:sup>
-              </m:sSup>
-            </m:e>
-            <m:e>
-              <m:r>
-                <m:t>&amp;</m:t>
-              </m:r>
-              <m:r>
-                <m:rPr>
-                  <m:sty m:val="p"/>
-                </m:rPr>
-                <m:t>=</m:t>
-              </m:r>
-              <m:f>
-                <m:fPr>
-                  <m:type m:val="bar"/>
-                </m:fPr>
-                <m:num>
-                  <m:r>
-                    <m:t>1</m:t>
-                  </m:r>
-                </m:num>
-                <m:den>
-                  <m:r>
-                    <m:t>x</m:t>
-                  </m:r>
-                </m:den>
-              </m:f>
-              <m:r>
-                <m:rPr>
-                  <m:sty m:val="p"/>
-                </m:rPr>
-                <m:t>.</m:t>
-              </m:r>
-            </m:e>
-          </m:eqArr>
-        </m:oMath>
-      </m:oMathPara>
-    </w:p>
-    <w:p>
-      <w:pPr>
-        <w:pStyle w:val="Compact"/>
-        <w:numPr>
-          <w:ilvl w:val="0"/>
-          <w:numId w:val="1000"/>
-        </w:numPr>
-      </w:pPr>
-      <w:r>
-        <w:t xml:space="preserve">The integral is:</w:t>
-      </w:r>
-    </w:p>
-    <w:p>
-      <w:pPr>
-        <w:pStyle w:val="Compact"/>
-      </w:pPr>
-      <m:oMathPara>
-        <m:oMathParaPr>
-          <m:jc m:val="center"/>
-        </m:oMathParaPr>
-        <m:oMath>
-          <m:eqArr>
-            <m:e>
-              <m:nary>
-                <m:naryPr>
-                  <m:chr m:val="∫"/>
-                  <m:limLoc m:val="subSup"/>
-                  <m:subHide m:val="off"/>
-                  <m:supHide m:val="off"/>
-                </m:naryPr>
-                <m:sub>
-                  <m:r>
-                    <m:t>0</m:t>
-                  </m:r>
-                </m:sub>
-                <m:sup>
-                  <m:r>
-                    <m:t>1</m:t>
-                  </m:r>
-                </m:sup>
-                <m:e>
-                  <m:f>
-                    <m:fPr>
-                      <m:type m:val="bar"/>
-                    </m:fPr>
-                    <m:num>
-                      <m:r>
-                        <m:t>1</m:t>
-                      </m:r>
-                    </m:num>
-                    <m:den>
-                      <m:r>
-                        <m:t>x</m:t>
-                      </m:r>
-                    </m:den>
-                  </m:f>
-                </m:e>
-              </m:nary>
-              <m:r>
-                <m:t> </m:t>
-              </m:r>
-              <m:r>
-                <m:t>d</m:t>
-              </m:r>
-              <m:r>
-                <m:t>x</m:t>
-              </m:r>
-              <m:r>
-                <m:t>&amp;</m:t>
-              </m:r>
-              <m:r>
-                <m:rPr>
-                  <m:sty m:val="p"/>
-                </m:rPr>
-                <m:t>=</m:t>
-              </m:r>
-              <m:limLow>
-                <m:e>
-                  <m:r>
-                    <m:rPr>
-                      <m:sty m:val="p"/>
-                    </m:rPr>
-                    <m:t>lim</m:t>
-                  </m:r>
-                </m:e>
-                <m:lim>
-                  <m:r>
-                    <m:t>ε</m:t>
-                  </m:r>
-                  <m:r>
-                    <m:rPr>
-                      <m:sty m:val="p"/>
-                    </m:rPr>
-                    <m:t>→</m:t>
-                  </m:r>
-                  <m:sSup>
-                    <m:e>
-                      <m:r>
-                        <m:t>0</m:t>
-                      </m:r>
-                    </m:e>
-                    <m:sup>
-                      <m:r>
-                        <m:rPr>
-                          <m:sty m:val="p"/>
-                        </m:rPr>
-                        <m:t>+</m:t>
-                      </m:r>
-                    </m:sup>
-                  </m:sSup>
-                </m:lim>
-              </m:limLow>
-              <m:r>
-                <m:t>​</m:t>
-              </m:r>
-              <m:d>
-                <m:dPr>
-                  <m:begChr m:val="["/>
-                  <m:sepChr m:val=""/>
-                  <m:endChr m:val="]"/>
-                  <m:grow/>
-                </m:dPr>
-                <m:e>
-                  <m:r>
-                    <m:rPr>
-                      <m:sty m:val="p"/>
-                    </m:rPr>
-                    <m:t>ln</m:t>
-                  </m:r>
-                  <m:r>
-                    <m:t>x</m:t>
-                  </m:r>
-                </m:e>
-              </m:d>
-              <m:sSubSup>
-                <m:e>
-                  <m:r>
-                    <m:t>​</m:t>
-                  </m:r>
-                </m:e>
-                <m:sub>
-                  <m:r>
-                    <m:t>ε</m:t>
-                  </m:r>
-                </m:sub>
-                <m:sup>
-                  <m:r>
-                    <m:t>1</m:t>
-                  </m:r>
-                </m:sup>
-              </m:sSubSup>
-            </m:e>
-            <m:e>
-              <m:r>
-                <m:t>&amp;</m:t>
-              </m:r>
-              <m:r>
-                <m:rPr>
-                  <m:sty m:val="p"/>
-                </m:rPr>
-                <m:t>=</m:t>
-              </m:r>
-              <m:limLow>
-                <m:e>
-                  <m:r>
-                    <m:rPr>
-                      <m:sty m:val="p"/>
-                    </m:rPr>
-                    <m:t>lim</m:t>
-                  </m:r>
-                </m:e>
-                <m:lim>
-                  <m:r>
-                    <m:t>ε</m:t>
-                  </m:r>
-                  <m:r>
-                    <m:rPr>
-                      <m:sty m:val="p"/>
-                    </m:rPr>
-                    <m:t>→</m:t>
-                  </m:r>
-                  <m:sSup>
-                    <m:e>
-                      <m:r>
-                        <m:t>0</m:t>
-                      </m:r>
-                    </m:e>
-                    <m:sup>
-                      <m:r>
-                        <m:rPr>
-                          <m:sty m:val="p"/>
-                        </m:rPr>
-                        <m:t>+</m:t>
-                      </m:r>
-                    </m:sup>
-                  </m:sSup>
-                </m:lim>
-              </m:limLow>
-              <m:r>
-                <m:rPr>
-                  <m:sty m:val="p"/>
-                </m:rPr>
-                <m:t>(</m:t>
-              </m:r>
-              <m:r>
-                <m:rPr>
-                  <m:sty m:val="p"/>
-                </m:rPr>
-                <m:t>−</m:t>
-              </m:r>
-              <m:r>
-                <m:rPr>
-                  <m:sty m:val="p"/>
-                </m:rPr>
-                <m:t>ln</m:t>
-              </m:r>
-              <m:r>
-                <m:t>ε</m:t>
-              </m:r>
-              <m:r>
-                <m:rPr>
-                  <m:sty m:val="p"/>
-                </m:rPr>
-                <m:t>)</m:t>
-              </m:r>
-            </m:e>
-            <m:e>
-              <m:r>
-                <m:t>&amp;</m:t>
-              </m:r>
-              <m:r>
-                <m:rPr>
-                  <m:sty m:val="p"/>
-                </m:rPr>
-                <m:t>=</m:t>
-              </m:r>
-              <m:r>
-                <m:rPr>
-                  <m:sty m:val="p"/>
-                </m:rPr>
-                <m:t>∞</m:t>
-              </m:r>
-              <m:r>
-                <m:rPr>
-                  <m:sty m:val="p"/>
-                </m:rPr>
-                <m:t>.</m:t>
-              </m:r>
-            </m:e>
-          </m:eqArr>
-        </m:oMath>
-      </m:oMathPara>
-    </w:p>
-    <w:p>
-      <w:pPr>
-        <w:pStyle w:val="Compact"/>
-        <w:numPr>
-          <w:ilvl w:val="0"/>
-          <w:numId w:val="1000"/>
-        </w:numPr>
-      </w:pPr>
-      <w:r>
-        <w:t xml:space="preserve">Therefore,</w:t>
-      </w:r>
-      <w:r>
-        <w:t xml:space="preserve"> </w:t>
-      </w:r>
-      <m:oMath>
-        <m:r>
-          <m:t>​</m:t>
-        </m:r>
-        <m:d>
-          <m:dPr>
-            <m:begChr m:val="∥"/>
-            <m:sepChr m:val=""/>
-            <m:endChr m:val="∥"/>
-            <m:grow/>
-          </m:dPr>
-          <m:e>
-            <m:r>
-              <m:t>f</m:t>
-            </m:r>
-          </m:e>
-        </m:d>
-        <m:sSub>
-          <m:e>
-            <m:r>
-              <m:t>​</m:t>
-            </m:r>
-          </m:e>
-          <m:sub>
-            <m:r>
-              <m:t>2</m:t>
-            </m:r>
-          </m:sub>
-        </m:sSub>
-        <m:r>
-          <m:rPr>
-            <m:sty m:val="p"/>
-          </m:rPr>
-          <m:t>=</m:t>
-        </m:r>
-        <m:r>
-          <m:rPr>
-            <m:sty m:val="p"/>
-          </m:rPr>
-          <m:t>∞</m:t>
-        </m:r>
-      </m:oMath>
-      <w:r>
-        <w:t xml:space="preserve">, so</w:t>
-      </w:r>
-      <w:r>
-        <w:t xml:space="preserve"> </w:t>
-      </w:r>
-      <m:oMath>
-        <m:r>
-          <m:t>f</m:t>
-        </m:r>
-        <m:r>
-          <m:rPr>
-            <m:sty m:val="p"/>
-          </m:rPr>
-          <m:t>∉</m:t>
-        </m:r>
-        <m:sSup>
-          <m:e>
-            <m:r>
-              <m:t>L</m:t>
-            </m:r>
-          </m:e>
-          <m:sup>
-            <m:r>
-              <m:t>2</m:t>
-            </m:r>
-          </m:sup>
-        </m:sSup>
-        <m:r>
-          <m:rPr>
-            <m:sty m:val="p"/>
-          </m:rPr>
-          <m:t>(</m:t>
-        </m:r>
-        <m:r>
-          <m:rPr>
-            <m:sty m:val="p"/>
-          </m:rPr>
-          <m:t>(</m:t>
-        </m:r>
-        <m:r>
-          <m:t>0</m:t>
-        </m:r>
-        <m:r>
-          <m:rPr>
-            <m:sty m:val="p"/>
-          </m:rPr>
-          <m:t>,</m:t>
-        </m:r>
-        <m:r>
-          <m:t>1</m:t>
-        </m:r>
-        <m:r>
-          <m:rPr>
-            <m:sty m:val="p"/>
-          </m:rPr>
-          <m:t>)</m:t>
-        </m:r>
-        <m:r>
-          <m:rPr>
-            <m:sty m:val="p"/>
-          </m:rPr>
-          <m:t>,</m:t>
-        </m:r>
-        <m:r>
-          <m:t>μ</m:t>
-        </m:r>
-        <m:r>
-          <m:rPr>
-            <m:sty m:val="p"/>
-          </m:rPr>
-          <m:t>)</m:t>
-        </m:r>
-      </m:oMath>
-      <w:r>
-        <w:t xml:space="preserve">.</w:t>
-      </w:r>
-    </w:p>
-    <w:p>
-      <w:pPr>
-        <w:pStyle w:val="FirstParagraph"/>
-      </w:pPr>
-      <w:r>
-        <w:t xml:space="preserve">This shows that</w:t>
-      </w:r>
-      <w:r>
-        <w:t xml:space="preserve"> </w:t>
-      </w:r>
-      <m:oMath>
-        <m:sSup>
-          <m:e>
-            <m:r>
-              <m:t>L</m:t>
-            </m:r>
-          </m:e>
-          <m:sup>
-            <m:r>
-              <m:t>2</m:t>
-            </m:r>
-          </m:sup>
-        </m:sSup>
-        <m:r>
-          <m:rPr>
-            <m:sty m:val="p"/>
-          </m:rPr>
-          <m:t>⊂</m:t>
-        </m:r>
-        <m:sSup>
-          <m:e>
-            <m:r>
-              <m:t>L</m:t>
-            </m:r>
-          </m:e>
-          <m:sup>
-            <m:r>
-              <m:t>1</m:t>
-            </m:r>
-          </m:sup>
-        </m:sSup>
-      </m:oMath>
-      <w:r>
-        <w:t xml:space="preserve"> </w:t>
-      </w:r>
-      <w:r>
-        <w:t xml:space="preserve">on finite-measure sets: higher exponents impose stricter integrability requirements near singularities.</w:t>
-      </w:r>
-    </w:p>
-    <w:bookmarkEnd w:id="124"/>
-    <w:bookmarkStart w:id="125" w:name="thm-holder-inequality"/>
+    <w:bookmarkEnd w:id="128"/>
+    <w:bookmarkStart w:id="129" w:name="thm-holder-inequality"/>
     <w:p>
       <w:pPr>
         <w:pStyle w:val="BodyText"/>
@@ -36897,7 +37472,7 @@
           <w:rPr>
             <w:rStyle w:val="Hyperlink"/>
           </w:rPr>
-          <w:t xml:space="preserve">Definition 24</w:t>
+          <w:t xml:space="preserve">Definition 27</w:t>
         </w:r>
       </w:hyperlink>
       <w:r>
@@ -37226,8 +37801,8 @@
         <w:t xml:space="preserve">this inequality is the Cauchy-Schwarz inequality for integrals.</w:t>
       </w:r>
     </w:p>
-    <w:bookmarkEnd w:id="125"/>
-    <w:bookmarkStart w:id="126" w:name="thm-minkowski-inequality"/>
+    <w:bookmarkEnd w:id="129"/>
+    <w:bookmarkStart w:id="130" w:name="thm-minkowski-inequality"/>
     <w:p>
       <w:pPr>
         <w:pStyle w:val="BodyText"/>
@@ -37437,7 +38012,7 @@
           <w:rPr>
             <w:rStyle w:val="Hyperlink"/>
           </w:rPr>
-          <w:t xml:space="preserve">Definition 24</w:t>
+          <w:t xml:space="preserve">Definition 27</w:t>
         </w:r>
       </w:hyperlink>
       <w:r>
@@ -37780,7 +38355,7 @@
       <w:r>
         <w:t xml:space="preserve"> </w:t>
       </w:r>
-      <w:hyperlink r:id="rId122">
+      <w:hyperlink r:id="rId125">
         <w:r>
           <w:rPr>
             <w:rStyle w:val="Hyperlink"/>
@@ -37792,8 +38367,8 @@
         <w:t xml:space="preserve">.</w:t>
       </w:r>
     </w:p>
-    <w:bookmarkEnd w:id="126"/>
-    <w:bookmarkStart w:id="128" w:name="exm-holder-inequality"/>
+    <w:bookmarkEnd w:id="130"/>
+    <w:bookmarkStart w:id="132" w:name="exm-holder-inequality"/>
     <w:p>
       <w:pPr>
         <w:pStyle w:val="BodyText"/>
@@ -38452,7 +39027,7 @@
       <w:r>
         <w:t xml:space="preserve"> </w:t>
       </w:r>
-      <w:hyperlink r:id="rId127">
+      <w:hyperlink r:id="rId131">
         <w:r>
           <w:rPr>
             <w:rStyle w:val="Hyperlink"/>
@@ -38509,7 +39084,7 @@
           <w:rPr>
             <w:rStyle w:val="Hyperlink"/>
           </w:rPr>
-          <w:t xml:space="preserve">Definition 19</w:t>
+          <w:t xml:space="preserve">Definition 20</w:t>
         </w:r>
       </w:hyperlink>
       <w:r>
@@ -38729,8 +39304,8 @@
         <w:t xml:space="preserve">guaranteeing that the covariance between any two square-integrable random variables is finite.</w:t>
       </w:r>
     </w:p>
-    <w:bookmarkEnd w:id="128"/>
-    <w:bookmarkStart w:id="131" w:name="rem-lp-spaces-machine-learning"/>
+    <w:bookmarkEnd w:id="132"/>
+    <w:bookmarkStart w:id="135" w:name="rem-lp-spaces-machine-learning"/>
     <w:p>
       <w:pPr>
         <w:pStyle w:val="FirstParagraph"/>
@@ -38881,7 +39456,7 @@
           <w:rPr>
             <w:rStyle w:val="Hyperlink"/>
           </w:rPr>
-          <w:t xml:space="preserve">Definition 19</w:t>
+          <w:t xml:space="preserve">Definition 20</w:t>
         </w:r>
       </w:hyperlink>
       <w:r>
@@ -39133,7 +39708,7 @@
       <w:r>
         <w:t xml:space="preserve"> </w:t>
       </w:r>
-      <w:hyperlink r:id="rId129">
+      <w:hyperlink r:id="rId133">
         <w:r>
           <w:rPr>
             <w:rStyle w:val="Hyperlink"/>
@@ -39510,7 +40085,7 @@
       <w:r>
         <w:t xml:space="preserve"> </w:t>
       </w:r>
-      <w:hyperlink r:id="rId130">
+      <w:hyperlink r:id="rId134">
         <w:r>
           <w:rPr>
             <w:rStyle w:val="Hyperlink"/>
@@ -40057,9 +40632,9 @@
         <w:t xml:space="preserve">minimizes the worst-case maximum error across all instances.</w:t>
       </w:r>
     </w:p>
-    <w:bookmarkEnd w:id="131"/>
-    <w:bookmarkEnd w:id="132"/>
-    <w:bookmarkStart w:id="138" w:name="product-measures"/>
+    <w:bookmarkEnd w:id="135"/>
+    <w:bookmarkEnd w:id="136"/>
+    <w:bookmarkStart w:id="142" w:name="product-measures"/>
     <w:p>
       <w:pPr>
         <w:pStyle w:val="Heading2"/>
@@ -40068,7 +40643,7 @@
         <w:t xml:space="preserve">9 Product measures</w:t>
       </w:r>
     </w:p>
-    <w:bookmarkStart w:id="134" w:name="def-product-sigma-algebra"/>
+    <w:bookmarkStart w:id="138" w:name="def-product-sigma-algebra"/>
     <w:p>
       <w:pPr>
         <w:pStyle w:val="FirstParagraph"/>
@@ -40078,7 +40653,7 @@
           <w:b/>
           <w:bCs/>
         </w:rPr>
-        <w:t xml:space="preserve">Definition 25 (Product</w:t>
+        <w:t xml:space="preserve">Definition 29 (Product</w:t>
       </w:r>
       <w:r>
         <w:rPr>
@@ -40222,7 +40797,7 @@
       <w:r>
         <w:t xml:space="preserve"> </w:t>
       </w:r>
-      <w:hyperlink r:id="rId133">
+      <w:hyperlink r:id="rId137">
         <w:r>
           <w:rPr>
             <w:rStyle w:val="Hyperlink"/>
@@ -40416,8 +40991,8 @@
         <w:t xml:space="preserve">the measurable rectangles.</w:t>
       </w:r>
     </w:p>
-    <w:bookmarkEnd w:id="134"/>
-    <w:bookmarkStart w:id="135" w:name="exm-product-sigma-algebra"/>
+    <w:bookmarkEnd w:id="138"/>
+    <w:bookmarkStart w:id="139" w:name="exm-product-sigma-algebra"/>
     <w:p>
       <w:pPr>
         <w:pStyle w:val="BodyText"/>
@@ -40916,8 +41491,8 @@
         <w:t xml:space="preserve">.</w:t>
       </w:r>
     </w:p>
-    <w:bookmarkEnd w:id="135"/>
-    <w:bookmarkStart w:id="136" w:name="def-product-measure"/>
+    <w:bookmarkEnd w:id="139"/>
+    <w:bookmarkStart w:id="140" w:name="def-product-measure"/>
     <w:p>
       <w:pPr>
         <w:pStyle w:val="FirstParagraph"/>
@@ -40927,7 +41502,7 @@
           <w:b/>
           <w:bCs/>
         </w:rPr>
-        <w:t xml:space="preserve">Definition 26 (Product measure)</w:t>
+        <w:t xml:space="preserve">Definition 30 (Product measure)</w:t>
       </w:r>
       <w:r>
         <w:t xml:space="preserve"> </w:t>
@@ -41527,8 +42102,8 @@
         <w:t xml:space="preserve">.</w:t>
       </w:r>
     </w:p>
-    <w:bookmarkEnd w:id="136"/>
-    <w:bookmarkStart w:id="137" w:name="exm-product-measure"/>
+    <w:bookmarkEnd w:id="140"/>
+    <w:bookmarkStart w:id="141" w:name="exm-product-measure"/>
     <w:p>
       <w:pPr>
         <w:pStyle w:val="BodyText"/>
@@ -42185,9 +42760,9 @@
         <w:t xml:space="preserve">the area of the rectangle.</w:t>
       </w:r>
     </w:p>
-    <w:bookmarkEnd w:id="137"/>
-    <w:bookmarkEnd w:id="138"/>
-    <w:bookmarkStart w:id="139" w:name="sec-further-reading"/>
+    <w:bookmarkEnd w:id="141"/>
+    <w:bookmarkEnd w:id="142"/>
+    <w:bookmarkStart w:id="143" w:name="sec-further-reading"/>
     <w:p>
       <w:pPr>
         <w:pStyle w:val="Heading2"/>
@@ -42290,8 +42865,8 @@
         <w:t xml:space="preserve">that opens with a chapter on introductory measure theory.</w:t>
       </w:r>
     </w:p>
-    <w:bookmarkEnd w:id="139"/>
-    <w:bookmarkStart w:id="148" w:name="references"/>
+    <w:bookmarkEnd w:id="143"/>
+    <w:bookmarkStart w:id="152" w:name="references"/>
     <w:p>
       <w:pPr>
         <w:pStyle w:val="Heading2"/>
@@ -42300,8 +42875,8 @@
         <w:t xml:space="preserve">References</w:t>
       </w:r>
     </w:p>
-    <w:bookmarkStart w:id="147" w:name="refs"/>
-    <w:bookmarkStart w:id="140" w:name="ref-billingsley1995probability"/>
+    <w:bookmarkStart w:id="151" w:name="refs"/>
+    <w:bookmarkStart w:id="144" w:name="ref-billingsley1995probability"/>
     <w:p>
       <w:pPr>
         <w:pStyle w:val="Bibliography"/>
@@ -42323,8 +42898,8 @@
         <w:t xml:space="preserve">. 3rd ed. Wiley Series in Probability and Mathematical Statistics. Wiley.</w:t>
       </w:r>
     </w:p>
-    <w:bookmarkEnd w:id="140"/>
-    <w:bookmarkStart w:id="142" w:name="ref-CaseBerg01"/>
+    <w:bookmarkEnd w:id="144"/>
+    <w:bookmarkStart w:id="146" w:name="ref-CaseBerg01"/>
     <w:p>
       <w:pPr>
         <w:pStyle w:val="Bibliography"/>
@@ -42348,7 +42923,7 @@
       <w:r>
         <w:t xml:space="preserve"> </w:t>
       </w:r>
-      <w:hyperlink r:id="rId141">
+      <w:hyperlink r:id="rId145">
         <w:r>
           <w:rPr>
             <w:rStyle w:val="Hyperlink"/>
@@ -42360,8 +42935,8 @@
         <w:t xml:space="preserve">.</w:t>
       </w:r>
     </w:p>
-    <w:bookmarkEnd w:id="142"/>
-    <w:bookmarkStart w:id="144" w:name="ref-folland1999real"/>
+    <w:bookmarkEnd w:id="146"/>
+    <w:bookmarkStart w:id="148" w:name="ref-folland1999real"/>
     <w:p>
       <w:pPr>
         <w:pStyle w:val="Bibliography"/>
@@ -42385,7 +42960,7 @@
       <w:r>
         <w:t xml:space="preserve"> </w:t>
       </w:r>
-      <w:hyperlink r:id="rId143">
+      <w:hyperlink r:id="rId147">
         <w:r>
           <w:rPr>
             <w:rStyle w:val="Hyperlink"/>
@@ -42397,8 +42972,8 @@
         <w:t xml:space="preserve">.</w:t>
       </w:r>
     </w:p>
-    <w:bookmarkEnd w:id="144"/>
-    <w:bookmarkStart w:id="146" w:name="ref-gut2013"/>
+    <w:bookmarkEnd w:id="148"/>
+    <w:bookmarkStart w:id="150" w:name="ref-gut2013"/>
     <w:p>
       <w:pPr>
         <w:pStyle w:val="Bibliography"/>
@@ -42422,7 +42997,7 @@
       <w:r>
         <w:t xml:space="preserve"> </w:t>
       </w:r>
-      <w:hyperlink r:id="rId145">
+      <w:hyperlink r:id="rId149">
         <w:r>
           <w:rPr>
             <w:rStyle w:val="Hyperlink"/>
@@ -42434,9 +43009,9 @@
         <w:t xml:space="preserve">.</w:t>
       </w:r>
     </w:p>
-    <w:bookmarkEnd w:id="146"/>
-    <w:bookmarkEnd w:id="147"/>
-    <w:bookmarkEnd w:id="148"/>
+    <w:bookmarkEnd w:id="150"/>
+    <w:bookmarkEnd w:id="151"/>
+    <w:bookmarkEnd w:id="152"/>
     <w:sectPr>
       <w:footnotePr>
         <w:numRestart w:val="eachSect"/>

</xml_diff>

<commit_message>
Deploying to gh-pages from @ Morrison-Lab/mds@f43d3a4196b4d8477f149dfb3d8b81257adc9b75 🚀
</commit_message>
<xml_diff>
--- a/measures.docx
+++ b/measures.docx
@@ -15,7 +15,7 @@
         <w:pStyle w:val="Date"/>
       </w:pPr>
       <w:r>
-        <w:t xml:space="preserve">Last modified: 2026-10-15 15:19:18 (PDT)</w:t>
+        <w:t xml:space="preserve">Last modified: 2026-10-15 16:26:25 (PDT)</w:t>
       </w:r>
     </w:p>
     <w:p>
@@ -623,6 +623,34 @@
           <w:bCs/>
         </w:rPr>
         <w:t xml:space="preserve">-field</w:t>
+      </w:r>
+      <w:r>
+        <w:t xml:space="preserve"> </w:t>
+      </w:r>
+      <w:r>
+        <w:t xml:space="preserve">(Billingsley 1995)</w:t>
+      </w:r>
+      <w:r>
+        <w:t xml:space="preserve"> </w:t>
+      </w:r>
+      <w:r>
+        <w:t xml:space="preserve">or a</w:t>
+      </w:r>
+      <w:r>
+        <w:t xml:space="preserve"> </w:t>
+      </w:r>
+      <w:r>
+        <w:rPr>
+          <w:b/>
+          <w:bCs/>
+        </w:rPr>
+        <w:t xml:space="preserve">Borel field</w:t>
+      </w:r>
+      <w:r>
+        <w:t xml:space="preserve"> </w:t>
+      </w:r>
+      <w:r>
+        <w:t xml:space="preserve">(Casella and Berger 2002, Def. 1.2.1)</w:t>
       </w:r>
       <w:r>
         <w:t xml:space="preserve"> </w:t>
@@ -665,73 +693,37 @@
         <w:t xml:space="preserve"> </w:t>
       </w:r>
       <w:r>
-        <w:t xml:space="preserve">For example,</w:t>
-      </w:r>
-      <w:r>
-        <w:t xml:space="preserve"> </w:t>
-      </w:r>
-      <w:r>
-        <w:t xml:space="preserve">Billingsley (1995)</w:t>
-      </w:r>
-      <w:r>
-        <w:t xml:space="preserve"> </w:t>
-      </w:r>
-      <w:r>
-        <w:t xml:space="preserve">uses</w:t>
-      </w:r>
-      <w:r>
-        <w:t xml:space="preserve"> </w:t>
-      </w:r>
-      <w:r>
-        <w:t xml:space="preserve">“</w:t>
-      </w:r>
-      <m:oMath>
-        <m:r>
-          <m:t>σ</m:t>
-        </m:r>
-      </m:oMath>
-      <w:r>
-        <w:t xml:space="preserve">-field”</w:t>
-      </w:r>
-      <w:r>
-        <w:t xml:space="preserve">.</w:t>
-      </w:r>
-      <w:r>
-        <w:t xml:space="preserve"> </w:t>
-      </w:r>
-      <w:r>
-        <w:t xml:space="preserve">The two names mean the same thing.</w:t>
-      </w:r>
-      <w:r>
-        <w:t xml:space="preserve"> </w:t>
-      </w:r>
-      <w:r>
-        <w:t xml:space="preserve">Casella and Berger call it a</w:t>
-      </w:r>
-      <w:r>
-        <w:t xml:space="preserve"> </w:t>
-      </w:r>
-      <w:r>
-        <w:rPr>
-          <w:b/>
-          <w:bCs/>
-        </w:rPr>
-        <w:t xml:space="preserve">Borel field</w:t>
-      </w:r>
-      <w:r>
-        <w:t xml:space="preserve"> </w:t>
-      </w:r>
-      <w:r>
-        <w:t xml:space="preserve">(Casella and Berger 2002, Def. 1.2.1)</w:t>
-      </w:r>
-      <w:r>
-        <w:t xml:space="preserve">.</w:t>
-      </w:r>
-      <w:r>
-        <w:t xml:space="preserve"> </w:t>
-      </w:r>
-      <w:r>
-        <w:t xml:space="preserve">That is a different use of</w:t>
+        <w:t xml:space="preserve">The names mean the same thing.</w:t>
+      </w:r>
+      <w:r>
+        <w:t xml:space="preserve"> </w:t>
+      </w:r>
+      <w:r>
+        <w:t xml:space="preserve">The</w:t>
+      </w:r>
+      <w:r>
+        <w:t xml:space="preserve"> </w:t>
+      </w:r>
+      <w:r>
+        <w:t xml:space="preserve">“Borel”</w:t>
+      </w:r>
+      <w:r>
+        <w:t xml:space="preserve"> </w:t>
+      </w:r>
+      <w:r>
+        <w:t xml:space="preserve">in</w:t>
+      </w:r>
+      <w:r>
+        <w:t xml:space="preserve"> </w:t>
+      </w:r>
+      <w:r>
+        <w:t xml:space="preserve">“Borel field”</w:t>
+      </w:r>
+      <w:r>
+        <w:t xml:space="preserve"> </w:t>
+      </w:r>
+      <w:r>
+        <w:t xml:space="preserve">is a different use of</w:t>
       </w:r>
       <w:r>
         <w:t xml:space="preserve"> </w:t>

</xml_diff>

<commit_message>
Deploying to gh-pages from @ Morrison-Lab/mds@2051e4d479bf00b570d8ae1f6f763c631f26f574 🚀
</commit_message>
<xml_diff>
--- a/measures.docx
+++ b/measures.docx
@@ -15,7 +15,7 @@
         <w:pStyle w:val="Date"/>
       </w:pPr>
       <w:r>
-        <w:t xml:space="preserve">Last modified: 2026-10-16 05:24:53 (PDT)</w:t>
+        <w:t xml:space="preserve">Last modified: 2026-10-16 06:27:40 (PDT)</w:t>
       </w:r>
     </w:p>
     <w:p>
@@ -40968,7 +40968,7 @@
         <w:t xml:space="preserve"> </w:t>
       </w:r>
       <w:r>
-        <w:t xml:space="preserve">minimizing the expected mean squared error</w:t>
+        <w:t xml:space="preserve">minimizing the population mean squared error (pMSE)</w:t>
       </w:r>
       <w:r>
         <w:t xml:space="preserve"> </w:t>
@@ -41131,7 +41131,7 @@
           <w:b/>
           <w:bCs/>
         </w:rPr>
-        <w:t xml:space="preserve">loss (mean squared error)</w:t>
+        <w:t xml:space="preserve">loss (population mean squared error (pMSE), or sample mean squared error (sMSE) on a sample)</w:t>
       </w:r>
       <w:r>
         <w:t xml:space="preserve">:</w:t>
@@ -41177,7 +41177,7 @@
           <w:b/>
           <w:bCs/>
         </w:rPr>
-        <w:t xml:space="preserve">loss (mean absolute error)</w:t>
+        <w:t xml:space="preserve">loss (population mean absolute error (pMAE), or sample mean absolute error (sMAE) on a sample)</w:t>
       </w:r>
       <w:r>
         <w:t xml:space="preserve">:</w:t>

</xml_diff>